<commit_message>
fix: apply four academic critique fixes to PhD proposal v7
1. Coding categories (Section 3.7): made criterion-specific with
   references to applicable descriptors; construct confusion coded only
   when rationale demonstrably misapplies the relevant descriptor
2. Model-change rule (Section 3.5): replaced "ensures" with narrower
   claim about observed model identity changes; added ≥2 valid scores
   requirement, not-estimable clause, within-pass change logging, and
   caveat about unchanged labels
3. Cohen's kappa coding unit (Section 3.7): specified per-claim
   present/absent decisions for each theme, agreement calculated before
   discussion
4. Remnants: removed "anchor-monitoring threshold" from pilot section;
   corrected workload table to ~30 anchors, ~810-990 total
5. Criterion-specific language added to Sections 1.6 and 2.2

Co-Authored-By: Claude Opus 4.6 <noreply@anthropic.com>
Claude-Session: https://claude.ai/code/session_01ErbEvZi6kZy9sgfMskNu17
</commit_message>
<xml_diff>
--- a/PhD_Proposal_Final_v7.docx
+++ b/PhD_Proposal_Final_v7.docx
@@ -1013,7 +1013,7 @@
           <w:sz w:val="24"/>
           <w:szCs w:val="24"/>
         </w:rPr>
-        <w:t xml:space="preserve">In a first-language examination, the language is the construct. The central risk is that an AI scorer confuses reading and writing constructs: using fluent, well-formed prose (a writing quality) to justify reading credit that the textual evidence does not support, or overlooking whether the student has selected and faithfully transformed the relevant content points (the reading construct), or penalising language features observable in multilingual learners’ writing on grounds not supported by the applicable rubric descriptor. The content analysis examines whether AI scoring rationales show either tendency.</w:t>
+        <w:t xml:space="preserve">In a first-language examination, the language is the construct. The central risk is that an AI scorer confuses reading and writing constructs: using fluent, well-formed prose to justify reading credit that the textual evidence does not support, or overlooking whether the student has selected and faithfully transformed the relevant content points (the reading construct), or penalising language features observable in multilingual learners’ writing on grounds not supported by the applicable rubric descriptor for the criterion on which the mark is awarded. Because the Cambridge writing descriptors explicitly assess clarity, fluency, organisation and vocabulary, rewarding those qualities under the writing mark is legitimate; construct confusion arises only when a quality is used to justify a mark under the wrong criterion—for example, crediting fluency under the reading mark without supporting content-point evidence. The content analysis examines whether AI scoring rationales show this tendency, judged against the applicable level descriptor for the criterion in question.</w:t>
       </w:r>
     </w:p>
     <w:p>
@@ -1170,7 +1170,7 @@
           <w:sz w:val="24"/>
           <w:szCs w:val="24"/>
         </w:rPr>
-        <w:t xml:space="preserve">The L2 writing literature shows that source use varies with proficiency. Pecorari (2003) argued that patchwriting in postgraduate writing was typically not intended to deceive and called for a pedagogical response. Hirvela and Du (2013) found that learners could complete paraphrasing exercises with little sense of why paraphrase mattered. Baxter and Neumann (2023) provide evidence on adolescent writers. These findings have a scoring parallel: an AI scorer trained on large corpora of fluent English may implicitly confuse reading and writing constructs, valuing fluent prose over the faithful content-point transformations that the IGCSE rubric rewards for the reading mark.</w:t>
+        <w:t xml:space="preserve">The L2 writing literature shows that source use varies with proficiency. Pecorari (2003) argued that patchwriting in postgraduate writing was typically not intended to deceive and called for a pedagogical response. Hirvela and Du (2013) found that learners could complete paraphrasing exercises with little sense of why paraphrase mattered. Baxter and Neumann (2023) provide evidence on adolescent writers. These findings have a scoring parallel: an AI scorer trained on large corpora of fluent English may implicitly confuse reading and writing constructs, valuing fluent prose over the faithful content-point transformations that the IGCSE rubric rewards for the reading mark. Whether a particular AI judgement constitutes construct confusion depends on the applicable rubric descriptor for the criterion on which the mark is awarded: penalising reliance on source wording under the writing descriptor, which explicitly assesses vocabulary and reliance on source wording, is criterion-appropriate; the same judgement applied to the reading mark without content-point evidence is not.</w:t>
       </w:r>
     </w:p>
     <w:p>
@@ -2735,7 +2735,7 @@
           <w:sz w:val="24"/>
           <w:szCs w:val="24"/>
         </w:rPr>
-        <w:t xml:space="preserve">If the flagship model available in the model picker changes between any two passes for either tool, the following preregistered decision rule applies. The affected tool’s data are analysed separately by model version as a primary analysis: pass-to-pass consistency (RQ1) is computed only within the passes that share the same model version, and agreement with human raters (RQ2) is reported separately for each model version. A combined-pass analysis pooling across model versions is reported as supplementary, with the model change entered as a covariate. This rule ensures that pass-to-pass consistency estimates are not confounded by model differences.</w:t>
+        <w:t xml:space="preserve">The model name and any reasoning-mode label displayed in the chat interface will be recorded at every submission. If the recorded model label changes between any two passes for either tool, the following preregistered decision rule applies. The affected tool’s data are analysed separately by model version as a primary analysis: pass-to-pass consistency (RQ1) is computed only for scripts that have at least two valid scores under the same recorded model label, and agreement with human raters (RQ2) is reported separately for each model version. If fewer than two passes share the same model label for a given tool, within-version repeatability for that tool is reported as not estimable from the available data. A combined-pass analysis pooling across model versions is reported as supplementary, with the model change entered as a covariate. If the recorded model label changes within a single pass, the change is logged at the submission level; affected submissions are flagged and their inclusion or exclusion is decided at preregistration. This rule addresses observed changes in the displayed model identity; an unchanged label does not guarantee that the underlying service is identical across sessions, and the study cannot separately estimate model and pass effects when a label change is confounded with the pass boundary.</w:t>
       </w:r>
     </w:p>
     <w:p>
@@ -2907,7 +2907,7 @@
                 <w:sz w:val="22"/>
                 <w:szCs w:val="22"/>
               </w:rPr>
-              <w:t xml:space="preserve">Anchors: 3 scripts × 2 tools × each scoring day</w:t>
+              <w:t xml:space="preserve">Anchors: 3 scripts × 2 tools × 5 scoring days</w:t>
             </w:r>
           </w:p>
         </w:tc>
@@ -2926,7 +2926,7 @@
                 <w:sz w:val="22"/>
                 <w:szCs w:val="22"/>
               </w:rPr>
-              <w:t xml:space="preserve">~36</w:t>
+              <w:t xml:space="preserve">~30</w:t>
             </w:r>
           </w:p>
         </w:tc>
@@ -2966,7 +2966,7 @@
                 <w:sz w:val="22"/>
                 <w:szCs w:val="22"/>
               </w:rPr>
-              <w:t xml:space="preserve">~816–996 (~41–50 h)</w:t>
+              <w:t xml:space="preserve">~810–990 (~40.5–49.5 h)</w:t>
             </w:r>
           </w:p>
         </w:tc>
@@ -3009,7 +3009,7 @@
           <w:sz w:val="24"/>
           <w:szCs w:val="24"/>
         </w:rPr>
-        <w:t xml:space="preserve">Before the main data collection, a live pilot will be conducted using a third original passage (not used in the main study) with 10–15 students from a colleague’s class (not the candidate’s own students). Each script will be scored by both tools under the rubric-embedded framing, in three passes, to test the full end-to-end workflow—writing, anonymisation, typing, human marking and AI scoring—under realistic conditions. The pilot also tests prompt wording, timing, parsing rules and message caps. The pilot supplies the three anchor scripts and informs the anchor-monitoring threshold. Ethics approval for the pilot will be sought as part of the main ethics application. The pilot scripts do not enter the main analysis.</w:t>
+        <w:t xml:space="preserve">Before the main data collection, a live pilot will be conducted using a third original passage (not used in the main study) with 10–15 students from a colleague’s class (not the candidate’s own students). Each script will be scored by both tools under the rubric-embedded framing, in three passes, to test the full end-to-end workflow—writing, anonymisation, typing, human marking and AI scoring—under realistic conditions. The pilot also tests prompt wording, timing, parsing rules and message caps. The pilot supplies the three anchor scripts. Ethics approval for the pilot will be sought as part of the main ethics application. The pilot scripts do not enter the main analysis.</w:t>
       </w:r>
     </w:p>
     <w:p>
@@ -3343,7 +3343,7 @@
           <w:sz w:val="24"/>
           <w:szCs w:val="24"/>
         </w:rPr>
-        <w:t xml:space="preserve">AI over-credits fluent prose that is unfaithful to the source; AI rewards length, vocabulary sophistication or stylistic features not in the rubric</w:t>
+        <w:t xml:space="preserve">AI rewards length, vocabulary sophistication or stylistic features not supported by the applicable descriptor for the criterion on which the mark is awarded. (Rewarding fluency under the writing descriptor, where clarity and fluency are assessed, is not itself construct-irrelevant.)</w:t>
       </w:r>
     </w:p>
     <w:p>
@@ -3368,7 +3368,7 @@
           <w:sz w:val="24"/>
           <w:szCs w:val="24"/>
         </w:rPr>
-        <w:t xml:space="preserve">AI penalises language features observable in multilingual learners’ writing that a human marker credits as effective transformation; AI fails to penalise near-copying that a human marker penalises</w:t>
+        <w:t xml:space="preserve">AI penalises language features observable in multilingual learners’ writing on grounds not supported by the applicable rubric descriptor for the criterion in question, when a human marker credits the same phrasing as effective transformation; AI fails to penalise near-copying under a descriptor that penalises reliance on source wording</w:t>
       </w:r>
     </w:p>
     <w:p>
@@ -3393,7 +3393,7 @@
           <w:sz w:val="24"/>
           <w:szCs w:val="24"/>
         </w:rPr>
-        <w:t xml:space="preserve">AI applies a level descriptor to the wrong criterion; AI conflates reading and writing marks (e.g., crediting fluency under the reading mark or penalising content selection under the writing mark); AI misidentifies the score band</w:t>
+        <w:t xml:space="preserve">AI applies a level descriptor to the wrong criterion—for example, using fluent prose to justify a reading mark without supporting content-point evidence, or penalising content selection under the writing mark. Construct confusion is coded only when the rationale demonstrably misapplies the relevant descriptor; a human–AI disagreement alone does not establish an AI error</w:t>
       </w:r>
     </w:p>
     <w:p>
@@ -3418,7 +3418,7 @@
           <w:sz w:val="24"/>
           <w:szCs w:val="24"/>
         </w:rPr>
-        <w:t xml:space="preserve">AI evaluates paraphrase quality differently from human raters; AI does not distinguish synonym substitution from structural reformulation</w:t>
+        <w:t xml:space="preserve">AI evaluates paraphrase quality differently from human raters; AI does not distinguish synonym substitution from structural reformulation. Penalising source copying is judged against the applicable descriptor, not automatically classified as unfair treatment of multilingual writing</w:t>
       </w:r>
     </w:p>
     <w:p>
@@ -3480,7 +3480,7 @@
           <w:sz w:val="24"/>
           <w:szCs w:val="24"/>
         </w:rPr>
-        <w:t xml:space="preserve">Coding will be conducted independently by both the candidate and the second human rater using the same coding scheme. Coding will be organised in Atlas.ti. Both coders will complete the full evidence-checking procedure for all 8 selected scripts (up to 16 rationale texts) before comparing their coding. Inter-coder agreement will be reported as percentage agreement and Cohen’s kappa on the thematic codes. Disagreements will be discussed and resolved where possible; unresolved cases will be documented and reported. The supervisor will review the final coding of three selected scripts as an additional credibility check. This dual-coding procedure strengthens the qualitative strand’s trustworthiness and addresses a limitation common in prior research on AI scoring rationales, where coding was conducted by a single researcher.</w:t>
+        <w:t xml:space="preserve">Coding will be conducted independently by both the candidate and the second human rater using the same coding scheme. Coding will be organised in Atlas.ti. Both coders will complete the full evidence-checking procedure for all 8 selected scripts (up to 16 rationale texts) before comparing their coding. The coding unit is the individual claim within a rationale text. For each claim, each thematic code is treated as a separate present/absent decision: a single claim may receive more than one code (e.g., both construct-irrelevant rewarding and rubric misapplication), and inter-coder agreement is calculated on each per-claim binary decision. Inter-coder agreement will be reported as percentage agreement and Cohen’s kappa, calculated before discussion, on these per-claim thematic-code decisions. Disagreements will be discussed and resolved where possible; unresolved cases will be documented and reported. The supervisor will review the final coding of three selected scripts as an additional credibility check. This dual-coding procedure strengthens the qualitative strand’s trustworthiness and addresses a limitation common in prior research on AI scoring rationales, where coding was conducted by a single researcher.</w:t>
       </w:r>
     </w:p>
     <w:p>

</xml_diff>

<commit_message>
fix: pre-segmented claim list and conditional model-change covariate
1. Coding procedure: candidate segments rationales into numbered claim
   list before independent coding; second coder receives same list so
   present/absent decisions refer to identical units
2. Model-change covariate: included only when not confounded with pass
   boundary; otherwise reported descriptively with limitation noted
   (fixed in both model-change rule and mixed-model paragraphs)

Co-Authored-By: Claude Opus 4.6 <noreply@anthropic.com>
Claude-Session: https://claude.ai/code/session_01ErbEvZi6kZy9sgfMskNu17
</commit_message>
<xml_diff>
--- a/PhD_Proposal_Final_v7.docx
+++ b/PhD_Proposal_Final_v7.docx
@@ -2735,7 +2735,7 @@
           <w:sz w:val="24"/>
           <w:szCs w:val="24"/>
         </w:rPr>
-        <w:t xml:space="preserve">The model name and any reasoning-mode label displayed in the chat interface will be recorded at every submission. If the recorded model label changes between any two passes for either tool, the following preregistered decision rule applies. The affected tool’s data are analysed separately by model version as a primary analysis: pass-to-pass consistency (RQ1) is computed only for scripts that have at least two valid scores under the same recorded model label, and agreement with human raters (RQ2) is reported separately for each model version. If fewer than two passes share the same model label for a given tool, within-version repeatability for that tool is reported as not estimable from the available data. A combined-pass analysis pooling across model versions is reported as supplementary, with the model change entered as a covariate. If the recorded model label changes within a single pass, the change is logged at the submission level; affected submissions are flagged and their inclusion or exclusion is decided at preregistration. This rule addresses observed changes in the displayed model identity; an unchanged label does not guarantee that the underlying service is identical across sessions, and the study cannot separately estimate model and pass effects when a label change is confounded with the pass boundary.</w:t>
+        <w:t xml:space="preserve">The model name and any reasoning-mode label displayed in the chat interface will be recorded at every submission. If the recorded model label changes between any two passes for either tool, the following preregistered decision rule applies. The affected tool’s data are analysed separately by model version as a primary analysis: pass-to-pass consistency (RQ1) is computed only for scripts that have at least two valid scores under the same recorded model label, and agreement with human raters (RQ2) is reported separately for each model version. If fewer than two passes share the same model label for a given tool, within-version repeatability for that tool is reported as not estimable from the available data. A combined-pass analysis pooling across model versions is reported as supplementary; if the model change is not confounded with the pass boundary, it enters as a covariate in the supplementary model; otherwise, the combined analysis is reported without the covariate and the confounding is noted as a limitation. If the recorded model label changes within a single pass, the change is logged at the submission level; affected submissions are flagged and their inclusion or exclusion is decided at preregistration. This rule addresses observed changes in the displayed model identity; an unchanged label does not guarantee that the underlying service is identical across sessions, and the study cannot separately estimate model and pass effects when a label change is confounded with the pass boundary.</w:t>
       </w:r>
     </w:p>
     <w:p>
@@ -3193,7 +3193,7 @@
           <w:sz w:val="24"/>
           <w:szCs w:val="24"/>
         </w:rPr>
-        <w:t xml:space="preserve">Using rubric-embedded scores, fitted separately for reading and writing: score ~ tool × passage + pass + (1|student) + (1|student:passage), where pass has three levels (1, 2, 3), using lme4 in R (Bates et al., 2015). Anchor scores are reported descriptively and any mid-scoring-window model change enters as a covariate. Convergence, singular fits and boundary estimates will be reported. If the model fails to converge, a preregistered fallback will be used: within-script SDs across the three passes will be computed per script and summarised across scripts within each tool/passage cell as a descriptive substitute. This fallback is acknowledged as partial: within-script SDs characterise per-script variability but do not replace the systematic fixed-effect estimates (tool, passage, pass) that the mixed model provides.</w:t>
+        <w:t xml:space="preserve">Using rubric-embedded scores, fitted separately for reading and writing: score ~ tool × passage + pass + (1|student) + (1|student:passage), where pass has three levels (1, 2, 3), using lme4 in R (Bates et al., 2015). Anchor scores are reported descriptively. If a mid-scoring-window model change occurs and is not confounded with the pass boundary (i.e., at least two passes share each model label for the affected tool), the change enters as a covariate; otherwise it is reported descriptively and the limitation is noted. Convergence, singular fits and boundary estimates will be reported. If the model fails to converge, a preregistered fallback will be used: within-script SDs across the three passes will be computed per script and summarised across scripts within each tool/passage cell as a descriptive substitute. This fallback is acknowledged as partial: within-script SDs characterise per-script variability but do not replace the systematic fixed-effect estimates (tool, passage, pass) that the mixed model provides.</w:t>
       </w:r>
     </w:p>
     <w:p>
@@ -3480,7 +3480,7 @@
           <w:sz w:val="24"/>
           <w:szCs w:val="24"/>
         </w:rPr>
-        <w:t xml:space="preserve">Coding will be conducted independently by both the candidate and the second human rater using the same coding scheme. Coding will be organised in Atlas.ti. Both coders will complete the full evidence-checking procedure for all 8 selected scripts (up to 16 rationale texts) before comparing their coding. The coding unit is the individual claim within a rationale text. For each claim, each thematic code is treated as a separate present/absent decision: a single claim may receive more than one code (e.g., both construct-irrelevant rewarding and rubric misapplication), and inter-coder agreement is calculated on each per-claim binary decision. Inter-coder agreement will be reported as percentage agreement and Cohen’s kappa, calculated before discussion, on these per-claim thematic-code decisions. Disagreements will be discussed and resolved where possible; unresolved cases will be documented and reported. The supervisor will review the final coding of three selected scripts as an additional credibility check. This dual-coding procedure strengthens the qualitative strand’s trustworthiness and addresses a limitation common in prior research on AI scoring rationales, where coding was conducted by a single researcher.</w:t>
+        <w:t xml:space="preserve">Coding will be conducted independently by both the candidate and the second human rater using the same coding scheme. Coding will be organised in Atlas.ti. Both coders will complete the full evidence-checking procedure for all 8 selected scripts (up to 16 rationale texts) before comparing their coding. The coding unit is the individual claim within a rationale text. Before independent coding begins, the candidate will segment each rationale into its constituent claims and prepare a numbered claim list; the second coder will receive this same pre-segmented list, so that both coders' present/absent decisions refer to identical units. For each claim, each thematic code is treated as a separate present/absent decision: a single claim may receive more than one code (e.g., both construct-irrelevant rewarding and rubric misapplication), and inter-coder agreement is calculated on each per-claim binary decision. Inter-coder agreement will be reported as percentage agreement and Cohen’s kappa, calculated before discussion, on these per-claim thematic-code decisions. Disagreements will be discussed and resolved where possible; unresolved cases will be documented and reported. The supervisor will review the final coding of three selected scripts as an additional credibility check. This dual-coding procedure strengthens the qualitative strand’s trustworthiness and addresses a limitation common in prior research on AI scoring rationales, where coding was conducted by a single researcher.</w:t>
       </w:r>
     </w:p>
     <w:p>

</xml_diff>

<commit_message>
revise: align rubric mapping with Cambridge tables and tighten claims
- Appendix C and 3.3 rebuilt from specimen mark scheme Tables A/B
  (writing: three levels 4-5, 2-3, 1 plus 0) with syllabus AO codes;
  no organisational requirement added to reading
- Cite 2027 specimen mark scheme; APA-order Cambridge 2024a-c
- Wu et al.: source texts withheld from raters, no reading criterion
- Synthesis no longer ranks risk or judges workflow adequacy
- Evidence categories: supported / contradicted / insufficient
  explanation / ambiguous; brief rationales not coded as mis-scoring
- RQ3 selection edge cases (reference direction, zero gaps, closest
  available agreement, eligibility); Objective 3 and RQ3 wording
- Sentence-level fixes (1.1, 1.2, 1.6, 2.1, 2.2, 3.1, 3.2, 3.7)
- Page numbers, no stranded separators, references kept whole

Co-Authored-By: Claude Opus 5.5 <noreply@anthropic.com>
Claude-Session: https://claude.ai/code/session_01ErbEvZi6kZy9sgfMskNu17
</commit_message>
<xml_diff>
--- a/PhD_Proposal_Final_v7.docx
+++ b/PhD_Proposal_Final_v7.docx
@@ -143,20 +143,6 @@
     </w:p>
     <w:p>
       <w:pPr>
-        <w:spacing w:after="200" w:before="200" w:line="360"/>
-        <w:jc w:val="center"/>
-      </w:pPr>
-      <w:r>
-        <w:rPr>
-          <w:rFonts w:ascii="Times New Roman" w:cs="Times New Roman" w:eastAsia="Times New Roman" w:hAnsi="Times New Roman"/>
-          <w:sz w:val="24"/>
-          <w:szCs w:val="24"/>
-        </w:rPr>
-        <w:t xml:space="preserve">—</w:t>
-      </w:r>
-    </w:p>
-    <w:p>
-      <w:pPr>
         <w:pStyle w:val="Heading1"/>
         <w:pageBreakBefore/>
         <w:spacing w:after="120" w:before="0" w:line="360"/>
@@ -183,7 +169,7 @@
           <w:sz w:val="24"/>
           <w:szCs w:val="24"/>
         </w:rPr>
-        <w:t xml:space="preserve">Teachers increasingly paste student writing into consumer AI applications such as ChatGPT and Claude and ask for a mark. Under these conditions the user cannot control sampling or reliably detect changes to the underlying model, so it is not known whether the same script receives the same mark twice, where AI marks diverge from human judgement, or whether the justifications the tools give respect what the task is designed to measure.</w:t>
+        <w:t xml:space="preserve">Teachers increasingly paste student writing into consumer AI applications such as ChatGPT and Claude and ask for a mark. Under these conditions the user cannot control sampling or reliably detect changes to the underlying model, so for a task, population and mode of use like those studied here, it is not known how consistently the same script is marked, where AI marks diverge from human judgement, or whether the justifications the tools give respect what the task is designed to measure.</w:t>
       </w:r>
     </w:p>
     <w:p>
@@ -212,20 +198,6 @@
           <w:szCs w:val="24"/>
         </w:rPr>
         <w:t xml:space="preserve">Analyses combine pass-to-pass consistency, single-run agreement statistics (quadratic weighted kappa, intraclass correlations) and a mixed model of tool, passage and pass effects. The criterion-level difference between AI and human marks—organised under the label scoring correction gap—is examined further through a focused, dual-coded analysis of the AI rationales for 8 scripts selected to cover both passages, both criteria, both directions of disagreement and close-agreement cases. Each rationale claim is checked against the source passage, the student’s summary and the rubric, to examine whether the tools award plausible marks for reasons the rubric does not support—for example, crediting fluent prose with reading marks that the content does not justify. The study provides evidence to inform further evaluation of AI as a second marker for this task; it does not establish operational thresholds for teacher use.</w:t>
-      </w:r>
-    </w:p>
-    <w:p>
-      <w:pPr>
-        <w:spacing w:after="200" w:before="200" w:line="360"/>
-        <w:jc w:val="center"/>
-      </w:pPr>
-      <w:r>
-        <w:rPr>
-          <w:rFonts w:ascii="Times New Roman" w:cs="Times New Roman" w:eastAsia="Times New Roman" w:hAnsi="Times New Roman"/>
-          <w:sz w:val="24"/>
-          <w:szCs w:val="24"/>
-        </w:rPr>
-        <w:t xml:space="preserve">—</w:t>
       </w:r>
     </w:p>
     <w:p>
@@ -300,7 +272,7 @@
           <w:sz w:val="24"/>
           <w:szCs w:val="24"/>
         </w:rPr>
-        <w:t xml:space="preserve">The IGCSE selective summary is a suitable test case. In the 0500 syllabus for examination in 2027–2029, Paper 1 Question 2(a) is a selective summary written in the candidate’s own words, as continuous writing of no more than 120 words, carrying 10 reading marks and 5 writing marks (Cambridge International Education, 2024a). The task is a highly constrained, rubric-bound writing task in the qualification, it is taught in both Grade 9 and Grade 10, and its component skills transfer to English for Academic Purposes (EAP), IELTS, A-Level and IB contexts. Because it rewards both the selection of relevant content points and the quality of the writing, it cannot be marked without the source passage. This makes it a demanding but transparent test case for studying the consistency and human–AI agreement of AI scoring under consumer-use conditions. To examine whether AI scoring behaviour varies across passages within the same task type, the study uses two passages rather than one.</w:t>
+        <w:t xml:space="preserve">The IGCSE selective summary is a suitable test case. In the 0500 syllabus for examination in 2027–2029, Paper 1 Question 2(a) is a selective summary written in the candidate’s own words, as continuous writing of no more than 120 words, carrying 10 reading marks and 5 writing marks (Cambridge International Education, 2024c). The task is a highly constrained, rubric-bound writing task within the qualification. In the study school it is taught in both Grade 9 and Grade 10, and its component skills overlap with those required in English for Academic Purposes (EAP), IELTS, A-Level and IB contexts. Because it rewards both the selection of relevant content points and the quality of the writing, it cannot be marked without the source passage. This makes it a demanding but transparent test case for studying the consistency and human–AI agreement of AI scoring under consumer-use conditions. To examine whether AI scoring behaviour varies across passages within the same task type, the study uses two passages rather than one.</w:t>
       </w:r>
     </w:p>
     <w:p>
@@ -372,7 +344,7 @@
           <w:sz w:val="24"/>
           <w:szCs w:val="24"/>
         </w:rPr>
-        <w:t xml:space="preserve">Teachers who use ChatGPT or Claude through consumer subscriptions to mark student writing do so without evidence on three properties of the resulting scores, and without understanding of the nature of AI–human disagreement in this context. It is not known whether the same script receives the same mark when submitted repeatedly in independent sessions (pass-to-pass consistency); whether the tool’s scoring properties hold across different passages within the same task type (passage dependence); or what the AI tool’s scoring rationale reveals when its mark diverges substantially from human judgement, particularly for second-language learners whose writing may be penalised or credited on construct-irrelevant grounds.</w:t>
+        <w:t xml:space="preserve">Teachers who use ChatGPT or Claude through consumer subscriptions to mark student writing do so without evidence on three properties of the resulting scores, and without understanding of the nature of AI–human disagreement in this context. For this task, this population and this mode of use, it is not known how consistently the same script is marked when submitted repeatedly in independent sessions (pass-to-pass consistency); whether the tool’s scoring properties hold across different passages within the same task type (passage dependence); or what the AI tool’s scoring rationale reveals when its mark diverges substantially from human judgement, particularly for second-language learners whose writing may be penalised or credited on construct-irrelevant grounds.</w:t>
       </w:r>
     </w:p>
     <w:p>
@@ -461,7 +433,7 @@
           <w:sz w:val="24"/>
           <w:szCs w:val="24"/>
         </w:rPr>
-        <w:t xml:space="preserve">3. analyse the scoring rationales of high-divergence cases to examine what justifications the tools provide and how well those justifications accord with the available textual evidence, with attention to source fidelity, construct-irrelevant features, and the treatment of non-standard but meaningful phrasing in this multilingual sample.</w:t>
+        <w:t xml:space="preserve">3. analyse the scoring rationales of selected high-divergence and close-agreement cases to examine what justifications the tools provide and how well those justifications accord with the available textual evidence, with attention to source fidelity, construct-irrelevant features, and the treatment of non-standard but meaningful phrasing in this multilingual sample.</w:t>
       </w:r>
     </w:p>
     <w:p>
@@ -744,7 +716,7 @@
                 <w:sz w:val="22"/>
                 <w:szCs w:val="22"/>
               </w:rPr>
-              <w:t xml:space="preserve">What justifications do the AI tools provide for their marks in high-divergence cases, how well do those justifications accord with the available textual evidence, and what do they reveal about how the tools handle source fidelity, construct-irrelevant features and non-standard but meaningful phrasing in this multilingual sample?</w:t>
+              <w:t xml:space="preserve">What justifications do the AI tools provide for their marks in selected high-divergence and close-agreement cases, how well do those justifications accord with the available textual evidence, and what do they reveal about how the tools handle source fidelity, construct-irrelevant features and non-standard but meaningful phrasing in this multilingual sample?</w:t>
             </w:r>
           </w:p>
         </w:tc>
@@ -922,7 +894,7 @@
           <w:sz w:val="24"/>
           <w:szCs w:val="24"/>
         </w:rPr>
-        <w:t xml:space="preserve">Use of ChatGPT or Claude through a paid individual subscription to the provider’s chat application, without API access. The latest flagship model offered on the paid plan at the start of scoring is selected in the model picker, and the same named model is selected manually for every submission thereafter. The user cannot set sampling parameters, pin the version behind a model name or reliably see model changes; the model name and reasoning mode are therefore logged for every submission. The study treats this as the ecological condition under which teachers use these tools, not as a methodological choice.</w:t>
+        <w:t xml:space="preserve">Use of ChatGPT or Claude through a paid individual subscription to the provider’s chat application, without API access. The latest flagship model offered on the paid plan at the start of scoring is selected in the model picker, and the same named model is selected manually for every submission thereafter. The user cannot set sampling parameters, pin the version behind a model name or reliably see model changes; the model name and reasoning mode are therefore logged for every submission. This is a methodological choice motivated by the intended use context: it reproduces the conditions under which teachers typically use these tools.</w:t>
       </w:r>
     </w:p>
     <w:p>
@@ -994,7 +966,7 @@
           <w:sz w:val="24"/>
           <w:szCs w:val="24"/>
         </w:rPr>
-        <w:t xml:space="preserve">In a first-language examination, the language is the construct. The central risk is that an AI scorer confuses reading and writing constructs: using fluent, well-formed prose to justify reading credit that the textual evidence does not support, or overlooking whether the student has selected and faithfully transformed the relevant content points (the reading construct), or penalising language features observable in multilingual learners’ writing on grounds not supported by the applicable rubric descriptor for the criterion on which the mark is awarded. Because the Cambridge writing descriptors explicitly assess clarity, fluency, organisation and vocabulary, rewarding those qualities under the writing mark is legitimate; construct confusion arises only when a quality is used to justify a mark under the wrong criterion—for example, crediting fluency under the reading mark without supporting content-point evidence. The content analysis examines whether AI scoring rationales show this tendency, judged against the applicable level descriptor for the criterion in question.</w:t>
+        <w:t xml:space="preserve">In a first-language examination, the language is the construct. The central risk is that an AI scorer confuses reading and writing constructs: using fluent, well-formed prose to justify reading credit that the textual evidence does not support, or overlooking whether the student has selected and faithfully transformed the relevant content points (the reading construct), or penalising language features observable in multilingual learners’ writing on grounds not supported by the applicable rubric descriptor for the criterion on which the mark is awarded. Because the Cambridge writing descriptors explicitly assess clarity, fluency, organisation, concision and vocabulary, rewarding those qualities under the writing mark is legitimate; construct confusion arises only when a quality is used to justify a mark under the wrong criterion—for example, crediting fluency under the reading mark without supporting content-point evidence. The content analysis examines whether AI scoring rationales show this tendency, judged against the applicable level descriptor for the criterion in question.</w:t>
       </w:r>
     </w:p>
     <w:p>
@@ -1043,20 +1015,6 @@
           <w:szCs w:val="24"/>
         </w:rPr>
         <w:t xml:space="preserve">A teacher-facing workflow in which the teacher marks a script first, then submits it to an AI tool, and compares the two marks. The study provides descriptive evidence—consistency statistics, agreement benchmarks, correction-gap profiles and qualitative explanations—to inform further evaluation of this workflow for the IGCSE summary task. It does not test the workflow with teachers or specify when a teacher should trust an AI mark; that requires further research.</w:t>
-      </w:r>
-    </w:p>
-    <w:p>
-      <w:pPr>
-        <w:spacing w:after="200" w:before="200" w:line="360"/>
-        <w:jc w:val="center"/>
-      </w:pPr>
-      <w:r>
-        <w:rPr>
-          <w:rFonts w:ascii="Times New Roman" w:cs="Times New Roman" w:eastAsia="Times New Roman" w:hAnsi="Times New Roman"/>
-          <w:sz w:val="24"/>
-          <w:szCs w:val="24"/>
-        </w:rPr>
-        <w:t xml:space="preserve">—</w:t>
       </w:r>
     </w:p>
     <w:p>
@@ -1117,7 +1075,7 @@
           <w:sz w:val="24"/>
           <w:szCs w:val="24"/>
         </w:rPr>
-        <w:t xml:space="preserve">L2 summarising adds proficiency-related copying. Johns and Mayes (1990) found that lower- and higher-proficiency university ESL students differed significantly in replicating source sentences and in combining idea units across sentences. Shi (2004) found that students writing summaries borrowed more words from source texts than those writing opinion essays. Keck (2006) distinguished degrees of paraphrase, and Keck (2014) found that less-experienced L1 and L2 university writers relied more heavily on source-text excerpts than more-experienced peers. In assessment, Cumming (2013) identified two perils of integrated reading–writing tasks: they confound writing ability with source comprehension, and they make source language hard to distinguish from the writer’s own. The 2024 examiner report on the equivalent Cambridge question shows the same weaknesses: less effective summaries copied with minimal rewording, repeated ideas, added comment or exceeded the 120-word guidance (Cambridge International Education, 2024b). These tendencies may occur in the study corpus.</w:t>
+        <w:t xml:space="preserve">In L2 summarising, reliance on source wording varies with proficiency, writing experience and task demands. Johns and Mayes (1990) found that lower- and higher-proficiency university ESL students differed significantly in replicating source sentences and in combining idea units across sentences. Shi (2004) found that students writing summaries borrowed more words from source texts than those writing opinion essays. Keck (2006) distinguished degrees of paraphrase, and Keck (2014) found that less-experienced L1 and L2 university writers relied more heavily on source-text excerpts than more-experienced peers. In assessment, Cumming (2013) identified two perils of integrated reading–writing tasks: they confound writing ability with source comprehension, and they make source language hard to distinguish from the writer’s own. The 2024 examiner report on the equivalent Cambridge question shows the same weaknesses: less effective summaries copied with minimal rewording, repeated ideas, added comment or exceeded the 120-word guidance (Cambridge International Education, 2024a). These tendencies may occur in the study corpus.</w:t>
       </w:r>
     </w:p>
     <w:p>
@@ -1147,7 +1105,7 @@
           <w:sz w:val="24"/>
           <w:szCs w:val="24"/>
         </w:rPr>
-        <w:t xml:space="preserve">Messick’s (1989) distinction between construct underrepresentation and construct-irrelevant variance frames the central scoring tension for L2 writers in an L1 examination. Where language is not the construct, reducing linguistic difficulty removes irrelevant barrier. But in IGCSE 0500, reading a demanding source and transforming it into one’s own words is the construct. A student whose summary preserves meaning through communicatively effective phrasing—even where that phrasing shows features observable in multilingual writers’ prose—has demonstrated the assessed skill; a scorer that penalises such phrasing while crediting a more fluent but less faithful alternative misrepresents the construct.</w:t>
+        <w:t xml:space="preserve">Messick’s (1989) distinction between construct underrepresentation and construct-irrelevant variance frames the central scoring tension for L2 writers in an L1 examination. Where language is not the construct, reducing linguistic difficulty removes irrelevant barrier. But in IGCSE 0500, reading a demanding source and transforming it into one’s own words is the construct. A student whose summary preserves meaning through communicatively effective phrasing—even where that phrasing shows features observable in multilingual writers’ prose—has demonstrated the reading understanding the task assesses, although the quality of that phrasing may still warrant a lower writing mark; a scorer that withholds reading credit for such phrasing while crediting a more fluent but less faithful alternative misrepresents the reading construct.</w:t>
       </w:r>
     </w:p>
     <w:p>
@@ -1175,7 +1133,7 @@
           <w:sz w:val="24"/>
           <w:szCs w:val="24"/>
         </w:rPr>
-        <w:t xml:space="preserve">The L2 writing literature shows that source use varies with proficiency. Pecorari (2003) argued that patchwriting in postgraduate writing was typically not intended to deceive and called for a pedagogical response. Hirvela and Du (2013) found that learners could complete paraphrasing exercises with little sense of why paraphrase mattered. Baxter and Neumann (2023) provide evidence on adolescent writers. These findings have a scoring parallel: an AI scorer trained on large corpora of fluent English may implicitly confuse reading and writing constructs, valuing fluent prose over the faithful content-point transformations that the IGCSE rubric rewards for the reading mark. Whether a particular AI judgement constitutes construct confusion depends on the applicable rubric descriptor for the criterion on which the mark is awarded: penalising reliance on source wording under the writing descriptor, which explicitly assesses vocabulary and reliance on source wording, is criterion-appropriate; the same judgement applied to the reading mark without content-point evidence is not.</w:t>
+        <w:t xml:space="preserve">The L2 writing literature shows that source use varies with proficiency. Pecorari (2003) argued that patchwriting in postgraduate writing was typically not intended to deceive and called for a pedagogical response. Hirvela and Du (2013) found that learners could complete paraphrasing exercises with little sense of why paraphrase mattered. Baxter and Neumann (2023) provide evidence on adolescent writers. These findings have a scoring parallel: an AI scorer trained on large corpora of fluent English may implicitly confuse reading and writing constructs, valuing fluent prose over the faithful content-point transformations that the IGCSE rubric rewards for the reading mark. Whether a particular AI judgement constitutes construct confusion depends on the applicable rubric descriptor for the criterion on which the mark is awarded: penalising reliance on source wording under the writing descriptor, which explicitly addresses concise vocabulary use and reliance on the words of the text, is criterion-appropriate; the same judgement applied to the reading mark without content-point evidence is not.</w:t>
       </w:r>
     </w:p>
     <w:p>
@@ -1321,7 +1279,7 @@
           <w:sz w:val="24"/>
           <w:szCs w:val="24"/>
         </w:rPr>
-        <w:t xml:space="preserve">Automated scorers can weight features differently from human raters. Liu et al. (2026) found that most models’ scores were driven by lexical precision and fluency, while others emphasised syntactic complexity. Wu et al. (2026), comparing a GPT-based scorer with 20 human raters on 181 university L2 essays across content, organisation, grammar and vocabulary, found the GPT scorer more stable overall but stricter on content and compressed at the upper end of the scale. Such criterion-level differences can be concealed by aggregate agreement. Automated scorers can also reward construct-irrelevant features. Powers et al. (2002) examined circumstances in which e-rater might produce inaccurate evaluations if used as the sole scorer, and Baldwin et al. (2025) showed that strategies a human would recognise as incorrect could inflate LLM scores. LLMs used as judges also show position, verbosity and self-enhancement biases (Zheng et al., 2023). People working with automated aids can fail to detect errors (Parasuraman &amp; Manzey, 2010), and Menze et al. (2026) found more item-writing flaws in items produced through teacher–AI collaboration than in teacher-only items, interpreting this as automation bias.</w:t>
+        <w:t xml:space="preserve">Automated scorers can weight features differently from human raters. Liu et al. (2026) found that most models’ scores were driven by lexical precision and fluency, while others emphasised syntactic complexity. Wu et al. (2026), comparing a GPT-based scorer with 20 human raters on 181 university L2 texts—including summary and translation tasks, assessed without the source texts—across content, organisation, grammar and vocabulary, found the GPT scorer more stable overall but stricter on content and compressed at the upper end of the scale. Such criterion-level differences can be concealed by aggregate agreement. Automated scorers can also reward construct-irrelevant features. Powers et al. (2002) examined circumstances in which e-rater might produce inaccurate evaluations if used as the sole scorer, and Baldwin et al. (2025) showed that strategies a human would recognise as incorrect could inflate LLM scores. LLMs used as judges also show position, verbosity and self-enhancement biases (Zheng et al., 2023). People working with automated aids can fail to detect errors (Parasuraman &amp; Manzey, 2010), and Menze et al. (2026) found more item-writing flaws in items produced through teacher–AI collaboration than in teacher-only items, interpreting this as automation bias.</w:t>
       </w:r>
     </w:p>
     <w:p>
@@ -1477,7 +1435,7 @@
           <w:sz w:val="24"/>
           <w:szCs w:val="24"/>
         </w:rPr>
-        <w:t xml:space="preserve">Two recent studies narrow the gap further. Liu et al. examined reproducibility across repeated runs, alignment with expert raters and the linguistic features driving each model’s scores for university L2 essays. Wu et al. compared a GPT-based scorer with native and non-native human raters on four analytic criteria and found criterion-specific differences in severity. Together with Sawaki et al., these studies mean that repeated scoring and criterion-level comparison are not in themselves new; the present study’s distinctiveness lies in how they are combined and applied.</w:t>
+        <w:t xml:space="preserve">Two recent studies narrow the gap further. Liu et al. examined reproducibility across repeated runs, alignment with expert raters and the linguistic features driving each model’s scores for university L2 essays. Wu et al. compared a GPT-based scorer with native and non-native human raters on four analytic criteria, assessing texts as standalone writing without their sources, and found criterion-specific differences in severity. Together with Sawaki et al., these studies mean that repeated scoring and criterion-level comparison are not in themselves new; the present study’s distinctiveness lies in how they are combined and applied.</w:t>
       </w:r>
     </w:p>
     <w:p>
@@ -1967,7 +1925,7 @@
                 <w:sz w:val="22"/>
                 <w:szCs w:val="22"/>
               </w:rPr>
-              <w:t xml:space="preserve">University L2 essays (n = 181); GPT-based scorer vs 20 human raters</w:t>
+              <w:t xml:space="preserve">University L2 texts (n = 181), including summary and translation tasks; GPT-based scorer vs 20 human raters</w:t>
             </w:r>
           </w:p>
         </w:tc>
@@ -2005,7 +1963,7 @@
                 <w:sz w:val="22"/>
                 <w:szCs w:val="22"/>
               </w:rPr>
-              <w:t xml:space="preserve">Essay task with no source text; no reading criterion</w:t>
+              <w:t xml:space="preserve">Source texts withheld from raters; no separate reading criterion assessed</w:t>
             </w:r>
           </w:p>
         </w:tc>
@@ -2753,20 +2711,6 @@
     </w:p>
     <w:p>
       <w:pPr>
-        <w:spacing w:after="200" w:before="200" w:line="360"/>
-        <w:jc w:val="center"/>
-      </w:pPr>
-      <w:r>
-        <w:rPr>
-          <w:rFonts w:ascii="Times New Roman" w:cs="Times New Roman" w:eastAsia="Times New Roman" w:hAnsi="Times New Roman"/>
-          <w:sz w:val="24"/>
-          <w:szCs w:val="24"/>
-        </w:rPr>
-        <w:t xml:space="preserve">—</w:t>
-      </w:r>
-    </w:p>
-    <w:p>
-      <w:pPr>
         <w:pStyle w:val="Heading1"/>
         <w:pageBreakBefore/>
         <w:spacing w:after="120" w:before="0" w:line="360"/>
@@ -2809,7 +2753,7 @@
           <w:sz w:val="24"/>
           <w:szCs w:val="24"/>
         </w:rPr>
-        <w:t xml:space="preserve">The study uses a quantitative design with a focused qualitative component. Each student writes one script for each passage (A, B), so scripts are nested within students and passage is a within-student factor; each script answers one passage only. Every script is scored by both tools (ChatGPT, Claude) in three passes under the rubric-embedded framing, so tool and pass are crossed within each script. Three passes, rather than two, provide a within-script variance estimate based on three data points per script rather than a single difference, strengthening the precision of the pass-to-pass consistency analysis (RQ1). Human ratings are the reference for comparison, but neither human rater is treated as ground truth. The analysis plan will be preregistered, for example on the Open Science Framework (OSF), before study data are collected, so that confirmatory and exploratory analyses are distinguished (Nosek et al., 2018).</w:t>
+        <w:t xml:space="preserve">The study uses a quantitative design with a focused qualitative component. Each student writes one script for each passage (A, B), so scripts are nested within students and passage is a within-student factor; each script answers one passage only. Every script is scored by both tools (ChatGPT, Claude) in three passes under the rubric-embedded framing, so tool and pass are crossed within each script. Three passes, rather than two, provide a within-script variance estimate based on three data points per script rather than a single difference, strengthening the precision of the pass-to-pass consistency analysis (RQ1). Human ratings are the reference for comparison, but neither human rater is treated as ground truth. The analysis plan will be preregistered, for example on the Open Science Framework (OSF), before main-study data collection begins (pilot data inform the plan), so that confirmatory and exploratory analyses are distinguished (Nosek et al., 2018).</w:t>
       </w:r>
     </w:p>
     <w:p>
@@ -2873,7 +2817,7 @@
           <w:sz w:val="24"/>
           <w:szCs w:val="24"/>
         </w:rPr>
-        <w:t xml:space="preserve">Each student will write two handwritten summaries—one per passage—in separate class sessions on different days. Within each class, students will be randomly assigned to write Passage A first and Passage B second, or Passage B first and Passage A second (counterbalanced order). Scripts will be collected immediately after writing. An external anonymiser will replace names with codes and type each script verbatim, so that the candidate never sees the handwriting. The anonymiser will also remove any identifying references students may include in their writing (e.g., personal names, school name, teacher references, identifiable personal anecdotes), replacing them with neutral placeholder text (e.g., [name removed]), so that neither the candidate nor the second rater can identify individual students from writing content. This supplements the code-based anonymisation and strengthens blinding given the candidate’s dual role as teacher and Rater 1. Transcription follows these rules: crossed-out text is retained and marked [crossed out]; illegible text is marked [illegible]; spelling and punctuation are reproduced exactly as written. For marking purposes: text marked [crossed out] is excluded from the word count and is not credited. Text marked [illegible] is likewise excluded from the word count; human raters note [illegible] passages when they affect creditability of content. These rules will be stated in the human rating guide and in the AI prompt framing. A week later, the anonymiser will re-check all typed scripts against the originals before the corpus is frozen; the candidate never performs this check. All human marking will be done on the typed copies. The typed scripts then form a frozen corpus.</w:t>
+        <w:t xml:space="preserve">Each student will write two handwritten summaries—one per passage—in separate class sessions on different days. Within each class, students will be randomly assigned to write Passage A first and Passage B second, or Passage B first and Passage A second (counterbalanced order). Scripts will be collected immediately after writing. An external anonymiser will replace names with codes and type each script verbatim, so that the candidate never sees the handwriting. The anonymiser will also remove any identifying references students may include in their writing (e.g., personal names, school name, teacher references, identifiable personal anecdotes), replacing them with neutral placeholder text (e.g., [name removed]), reducing the likelihood that the candidate or the second rater can identify individual students from writing content. This supplements the code-based anonymisation and strengthens blinding given the candidate’s dual role as teacher and Rater 1. Transcription follows these rules: crossed-out text is retained and marked [crossed out]; illegible text is marked [illegible]; spelling and punctuation are reproduced exactly as written. For marking purposes: text marked [crossed out] is excluded from the word count and is not credited. Text marked [illegible] is likewise excluded from the word count; human raters note [illegible] passages when they affect creditability of content. These rules will be stated in the human rating guide and in the AI prompt framing. A week later, the anonymiser will re-check all typed scripts against the originals before the corpus is frozen; the candidate never performs this check. All human marking will be done on the typed copies. The typed scripts then form a frozen corpus.</w:t>
       </w:r>
     </w:p>
     <w:p>
@@ -2961,7 +2905,7 @@
           <w:sz w:val="24"/>
           <w:szCs w:val="24"/>
         </w:rPr>
-        <w:t xml:space="preserve">The task for each passage will follow the Question 2(a) format: a stated focus, continuous writing in the candidate’s own words and no more than 120 words (Cambridge International Education, 2024a), confirmed against the 2027–2029 specimen materials.</w:t>
+        <w:t xml:space="preserve">The task for each passage will follow the Question 2(a) format: a stated focus, continuous writing in the candidate’s own words and no more than 120 words (Cambridge International Education, 2024c), confirmed against the 2027–2029 specimen materials.</w:t>
       </w:r>
     </w:p>
     <w:p>
@@ -2985,7 +2929,7 @@
           <w:sz w:val="24"/>
           <w:szCs w:val="24"/>
         </w:rPr>
-        <w:t xml:space="preserve">The candidate will write a study rubric that mirrors Question 2(a) and contains no verbatim Cambridge text. The rubric has two separate components:</w:t>
+        <w:t xml:space="preserve">The candidate will write a study rubric that mirrors Question 2(a) and contains no verbatim Cambridge text. It is modelled on the Question 2(a) marking tables in the 2027 specimen mark scheme (Cambridge International Education, 2024b). The rubric has two separate components:</w:t>
       </w:r>
     </w:p>
     <w:p>
@@ -3009,7 +2953,7 @@
           <w:sz w:val="24"/>
           <w:szCs w:val="24"/>
         </w:rPr>
-        <w:t xml:space="preserve">Reading is marked holistically through five level-descriptor bands, parallel to Cambridge’s Table A reading bands for Q2(a). The bands assess the degree to which the candidate demonstrates understanding, selects relevant ideas rather than transcribing indiscriminately, focuses on the specified aspect of the passage, and shows evidence of an overview. Each band covers two marks (for example, Level 5: 9–10; Level 4: 7–8). This holistic reading mark is the score analysed in all RQs.</w:t>
+        <w:t xml:space="preserve">Reading is marked holistically through five level-descriptor bands, parallel to Cambridge’s Table A reading bands for Q2(a). The bands assess the range of relevant ideas the candidate demonstrates understanding of, focus on the text and task, and selection—from indiscriminate selection or excess material at lower levels to skilful selection that demonstrates an overview at the top. Each band covers two marks (Level 5: 9–10 down to Level 1: 1–2), with 0 for no creditable content. This holistic reading mark is the score analysed in all RQs.</w:t>
       </w:r>
     </w:p>
     <w:p>
@@ -3057,7 +3001,7 @@
           <w:sz w:val="24"/>
           <w:szCs w:val="24"/>
         </w:rPr>
-        <w:t xml:space="preserve">The writing mark is awarded through level-descriptor bands, as in the Q2(a) mark scheme. The same writing rubric applies to both passages.</w:t>
+        <w:t xml:space="preserve">The writing mark is awarded through three level-descriptor bands parallel to Cambridge’s Table B (Level 3: 4–5; Level 2: 2–3; Level 1: 1), with 0 for no creditable content. The bands address clarity and fluency of expression, effectiveness of organisation, and concise use of a range of appropriate vocabulary, with reliance on the words of the text and lifted sections characterising the lower levels. The same writing rubric applies to both passages.</w:t>
       </w:r>
     </w:p>
     <w:p>
@@ -3786,7 +3730,7 @@
           <w:sz w:val="24"/>
           <w:szCs w:val="24"/>
         </w:rPr>
-        <w:t xml:space="preserve">The reading mark (/10) is the primary criterion for all analyses in RQ1 and RQ2. Its 11-point scale (0–10) offers more variance than the writing scale for estimation of agreement statistics. The writing mark (/5) is analysed as a secondary criterion: its 6-point scale (0–5) compresses variance and limits the precision of agreement statistics. All analyses are reported for both criteria, but interpretive weight is placed on the reading mark. The total mark (/15) is reported in supplementary tables only. Treating reading as primary is an analytical decision motivated by the structure of the assessment—the reading mark carries two-thirds of the available marks and has the longer scale—not a requirement of the marking scheme.</w:t>
+        <w:t xml:space="preserve">The reading mark (/10) is the primary criterion for all analyses in RQ1 and RQ2. Its 11-point scale (0–10) offers more possible score categories than the writing scale, which may—but need not—yield greater observed variance and more precise agreement estimates. The writing mark (/5) is analysed as a secondary criterion: its 6-point scale (0–5) is more likely to compress observed variance and limit the precision of agreement statistics. All analyses are reported for both criteria, but interpretive weight is placed on the reading mark. The total mark (/15) is reported in supplementary tables only. Treating reading as primary is an analytical decision motivated by the structure of the assessment—the reading mark carries two-thirds of the available marks and has the longer scale—not a requirement of the marking scheme.</w:t>
       </w:r>
     </w:p>
     <w:p>
@@ -3954,7 +3898,7 @@
           <w:sz w:val="24"/>
           <w:szCs w:val="24"/>
         </w:rPr>
-        <w:t xml:space="preserve">Eight scripts—four per passage—will be selected for content analysis using a prespecified rule designed to cover both passages, both criteria, both directions of disagreement and cases where marks agree. Discrepancies are computed from the Pass 1 rubric-embedded scores as the signed AI-minus-human-mean gap, expressed as a proportion of the scale (reading gap/10; writing gap/5), for each tool. Within each passage, scripts are selected in this order, each from the scripts not yet selected:</w:t>
+        <w:t xml:space="preserve">Eight scripts—four per passage—will be selected for content analysis using a prespecified rule designed to cover both passages, both criteria, both directions of disagreement and cases where marks agree. Discrepancies are computed from the Pass 1 rubric-embedded scores as the signed AI-minus-human-mean gap, expressed as a proportion of the scale (reading gap/10; writing gap/5), for each tool. A script is eligible only if both tools’ Pass 1 responses are valid and contain a usable rationale (at least one claim about the summary); ineligible scripts are skipped and the number skipped is reported. Within each passage, eligible scripts are selected in this order, each from the scripts not yet selected:</w:t>
       </w:r>
     </w:p>
     <w:p>
@@ -3999,7 +3943,7 @@
           <w:sz w:val="24"/>
           <w:szCs w:val="24"/>
         </w:rPr>
-        <w:t xml:space="preserve">3. Opposite direction: the script with the largest absolute proportional gap on either criterion whose sign is opposite to that of script 1 (AI under-scoring if script 1 shows over-scoring, and vice versa). If no such script exists, the next-largest gap on either criterion is selected and this is reported.</w:t>
+        <w:t xml:space="preserve">3. Opposite direction: the script with the largest absolute proportional gap on either criterion whose sign is opposite to the reference direction (AI under-scoring if the reference is over-scoring, and vice versa). The reference direction is the sign of the gap that led to script 1’s selection; if that gap is zero, or if two gaps of equal size and opposite sign tied for it, AI over-scoring is used as the reference. If no script has a gap in the opposite direction, the next-largest gap on either criterion is selected and this is reported.</w:t>
       </w:r>
     </w:p>
     <w:p>
@@ -4014,21 +3958,21 @@
           <w:sz w:val="24"/>
           <w:szCs w:val="24"/>
         </w:rPr>
-        <w:t xml:space="preserve">4. Close agreement: the script with the smallest maximum absolute proportional gap across both tools and both criteria. This case tests whether the AI’s justification is sound even when its mark matches the human benchmark—agreement can rest on reasoning the rubric does not support.</w:t>
-      </w:r>
-    </w:p>
-    <w:p>
-      <w:pPr>
-        <w:spacing w:after="120" w:line="360"/>
-        <w:jc w:val="both"/>
-      </w:pPr>
-      <w:r>
-        <w:rPr>
-          <w:rFonts w:ascii="Times New Roman" w:cs="Times New Roman" w:eastAsia="Times New Roman" w:hAnsi="Times New Roman"/>
-          <w:sz w:val="24"/>
-          <w:szCs w:val="24"/>
-        </w:rPr>
-        <w:t xml:space="preserve">Ties are broken alphabetically by script code, and the actual discrepancy values of all selected scripts will be reported. The selection is carried out mechanically on the score spreadsheet before any rationale is read. For each selected script, one rationale per tool is analysed—the Pass 1 rubric-embedded response—yielding 16 rationale texts (8 scripts × 2 tools). With eight scripts, the findings are illustrative evidence about construct representation in the selected cases; they do not estimate how often such problems occur across the corpus. The rationales will be coded thematically. The coding scheme is informed by three sources: (a) prior research on AI scoring biases (Baldwin et al., 2025; Powers et al., 2002; Zheng et al., 2023), (b) the summary-writing and source-use literature (Brown &amp; Day, 1983; Keck, 2006; Kintsch &amp; van Dijk, 1978), and (c) the reading–writing criterion-separation framework, focusing on whether the tools confuse reading and writing constructs (Messick, 1989). Anticipated codes include:</w:t>
+        <w:t xml:space="preserve">4. Closest available agreement: the script with the smallest maximum absolute proportional gap across both tools and both criteria. Its actual gaps are reported, since the closest available case is not necessarily close in absolute terms. This case tests whether the AI’s justification is sound even when its mark matches the human benchmark—agreement can rest on reasoning the rubric does not support.</w:t>
+      </w:r>
+    </w:p>
+    <w:p>
+      <w:pPr>
+        <w:spacing w:after="120" w:line="360"/>
+        <w:jc w:val="both"/>
+      </w:pPr>
+      <w:r>
+        <w:rPr>
+          <w:rFonts w:ascii="Times New Roman" w:cs="Times New Roman" w:eastAsia="Times New Roman" w:hAnsi="Times New Roman"/>
+          <w:sz w:val="24"/>
+          <w:szCs w:val="24"/>
+        </w:rPr>
+        <w:t xml:space="preserve">Ties are broken alphabetically by script code, and the actual discrepancy values of all selected scripts will be reported. The selection is carried out mechanically on the score spreadsheet before any rationale is read. For each selected script, one rationale per tool is analysed—the Pass 1 rubric-embedded response—yielding 16 rationale texts (8 scripts × 2 tools), provided enough eligible scripts exist. With eight scripts, the findings are illustrative evidence about construct representation in the selected cases; they do not estimate how often such problems occur across the corpus. The rationales will be coded thematically. The coding scheme is informed by three sources: (a) prior research on AI scoring biases (Baldwin et al., 2025; Powers et al., 2002; Zheng et al., 2023), (b) the summary-writing and source-use literature (Brown &amp; Day, 1983; Keck, 2006; Kintsch &amp; van Dijk, 1978), and (c) the reading–writing criterion-separation framework, focusing on whether the tools confuse reading and writing constructs (Messick, 1989). Anticipated codes include:</w:t>
       </w:r>
     </w:p>
     <w:p>
@@ -4103,7 +4047,7 @@
           <w:sz w:val="24"/>
           <w:szCs w:val="24"/>
         </w:rPr>
-        <w:t xml:space="preserve">AI penalises non-standard but meaningful phrasing (as defined in Section 1.6) on grounds not supported by the applicable rubric descriptor for the criterion in question, when a human marker credits the same phrasing as effective transformation; AI fails to penalise near-copying under a descriptor that penalises reliance on source wording</w:t>
+        <w:t xml:space="preserve">AI penalises non-standard but meaningful phrasing (as defined in Section 1.6) on grounds not supported by the applicable rubric descriptor for the criterion in question, when a human marker credits the same phrasing as effective transformation</w:t>
       </w:r>
     </w:p>
     <w:p>
@@ -4128,7 +4072,7 @@
           <w:sz w:val="24"/>
           <w:szCs w:val="24"/>
         </w:rPr>
-        <w:t xml:space="preserve">AI applies a level descriptor to the wrong criterion—for example, using fluent prose to justify a reading mark without supporting content-point evidence, or penalising content selection under the writing mark. Construct confusion is coded only when the rationale demonstrably misapplies the relevant descriptor; a human–AI disagreement alone does not establish an AI error</w:t>
+        <w:t xml:space="preserve">AI explicitly applies a level descriptor to the wrong criterion—for example, citing fluency or style as the reason for reading credit, or penalising content selection under the writing mark. Construct confusion is coded only when the rationale demonstrably misapplies the relevant descriptor; a human–AI disagreement alone does not establish an AI error</w:t>
       </w:r>
     </w:p>
     <w:p>
@@ -4153,7 +4097,7 @@
           <w:sz w:val="24"/>
           <w:szCs w:val="24"/>
         </w:rPr>
-        <w:t xml:space="preserve">AI evaluates paraphrase quality differently from human raters; AI does not distinguish synonym substitution from structural reformulation. Penalising source copying is judged against the applicable descriptor, not automatically classified as unfair treatment of multilingual writing</w:t>
+        <w:t xml:space="preserve">AI evaluates paraphrase quality differently from human raters; AI does not distinguish synonym substitution from structural reformulation; AI fails to penalise near-copying under the writing descriptor that addresses reliance on source wording. Penalising source copying is judged against the applicable descriptor, not automatically classified as unfair treatment of multilingual writing</w:t>
       </w:r>
     </w:p>
     <w:p>
@@ -4177,7 +4121,7 @@
           <w:sz w:val="24"/>
           <w:szCs w:val="24"/>
         </w:rPr>
-        <w:t xml:space="preserve">For each of the 8 selected scripts, a structured evidence record will be compiled before coding begins. For each AI rationale claim (e.g., “the student included point X” or “the summary lacks own-words transformation”), the record documents: (a) the AI’s specific claim; (b) the relevant student wording and corresponding source-passage evidence; (c) the applicable reading or writing level descriptor; and (d) a judgement of whether the claim is supported, unsupported or ambiguous given the textual evidence. The second human rater will independently examine the 8 selected scripts and their AI rationales, completing the same evidence record, before seeing the candidate’s judgements. The raters’ original independent marks are preserved and not revisited. This procedure grounds the content analysis in verifiable textual evidence rather than impressionistic comparison.</w:t>
+        <w:t xml:space="preserve">For each of the 8 selected scripts, a structured evidence record will be compiled before coding begins. For each AI rationale claim (e.g., “the student included point X” or “the summary lacks own-words transformation”), the record documents: (a) the AI’s specific claim; (b) the relevant student wording and corresponding source-passage evidence; (c) the applicable reading or writing level descriptor; and (d) a judgement using four defined categories: supported (the claim is borne out by the student text and source); contradicted (the claim is demonstrably false—for example, crediting a content point the summary does not contain); insufficient explanation (the claim is too general to show the basis of the mark—for example, “clear and fluent” offered alongside a reading mark); and ambiguous (the evidence allows more than one defensible reading). A rationale that omits content evidence is not, on that ground alone, treated as evidence of mis-scoring: a short explanation may accompany a defensible mark. Construct confusion is coded only when the AI explicitly uses a quality to justify the mark for the wrong criterion, or when a claim contradicted by the text underpins the mark. The second human rater will independently examine the 8 selected scripts and their AI rationales, completing the same evidence record, before seeing the candidate’s judgements. The raters’ original independent marks are preserved and not revisited. This procedure grounds the content analysis in verifiable textual evidence rather than impressionistic comparison.</w:t>
       </w:r>
     </w:p>
     <w:p>
@@ -4253,7 +4197,7 @@
           <w:sz w:val="24"/>
           <w:szCs w:val="24"/>
         </w:rPr>
-        <w:t xml:space="preserve">The synthesis draws on RQ1–RQ3 to assess whether the combined evidence supports a discrepancy-review workflow. For each tool/passage combination, the synthesis reports: (a) pass-to-pass consistency (from RQ1); (b) agreement with human raters and the direction and magnitude of the correction gap (from RQ2); and (c) the qualitative patterns that explain high-divergence cases (from RQ3). The synthesis identifies which tool/passage/criterion combinations have the strongest evidence base and which carry the greatest risk of construct-irrelevant scoring. It does not produce operational thresholds or decision rules; it provides the descriptive evidence a teacher or school would need to make an informed decision about whether and how to use a consumer AI tool as a second marker for this task. Whether teachers find the correction-gap evidence interpretable and actionable is a question for future research.</w:t>
+        <w:t xml:space="preserve">The synthesis draws on RQ1–RQ3 to: (a) summarise pass-to-pass consistency and agreement with human raters, including the direction and magnitude of the correction gap, by tool, passage and criterion (from RQ1 and RQ2); (b) describe the rubric-related concerns illustrated by the selected cases (from RQ3); and (c) identify the questions that require further validation before classroom adoption. The quantitative results support comparisons of consistency and agreement across conditions; the selected cases illustrate how problems arise but cannot rank how often they occur in each condition. It does not produce operational thresholds or decision rules; it provides the descriptive evidence a teacher or school would need to make an informed decision about whether and how to use a consumer AI tool as a second marker for this task. Whether teachers find the correction-gap evidence interpretable and actionable is a question for future research.</w:t>
       </w:r>
     </w:p>
     <w:p>
@@ -4277,7 +4221,7 @@
           <w:sz w:val="24"/>
           <w:szCs w:val="24"/>
         </w:rPr>
-        <w:t xml:space="preserve">If AI–human agreement is high across both tools and both passages, and the content analysis reveals no systematic patterns of construct confusion or construct-irrelevant scoring, this outcome is reported as evidence that consumer AI scoring of this task, under the study’s conditions, is more consistent with human judgement than prior literature might suggest. The study’s contribution in that case lies in having established the agreement level under ecological conditions, not in having found a problem. If anticipated patterns (e.g., confusion of reading and writing constructs, penalisation of multilingual learners’ language features) do not appear in the high-discrepancy rationales, this is reported as a non-finding in the selected cases. Because only eight scripts are examined, such an absence would not demonstrate that construct problems are absent across the corpus. The preregistered analysis plan will include this contingency.</w:t>
+        <w:t xml:space="preserve">If AI–human agreement is high across both tools and both passages, and the content analysis reveals no systematic patterns of construct confusion or construct-irrelevant scoring, this outcome is reported as evidence that consumer AI scoring of this task, under the study’s conditions, agreed closely with human judgement. The study’s contribution in that case lies in having established the agreement level under ecological conditions, not in having found a problem. If anticipated patterns (e.g., confusion of reading and writing constructs, penalisation of multilingual learners’ language features) do not appear in the high-discrepancy rationales, this is reported as a non-finding in the selected cases. Because only eight scripts are examined, such an absence would not demonstrate that construct problems are absent across the corpus. The preregistered analysis plan will include this contingency.</w:t>
       </w:r>
     </w:p>
     <w:p>
@@ -4652,20 +4596,6 @@
           <w:szCs w:val="24"/>
         </w:rPr>
         <w:t xml:space="preserve">The candidate occupies three roles: the students’ teacher, the principal researcher and Rater 1. This triple role is the study’s most significant ethical and methodological tension, and is mitigated at multiple levels. First, the consent process will make clear that study participation has no bearing on grades, and consent collection will not be conducted by the candidate in his teaching role. Second, all scripts are anonymised, typed verbatim and stripped of identifying content by an external anonymiser before the candidate sees any script. Third, scripts are marked in randomised order, blind to student identity and to all AI scores, with marks locked before AI scoring begins. Fourth, formal marking begins no earlier than four weeks after the last writing session, increasing temporal distance between classroom interaction and assessment. Fifth, the second human rater provides an independent, fully blind benchmark: where the candidate’s marks diverge systematically from the second rater’s, this is detectable in the H1–H2 agreement statistics. Sixth, the candidate will not conduct the re-checking of typed scripts against originals; this is the anonymiser’s responsibility. Despite these mitigations, the candidate’s familiarity with his students’ writing abilities cannot be fully eliminated. This is acknowledged as a limitation; the second rater’s marks serve as the primary check against unconscious bias.</w:t>
-      </w:r>
-    </w:p>
-    <w:p>
-      <w:pPr>
-        <w:spacing w:after="200" w:before="200" w:line="360"/>
-        <w:jc w:val="center"/>
-      </w:pPr>
-      <w:r>
-        <w:rPr>
-          <w:rFonts w:ascii="Times New Roman" w:cs="Times New Roman" w:eastAsia="Times New Roman" w:hAnsi="Times New Roman"/>
-          <w:sz w:val="24"/>
-          <w:szCs w:val="24"/>
-        </w:rPr>
-        <w:t xml:space="preserve">—</w:t>
       </w:r>
     </w:p>
     <w:p>
@@ -6248,21 +6178,7 @@
           <w:sz w:val="24"/>
           <w:szCs w:val="24"/>
         </w:rPr>
-        <w:t xml:space="preserve">Fourth, the frozen, de-identified corpus will be documented for replication and, subject to ethics and data policy, made available for rescoring by future models.</w:t>
-      </w:r>
-    </w:p>
-    <w:p>
-      <w:pPr>
-        <w:spacing w:after="200" w:before="200" w:line="360"/>
-        <w:jc w:val="center"/>
-      </w:pPr>
-      <w:r>
-        <w:rPr>
-          <w:rFonts w:ascii="Times New Roman" w:cs="Times New Roman" w:eastAsia="Times New Roman" w:hAnsi="Times New Roman"/>
-          <w:sz w:val="24"/>
-          <w:szCs w:val="24"/>
-        </w:rPr>
-        <w:t xml:space="preserve">—</w:t>
+        <w:t xml:space="preserve">Finally, the frozen, de-identified corpus will be documented for replication and, subject to ethics and data policy, made available for rescoring by future models.</w:t>
       </w:r>
     </w:p>
     <w:p>
@@ -6494,20 +6410,6 @@
           <w:szCs w:val="24"/>
         </w:rPr>
         <w:t xml:space="preserve">the handling of refusals and of out-of-range or unparseable answers, and the parsing rule for the output line.</w:t>
-      </w:r>
-    </w:p>
-    <w:p>
-      <w:pPr>
-        <w:spacing w:after="200" w:before="200" w:line="360"/>
-        <w:jc w:val="center"/>
-      </w:pPr>
-      <w:r>
-        <w:rPr>
-          <w:rFonts w:ascii="Times New Roman" w:cs="Times New Roman" w:eastAsia="Times New Roman" w:hAnsi="Times New Roman"/>
-          <w:sz w:val="24"/>
-          <w:szCs w:val="24"/>
-        </w:rPr>
-        <w:t xml:space="preserve">—</w:t>
       </w:r>
     </w:p>
     <w:p>
@@ -7369,20 +7271,6 @@
     </w:tbl>
     <w:p>
       <w:pPr>
-        <w:spacing w:after="200" w:before="200" w:line="360"/>
-        <w:jc w:val="center"/>
-      </w:pPr>
-      <w:r>
-        <w:rPr>
-          <w:rFonts w:ascii="Times New Roman" w:cs="Times New Roman" w:eastAsia="Times New Roman" w:hAnsi="Times New Roman"/>
-          <w:sz w:val="24"/>
-          <w:szCs w:val="24"/>
-        </w:rPr>
-        <w:t xml:space="preserve">—</w:t>
-      </w:r>
-    </w:p>
-    <w:p>
-      <w:pPr>
         <w:pStyle w:val="Heading1"/>
         <w:pageBreakBefore/>
         <w:spacing w:after="120" w:before="0" w:line="360"/>
@@ -7419,7 +7307,7 @@
           <w:sz w:val="24"/>
           <w:szCs w:val="24"/>
         </w:rPr>
-        <w:t xml:space="preserve">Cambridge criteria are paraphrased, not quoted. The final mapping will be completed once the study rubric is written, and each row will be judged independently by two IGCSE colleagues as full, partial or absent (Section 3.3).</w:t>
+        <w:t xml:space="preserve">Cambridge criteria are paraphrased from Table A (Reading) and Table B (Writing) for Question 2(a) in the 2027 specimen mark scheme (Cambridge International Education, 2024b), not quoted. Bracketed codes are the assessment objectives the syllabus states Question 2(a) tests: reading R1 (explicit meanings), R2 (implicit meanings and attitudes) and R5 (selecting and using information for specific purposes); writing W1 (articulating what is thought, felt and imagined), W2 (organising and structuring ideas) and W3 (range of vocabulary and sentence structures appropriate to context) (Cambridge International Education, 2024c). The mapping is designed not to move any quality from one criterion to the other. The final mapping will be completed once the study rubric is written, and judged independently by two IGCSE colleagues as full, partial or absent (Section 3.3).</w:t>
       </w:r>
     </w:p>
     <w:tbl>
@@ -7562,7 +7450,7 @@
                 <w:sz w:val="22"/>
                 <w:szCs w:val="22"/>
               </w:rPr>
-              <w:t xml:space="preserve">understanding of the passage</w:t>
+              <w:t xml:space="preserve">understanding of a range of relevant ideas (R1, R2)</w:t>
             </w:r>
           </w:p>
         </w:tc>
@@ -7600,7 +7488,7 @@
                 <w:sz w:val="22"/>
                 <w:szCs w:val="22"/>
               </w:rPr>
-              <w:t xml:space="preserve">Bands describe how accurately the summary represents the source meaning; the reading key lists the content points the passage offers</w:t>
+              <w:t xml:space="preserve">Bands describe the range of relevant ideas understood and how accurately they represent the source meaning; the reading key lists the content points the passage offers</w:t>
             </w:r>
           </w:p>
         </w:tc>
@@ -7653,7 +7541,7 @@
                 <w:sz w:val="22"/>
                 <w:szCs w:val="22"/>
               </w:rPr>
-              <w:t xml:space="preserve">selection of relevant ideas rather than indiscriminate transcription</w:t>
+              <w:t xml:space="preserve">selection of relevant ideas, from indiscriminate selection or excess material to careful and skilful selection (R5)</w:t>
             </w:r>
           </w:p>
         </w:tc>
@@ -7691,7 +7579,7 @@
                 <w:sz w:val="22"/>
                 <w:szCs w:val="22"/>
               </w:rPr>
-              <w:t xml:space="preserve">Bands distinguish selective coverage of relevant points from copying of whole sections</w:t>
+              <w:t xml:space="preserve">Bands judge which ideas are selected and whether they are relevant. Borrowing source wording is not treated as poor selection; it is assessed under writing</w:t>
             </w:r>
           </w:p>
         </w:tc>
@@ -7744,7 +7632,7 @@
                 <w:sz w:val="22"/>
                 <w:szCs w:val="22"/>
               </w:rPr>
-              <w:t xml:space="preserve">focus on the specified aspect of the passage</w:t>
+              <w:t xml:space="preserve">focus on the text and task (R5)</w:t>
             </w:r>
           </w:p>
         </w:tc>
@@ -7835,7 +7723,7 @@
                 <w:sz w:val="22"/>
                 <w:szCs w:val="22"/>
               </w:rPr>
-              <w:t xml:space="preserve">evidence of an overview</w:t>
+              <w:t xml:space="preserve">overview demonstrated through selection (R5)</w:t>
             </w:r>
           </w:p>
         </w:tc>
@@ -7873,7 +7761,7 @@
                 <w:sz w:val="22"/>
                 <w:szCs w:val="22"/>
               </w:rPr>
-              <w:t xml:space="preserve">Upper bands require points to be grouped or connected, not merely listed</w:t>
+              <w:t xml:space="preserve">Level 5 requires relevant ideas skilfully selected to demonstrate an overview; Level 4 requires some evidence of an overview. No separate requirement to group or link points is added; organisation is assessed under writing</w:t>
             </w:r>
           </w:p>
         </w:tc>
@@ -7945,7 +7833,7 @@
                 <w:sz w:val="22"/>
                 <w:szCs w:val="22"/>
               </w:rPr>
-              <w:t xml:space="preserve">Five two-mark bands</w:t>
+              <w:t xml:space="preserve">Five two-mark levels (1–2 to 9–10) plus 0</w:t>
             </w:r>
           </w:p>
         </w:tc>
@@ -7964,7 +7852,7 @@
                 <w:sz w:val="22"/>
                 <w:szCs w:val="22"/>
               </w:rPr>
-              <w:t xml:space="preserve">Same band structure and holistic approach; the reading key guides but is not converted into a point count</w:t>
+              <w:t xml:space="preserve">Same band structure and holistic approach; 0 for no creditable content; the reading key guides but is not converted into a point count</w:t>
             </w:r>
           </w:p>
         </w:tc>
@@ -8017,7 +7905,7 @@
                 <w:sz w:val="22"/>
                 <w:szCs w:val="22"/>
               </w:rPr>
-              <w:t xml:space="preserve">clarity and fluency of expression</w:t>
+              <w:t xml:space="preserve">expression: clear and fluent at the top level (W1, W3)</w:t>
             </w:r>
           </w:p>
         </w:tc>
@@ -8108,7 +7996,7 @@
                 <w:sz w:val="22"/>
                 <w:szCs w:val="22"/>
               </w:rPr>
-              <w:t xml:space="preserve">organisation of the summary</w:t>
+              <w:t xml:space="preserve">organisation: from limited to effective (W2)</w:t>
             </w:r>
           </w:p>
         </w:tc>
@@ -8146,7 +8034,7 @@
                 <w:sz w:val="22"/>
                 <w:szCs w:val="22"/>
               </w:rPr>
-              <w:t xml:space="preserve">Bands describe logical sequencing and linking of ideas</w:t>
+              <w:t xml:space="preserve">Bands describe how effectively the summary is organised</w:t>
             </w:r>
           </w:p>
         </w:tc>
@@ -8199,7 +8087,7 @@
                 <w:sz w:val="22"/>
                 <w:szCs w:val="22"/>
               </w:rPr>
-              <w:t xml:space="preserve">use of own words and avoidance of reliance on source wording</w:t>
+              <w:t xml:space="preserve">reliance on the words of the text; lifted sections at the lowest level (W3)</w:t>
             </w:r>
           </w:p>
         </w:tc>
@@ -8237,7 +8125,7 @@
                 <w:sz w:val="22"/>
                 <w:szCs w:val="22"/>
               </w:rPr>
-              <w:t xml:space="preserve">Bands reward transformation of source language and penalise lifting of source phrases</w:t>
+              <w:t xml:space="preserve">Bands credit transformation of source language and reduce credit for extended reliance on source wording; necessary terms, names and technical words with no reasonable alternative are not penalised</w:t>
             </w:r>
           </w:p>
         </w:tc>
@@ -8290,7 +8178,7 @@
                 <w:sz w:val="22"/>
                 <w:szCs w:val="22"/>
               </w:rPr>
-              <w:t xml:space="preserve">precision and range of vocabulary</w:t>
+              <w:t xml:space="preserve">concise use of a range of appropriate vocabulary (W3)</w:t>
             </w:r>
           </w:p>
         </w:tc>
@@ -8328,7 +8216,7 @@
                 <w:sz w:val="22"/>
                 <w:szCs w:val="22"/>
               </w:rPr>
-              <w:t xml:space="preserve">Bands describe precise word choice appropriate to summary</w:t>
+              <w:t xml:space="preserve">Bands credit concise expression and a range of appropriate vocabulary</w:t>
             </w:r>
           </w:p>
         </w:tc>
@@ -8373,6 +8261,97 @@
                 <w:sz w:val="22"/>
                 <w:szCs w:val="22"/>
               </w:rPr>
+              <w:t xml:space="preserve">Writing: </w:t>
+            </w:r>
+            <w:r>
+              <w:rPr>
+                <w:rFonts w:ascii="Times New Roman" w:cs="Times New Roman" w:eastAsia="Times New Roman" w:hAnsi="Times New Roman"/>
+                <w:sz w:val="22"/>
+                <w:szCs w:val="22"/>
+              </w:rPr>
+              <w:t xml:space="preserve">holistic banded judgement out of 5</w:t>
+            </w:r>
+          </w:p>
+        </w:tc>
+        <w:tc>
+          <w:tcPr>
+            <w:tcW w:type="dxa" w:w="1900"/>
+            <w:vAlign w:val="center"/>
+          </w:tcPr>
+          <w:p>
+            <w:pPr>
+              <w:spacing w:after="60"/>
+            </w:pPr>
+            <w:r>
+              <w:rPr>
+                <w:rFonts w:ascii="Times New Roman" w:cs="Times New Roman" w:eastAsia="Times New Roman" w:hAnsi="Times New Roman"/>
+                <w:sz w:val="22"/>
+                <w:szCs w:val="22"/>
+              </w:rPr>
+              <w:t xml:space="preserve">Three levels (4–5, 2–3, 1) plus 0</w:t>
+            </w:r>
+          </w:p>
+        </w:tc>
+        <w:tc>
+          <w:tcPr>
+            <w:tcW w:type="dxa" w:w="3000"/>
+            <w:vAlign w:val="center"/>
+          </w:tcPr>
+          <w:p>
+            <w:pPr>
+              <w:spacing w:after="60"/>
+            </w:pPr>
+            <w:r>
+              <w:rPr>
+                <w:rFonts w:ascii="Times New Roman" w:cs="Times New Roman" w:eastAsia="Times New Roman" w:hAnsi="Times New Roman"/>
+                <w:sz w:val="22"/>
+                <w:szCs w:val="22"/>
+              </w:rPr>
+              <w:t xml:space="preserve">Same three-level band structure; 0 for no creditable content</w:t>
+            </w:r>
+          </w:p>
+        </w:tc>
+        <w:tc>
+          <w:tcPr>
+            <w:tcW w:type="dxa" w:w="1800"/>
+            <w:vAlign w:val="center"/>
+          </w:tcPr>
+          <w:p>
+            <w:pPr>
+              <w:spacing w:after="60"/>
+            </w:pPr>
+            <w:r>
+              <w:rPr>
+                <w:rFonts w:ascii="Times New Roman" w:cs="Times New Roman" w:eastAsia="Times New Roman" w:hAnsi="Times New Roman"/>
+                <w:sz w:val="22"/>
+                <w:szCs w:val="22"/>
+              </w:rPr>
+              <w:t xml:space="preserve">Full / partial / absent</w:t>
+            </w:r>
+          </w:p>
+        </w:tc>
+      </w:tr>
+      <w:tr>
+        <w:trPr>
+          <w:cantSplit/>
+        </w:trPr>
+        <w:tc>
+          <w:tcPr>
+            <w:tcW w:type="dxa" w:w="2500"/>
+            <w:vAlign w:val="center"/>
+          </w:tcPr>
+          <w:p>
+            <w:pPr>
+              <w:spacing w:after="60"/>
+            </w:pPr>
+            <w:r>
+              <w:rPr>
+                <w:rFonts w:ascii="Times New Roman" w:cs="Times New Roman" w:eastAsia="Times New Roman" w:hAnsi="Times New Roman"/>
+                <w:b/>
+                <w:bCs/>
+                <w:sz w:val="22"/>
+                <w:szCs w:val="22"/>
+              </w:rPr>
               <w:t xml:space="preserve">Task: </w:t>
             </w:r>
             <w:r>
@@ -8444,20 +8423,6 @@
         </w:tc>
       </w:tr>
     </w:tbl>
-    <w:p>
-      <w:pPr>
-        <w:spacing w:after="200" w:before="200" w:line="360"/>
-        <w:jc w:val="center"/>
-      </w:pPr>
-      <w:r>
-        <w:rPr>
-          <w:rFonts w:ascii="Times New Roman" w:cs="Times New Roman" w:eastAsia="Times New Roman" w:hAnsi="Times New Roman"/>
-          <w:sz w:val="24"/>
-          <w:szCs w:val="24"/>
-        </w:rPr>
-        <w:t xml:space="preserve">—</w:t>
-      </w:r>
-    </w:p>
     <w:p>
       <w:pPr>
         <w:pStyle w:val="Heading1"/>
@@ -8477,7 +8442,8 @@
     </w:p>
     <w:p>
       <w:pPr>
-        <w:spacing w:after="80" w:line="276"/>
+        <w:keepLines/>
+        <w:spacing w:after="60" w:line="264"/>
         <w:ind w:left="720" w:hanging="720"/>
         <w:jc w:val="left"/>
       </w:pPr>
@@ -8492,7 +8458,8 @@
     </w:p>
     <w:p>
       <w:pPr>
-        <w:spacing w:after="80" w:line="276"/>
+        <w:keepLines/>
+        <w:spacing w:after="60" w:line="264"/>
         <w:ind w:left="720" w:hanging="720"/>
         <w:jc w:val="left"/>
       </w:pPr>
@@ -8507,7 +8474,8 @@
     </w:p>
     <w:p>
       <w:pPr>
-        <w:spacing w:after="80" w:line="276"/>
+        <w:keepLines/>
+        <w:spacing w:after="60" w:line="264"/>
         <w:ind w:left="720" w:hanging="720"/>
         <w:jc w:val="left"/>
       </w:pPr>
@@ -8522,7 +8490,8 @@
     </w:p>
     <w:p>
       <w:pPr>
-        <w:spacing w:after="80" w:line="276"/>
+        <w:keepLines/>
+        <w:spacing w:after="60" w:line="264"/>
         <w:ind w:left="720" w:hanging="720"/>
         <w:jc w:val="left"/>
       </w:pPr>
@@ -8537,7 +8506,8 @@
     </w:p>
     <w:p>
       <w:pPr>
-        <w:spacing w:after="80" w:line="276"/>
+        <w:keepLines/>
+        <w:spacing w:after="60" w:line="264"/>
         <w:ind w:left="720" w:hanging="720"/>
         <w:jc w:val="left"/>
       </w:pPr>
@@ -8552,7 +8522,8 @@
     </w:p>
     <w:p>
       <w:pPr>
-        <w:spacing w:after="80" w:line="276"/>
+        <w:keepLines/>
+        <w:spacing w:after="60" w:line="264"/>
         <w:ind w:left="720" w:hanging="720"/>
         <w:jc w:val="left"/>
       </w:pPr>
@@ -8567,7 +8538,8 @@
     </w:p>
     <w:p>
       <w:pPr>
-        <w:spacing w:after="80" w:line="276"/>
+        <w:keepLines/>
+        <w:spacing w:after="60" w:line="264"/>
         <w:ind w:left="720" w:hanging="720"/>
         <w:jc w:val="left"/>
       </w:pPr>
@@ -8582,7 +8554,8 @@
     </w:p>
     <w:p>
       <w:pPr>
-        <w:spacing w:after="80" w:line="276"/>
+        <w:keepLines/>
+        <w:spacing w:after="60" w:line="264"/>
         <w:ind w:left="720" w:hanging="720"/>
         <w:jc w:val="left"/>
       </w:pPr>
@@ -8597,7 +8570,8 @@
     </w:p>
     <w:p>
       <w:pPr>
-        <w:spacing w:after="80" w:line="276"/>
+        <w:keepLines/>
+        <w:spacing w:after="60" w:line="264"/>
         <w:ind w:left="720" w:hanging="720"/>
         <w:jc w:val="left"/>
       </w:pPr>
@@ -8612,7 +8586,8 @@
     </w:p>
     <w:p>
       <w:pPr>
-        <w:spacing w:after="80" w:line="276"/>
+        <w:keepLines/>
+        <w:spacing w:after="60" w:line="264"/>
         <w:ind w:left="720" w:hanging="720"/>
         <w:jc w:val="left"/>
       </w:pPr>
@@ -8627,7 +8602,8 @@
     </w:p>
     <w:p>
       <w:pPr>
-        <w:spacing w:after="80" w:line="276"/>
+        <w:keepLines/>
+        <w:spacing w:after="60" w:line="264"/>
         <w:ind w:left="720" w:hanging="720"/>
         <w:jc w:val="left"/>
       </w:pPr>
@@ -8642,7 +8618,8 @@
     </w:p>
     <w:p>
       <w:pPr>
-        <w:spacing w:after="80" w:line="276"/>
+        <w:keepLines/>
+        <w:spacing w:after="60" w:line="264"/>
         <w:ind w:left="720" w:hanging="720"/>
         <w:jc w:val="left"/>
       </w:pPr>
@@ -8652,12 +8629,13 @@
           <w:sz w:val="22"/>
           <w:szCs w:val="22"/>
         </w:rPr>
-        <w:t xml:space="preserve">Cambridge International Education. (2024a). Cambridge IGCSE First Language English 0500: Syllabus for examination in 2027, 2028 and 2029 (Version 1). Cambridge University Press &amp; Assessment.</w:t>
-      </w:r>
-    </w:p>
-    <w:p>
-      <w:pPr>
-        <w:spacing w:after="80" w:line="276"/>
+        <w:t xml:space="preserve">Cambridge International Education. (2024a). 0990 First Language English (9–1) June 2024: Principal examiner report for teachers. Cambridge University Press &amp; Assessment.</w:t>
+      </w:r>
+    </w:p>
+    <w:p>
+      <w:pPr>
+        <w:keepLines/>
+        <w:spacing w:after="60" w:line="264"/>
         <w:ind w:left="720" w:hanging="720"/>
         <w:jc w:val="left"/>
       </w:pPr>
@@ -8667,12 +8645,13 @@
           <w:sz w:val="22"/>
           <w:szCs w:val="22"/>
         </w:rPr>
-        <w:t xml:space="preserve">Cambridge International Education. (2024b). 0990 First Language English (9–1) June 2024: Principal examiner report for teachers. Cambridge University Press &amp; Assessment.</w:t>
-      </w:r>
-    </w:p>
-    <w:p>
-      <w:pPr>
-        <w:spacing w:after="80" w:line="276"/>
+        <w:t xml:space="preserve">Cambridge International Education. (2024b). Cambridge IGCSE First Language English 0500/01 Paper 1 Reading: Specimen mark scheme (for examination from 2027). Cambridge University Press &amp; Assessment. https://www.cambridgeinternational.org/Images/718838-2027-specimen-paper-1-mark-scheme.pdf</w:t>
+      </w:r>
+    </w:p>
+    <w:p>
+      <w:pPr>
+        <w:keepLines/>
+        <w:spacing w:after="60" w:line="264"/>
         <w:ind w:left="720" w:hanging="720"/>
         <w:jc w:val="left"/>
       </w:pPr>
@@ -8682,12 +8661,13 @@
           <w:sz w:val="22"/>
           <w:szCs w:val="22"/>
         </w:rPr>
-        <w:t xml:space="preserve">Carder, M. (2007). Bilingualism in international schools: A model for enriching language education. Multilingual Matters. https://doi.org/10.21832/9781853599422</w:t>
-      </w:r>
-    </w:p>
-    <w:p>
-      <w:pPr>
-        <w:spacing w:after="80" w:line="276"/>
+        <w:t xml:space="preserve">Cambridge International Education. (2024c). Cambridge IGCSE First Language English 0500: Syllabus for examination in 2027, 2028 and 2029 (Version 1). Cambridge University Press &amp; Assessment.</w:t>
+      </w:r>
+    </w:p>
+    <w:p>
+      <w:pPr>
+        <w:keepLines/>
+        <w:spacing w:after="60" w:line="264"/>
         <w:ind w:left="720" w:hanging="720"/>
         <w:jc w:val="left"/>
       </w:pPr>
@@ -8697,12 +8677,13 @@
           <w:sz w:val="22"/>
           <w:szCs w:val="22"/>
         </w:rPr>
-        <w:t xml:space="preserve">Chen, L., Zaharia, M., &amp; Zou, J. (2024). How is ChatGPT’s behavior changing over time? Harvard Data Science Review, 6(2). https://doi.org/10.1162/99608f92.5317da47</w:t>
-      </w:r>
-    </w:p>
-    <w:p>
-      <w:pPr>
-        <w:spacing w:after="80" w:line="276"/>
+        <w:t xml:space="preserve">Carder, M. (2007). Bilingualism in international schools: A model for enriching language education. Multilingual Matters. https://doi.org/10.21832/9781853599422</w:t>
+      </w:r>
+    </w:p>
+    <w:p>
+      <w:pPr>
+        <w:keepLines/>
+        <w:spacing w:after="60" w:line="264"/>
         <w:ind w:left="720" w:hanging="720"/>
         <w:jc w:val="left"/>
       </w:pPr>
@@ -8712,12 +8693,13 @@
           <w:sz w:val="22"/>
           <w:szCs w:val="22"/>
         </w:rPr>
-        <w:t xml:space="preserve">Clauser, B. E., Kane, M. T., &amp; Swanson, D. B. (2002). Validity issues for performance-based tests scored with computer-automated scoring systems. Applied Measurement in Education, 15(4), 413–432. https://doi.org/10.1207/S15324818AME1504_05</w:t>
-      </w:r>
-    </w:p>
-    <w:p>
-      <w:pPr>
-        <w:spacing w:after="80" w:line="276"/>
+        <w:t xml:space="preserve">Chen, L., Zaharia, M., &amp; Zou, J. (2024). How is ChatGPT’s behavior changing over time? Harvard Data Science Review, 6(2). https://doi.org/10.1162/99608f92.5317da47</w:t>
+      </w:r>
+    </w:p>
+    <w:p>
+      <w:pPr>
+        <w:keepLines/>
+        <w:spacing w:after="60" w:line="264"/>
         <w:ind w:left="720" w:hanging="720"/>
         <w:jc w:val="left"/>
       </w:pPr>
@@ -8727,12 +8709,13 @@
           <w:sz w:val="22"/>
           <w:szCs w:val="22"/>
         </w:rPr>
-        <w:t xml:space="preserve">Cohen, J. (1968). Weighted kappa: Nominal scale agreement provision for scaled disagreement or partial credit. Psychological Bulletin, 70(4), 213–220. https://doi.org/10.1037/h0026256</w:t>
-      </w:r>
-    </w:p>
-    <w:p>
-      <w:pPr>
-        <w:spacing w:after="80" w:line="276"/>
+        <w:t xml:space="preserve">Clauser, B. E., Kane, M. T., &amp; Swanson, D. B. (2002). Validity issues for performance-based tests scored with computer-automated scoring systems. Applied Measurement in Education, 15(4), 413–432. https://doi.org/10.1207/S15324818AME1504_05</w:t>
+      </w:r>
+    </w:p>
+    <w:p>
+      <w:pPr>
+        <w:keepLines/>
+        <w:spacing w:after="60" w:line="264"/>
         <w:ind w:left="720" w:hanging="720"/>
         <w:jc w:val="left"/>
       </w:pPr>
@@ -8742,12 +8725,13 @@
           <w:sz w:val="22"/>
           <w:szCs w:val="22"/>
         </w:rPr>
-        <w:t xml:space="preserve">Cumming, A. (2013). Assessing integrated writing tasks for academic purposes: Promises and perils. Language Assessment Quarterly, 10(1), 1–8. https://doi.org/10.1080/15434303.2011.622016</w:t>
-      </w:r>
-    </w:p>
-    <w:p>
-      <w:pPr>
-        <w:spacing w:after="80" w:line="276"/>
+        <w:t xml:space="preserve">Cohen, J. (1968). Weighted kappa: Nominal scale agreement provision for scaled disagreement or partial credit. Psychological Bulletin, 70(4), 213–220. https://doi.org/10.1037/h0026256</w:t>
+      </w:r>
+    </w:p>
+    <w:p>
+      <w:pPr>
+        <w:keepLines/>
+        <w:spacing w:after="60" w:line="264"/>
         <w:ind w:left="720" w:hanging="720"/>
         <w:jc w:val="left"/>
       </w:pPr>
@@ -8757,12 +8741,13 @@
           <w:sz w:val="22"/>
           <w:szCs w:val="22"/>
         </w:rPr>
-        <w:t xml:space="preserve">Doewes, A., Kurdhi, N. A., &amp; Saxena, A. (2023). Evaluating quadratic weighted kappa as the standard performance metric for automated essay scoring. In M. Feng, T. Käser, &amp; P. Talukdar (Eds.), Proceedings of the 16th International Conference on Educational Data Mining (pp. 103–113). International Educational Data Mining Society. https://doi.org/10.5281/zenodo.8115784</w:t>
-      </w:r>
-    </w:p>
-    <w:p>
-      <w:pPr>
-        <w:spacing w:after="80" w:line="276"/>
+        <w:t xml:space="preserve">Cumming, A. (2013). Assessing integrated writing tasks for academic purposes: Promises and perils. Language Assessment Quarterly, 10(1), 1–8. https://doi.org/10.1080/15434303.2011.622016</w:t>
+      </w:r>
+    </w:p>
+    <w:p>
+      <w:pPr>
+        <w:keepLines/>
+        <w:spacing w:after="60" w:line="264"/>
         <w:ind w:left="720" w:hanging="720"/>
         <w:jc w:val="left"/>
       </w:pPr>
@@ -8772,12 +8757,13 @@
           <w:sz w:val="22"/>
           <w:szCs w:val="22"/>
         </w:rPr>
-        <w:t xml:space="preserve">Eckes, T. (2015). Introduction to many-facet Rasch measurement: Analyzing and evaluating rater-mediated assessments (2nd rev. and updated ed.). Peter Lang. https://doi.org/10.3726/978-3-653-04844-5</w:t>
-      </w:r>
-    </w:p>
-    <w:p>
-      <w:pPr>
-        <w:spacing w:after="80" w:line="276"/>
+        <w:t xml:space="preserve">Doewes, A., Kurdhi, N. A., &amp; Saxena, A. (2023). Evaluating quadratic weighted kappa as the standard performance metric for automated essay scoring. In M. Feng, T. Käser, &amp; P. Talukdar (Eds.), Proceedings of the 16th International Conference on Educational Data Mining (pp. 103–113). International Educational Data Mining Society. https://doi.org/10.5281/zenodo.8115784</w:t>
+      </w:r>
+    </w:p>
+    <w:p>
+      <w:pPr>
+        <w:keepLines/>
+        <w:spacing w:after="60" w:line="264"/>
         <w:ind w:left="720" w:hanging="720"/>
         <w:jc w:val="left"/>
       </w:pPr>
@@ -8787,12 +8773,13 @@
           <w:sz w:val="22"/>
           <w:szCs w:val="22"/>
         </w:rPr>
-        <w:t xml:space="preserve">Gallagher, E. (2008). Equal rights to the curriculum: Many languages, one message. Multilingual Matters. https://doi.org/10.21832/9781847690562</w:t>
-      </w:r>
-    </w:p>
-    <w:p>
-      <w:pPr>
-        <w:spacing w:after="80" w:line="276"/>
+        <w:t xml:space="preserve">Eckes, T. (2015). Introduction to many-facet Rasch measurement: Analyzing and evaluating rater-mediated assessments (2nd rev. and updated ed.). Peter Lang. https://doi.org/10.3726/978-3-653-04844-5</w:t>
+      </w:r>
+    </w:p>
+    <w:p>
+      <w:pPr>
+        <w:keepLines/>
+        <w:spacing w:after="60" w:line="264"/>
         <w:ind w:left="720" w:hanging="720"/>
         <w:jc w:val="left"/>
       </w:pPr>
@@ -8802,12 +8789,13 @@
           <w:sz w:val="22"/>
           <w:szCs w:val="22"/>
         </w:rPr>
-        <w:t xml:space="preserve">Gallup &amp; Walton Family Foundation. (2025). Teaching for tomorrow: Unlocking six weeks a year with AI. Gallup. https://news.gallup.com/poll/691967/three-teachers-weekly-saving-six-weeks-year.aspx</w:t>
-      </w:r>
-    </w:p>
-    <w:p>
-      <w:pPr>
-        <w:spacing w:after="80" w:line="276"/>
+        <w:t xml:space="preserve">Gallagher, E. (2008). Equal rights to the curriculum: Many languages, one message. Multilingual Matters. https://doi.org/10.21832/9781847690562</w:t>
+      </w:r>
+    </w:p>
+    <w:p>
+      <w:pPr>
+        <w:keepLines/>
+        <w:spacing w:after="60" w:line="264"/>
         <w:ind w:left="720" w:hanging="720"/>
         <w:jc w:val="left"/>
       </w:pPr>
@@ -8817,12 +8805,13 @@
           <w:sz w:val="22"/>
           <w:szCs w:val="22"/>
         </w:rPr>
-        <w:t xml:space="preserve">Hassun, H. (2022). Private schools in the Kurdistan Region of Iraq: An evidence based approach on their functions. University of Bamberg Press. https://doi.org/10.20378/irb-58324</w:t>
-      </w:r>
-    </w:p>
-    <w:p>
-      <w:pPr>
-        <w:spacing w:after="80" w:line="276"/>
+        <w:t xml:space="preserve">Gallup &amp; Walton Family Foundation. (2025). Teaching for tomorrow: Unlocking six weeks a year with AI. Gallup. https://news.gallup.com/poll/691967/three-teachers-weekly-saving-six-weeks-year.aspx</w:t>
+      </w:r>
+    </w:p>
+    <w:p>
+      <w:pPr>
+        <w:keepLines/>
+        <w:spacing w:after="60" w:line="264"/>
         <w:ind w:left="720" w:hanging="720"/>
         <w:jc w:val="left"/>
       </w:pPr>
@@ -8832,12 +8821,13 @@
           <w:sz w:val="22"/>
           <w:szCs w:val="22"/>
         </w:rPr>
-        <w:t xml:space="preserve">Hidi, S., &amp; Anderson, V. (1986). Producing written summaries: Task demands, cognitive operations, and implications for instruction. Review of Educational Research, 56(4), 473–493. https://doi.org/10.3102/00346543056004473</w:t>
-      </w:r>
-    </w:p>
-    <w:p>
-      <w:pPr>
-        <w:spacing w:after="80" w:line="276"/>
+        <w:t xml:space="preserve">Hassun, H. (2022). Private schools in the Kurdistan Region of Iraq: An evidence based approach on their functions. University of Bamberg Press. https://doi.org/10.20378/irb-58324</w:t>
+      </w:r>
+    </w:p>
+    <w:p>
+      <w:pPr>
+        <w:keepLines/>
+        <w:spacing w:after="60" w:line="264"/>
         <w:ind w:left="720" w:hanging="720"/>
         <w:jc w:val="left"/>
       </w:pPr>
@@ -8847,12 +8837,13 @@
           <w:sz w:val="22"/>
           <w:szCs w:val="22"/>
         </w:rPr>
-        <w:t xml:space="preserve">Hirvela, A., &amp; Du, Q. (2013). “Why am I paraphrasing?”: Undergraduate ESL writers’ engagement with source-based academic writing and reading. Journal of English for Academic Purposes, 12(2), 87–98. https://doi.org/10.1016/j.jeap.2012.11.005</w:t>
-      </w:r>
-    </w:p>
-    <w:p>
-      <w:pPr>
-        <w:spacing w:after="80" w:line="276"/>
+        <w:t xml:space="preserve">Hidi, S., &amp; Anderson, V. (1986). Producing written summaries: Task demands, cognitive operations, and implications for instruction. Review of Educational Research, 56(4), 473–493. https://doi.org/10.3102/00346543056004473</w:t>
+      </w:r>
+    </w:p>
+    <w:p>
+      <w:pPr>
+        <w:keepLines/>
+        <w:spacing w:after="60" w:line="264"/>
         <w:ind w:left="720" w:hanging="720"/>
         <w:jc w:val="left"/>
       </w:pPr>
@@ -8862,12 +8853,13 @@
           <w:sz w:val="22"/>
           <w:szCs w:val="22"/>
         </w:rPr>
-        <w:t xml:space="preserve">Holm, S. (1979). A simple sequentially rejective multiple test procedure. Scandinavian Journal of Statistics, 6(2), 65–70.</w:t>
-      </w:r>
-    </w:p>
-    <w:p>
-      <w:pPr>
-        <w:spacing w:after="80" w:line="276"/>
+        <w:t xml:space="preserve">Hirvela, A., &amp; Du, Q. (2013). “Why am I paraphrasing?”: Undergraduate ESL writers’ engagement with source-based academic writing and reading. Journal of English for Academic Purposes, 12(2), 87–98. https://doi.org/10.1016/j.jeap.2012.11.005</w:t>
+      </w:r>
+    </w:p>
+    <w:p>
+      <w:pPr>
+        <w:keepLines/>
+        <w:spacing w:after="60" w:line="264"/>
         <w:ind w:left="720" w:hanging="720"/>
         <w:jc w:val="left"/>
       </w:pPr>
@@ -8877,12 +8869,13 @@
           <w:sz w:val="22"/>
           <w:szCs w:val="22"/>
         </w:rPr>
-        <w:t xml:space="preserve">Jiao, H., Song, D., &amp; Lee, W.-C. (2025). Comparing human and AI rater effects using the many-facet Rasch model (arXiv:2505.18486) [Preprint]. arXiv. https://doi.org/10.48550/arXiv.2505.18486</w:t>
-      </w:r>
-    </w:p>
-    <w:p>
-      <w:pPr>
-        <w:spacing w:after="80" w:line="276"/>
+        <w:t xml:space="preserve">Holm, S. (1979). A simple sequentially rejective multiple test procedure. Scandinavian Journal of Statistics, 6(2), 65–70.</w:t>
+      </w:r>
+    </w:p>
+    <w:p>
+      <w:pPr>
+        <w:keepLines/>
+        <w:spacing w:after="60" w:line="264"/>
         <w:ind w:left="720" w:hanging="720"/>
         <w:jc w:val="left"/>
       </w:pPr>
@@ -8892,12 +8885,13 @@
           <w:sz w:val="22"/>
           <w:szCs w:val="22"/>
         </w:rPr>
-        <w:t xml:space="preserve">Jin, R., Zhao, M., Niu, C., Xia, Y., Zhou, H., &amp; Liu, N. (2025). Evaluating the performance of ChatGPT and Claude in automated writing scoring: Insights from the many-facet Rasch model. Education and Information Technologies, 30(18), 25881–25908. https://doi.org/10.1007/s10639-025-13774-4</w:t>
-      </w:r>
-    </w:p>
-    <w:p>
-      <w:pPr>
-        <w:spacing w:after="80" w:line="276"/>
+        <w:t xml:space="preserve">Jiao, H., Song, D., &amp; Lee, W.-C. (2025). Comparing human and AI rater effects using the many-facet Rasch model (arXiv:2505.18486) [Preprint]. arXiv. https://doi.org/10.48550/arXiv.2505.18486</w:t>
+      </w:r>
+    </w:p>
+    <w:p>
+      <w:pPr>
+        <w:keepLines/>
+        <w:spacing w:after="60" w:line="264"/>
         <w:ind w:left="720" w:hanging="720"/>
         <w:jc w:val="left"/>
       </w:pPr>
@@ -8907,12 +8901,13 @@
           <w:sz w:val="22"/>
           <w:szCs w:val="22"/>
         </w:rPr>
-        <w:t xml:space="preserve">Johns, A. M., &amp; Mayes, P. (1990). An analysis of summary protocols of university ESL students. Applied Linguistics, 11(3), 253–271. https://doi.org/10.1093/applin/11.3.253</w:t>
-      </w:r>
-    </w:p>
-    <w:p>
-      <w:pPr>
-        <w:spacing w:after="80" w:line="276"/>
+        <w:t xml:space="preserve">Jin, R., Zhao, M., Niu, C., Xia, Y., Zhou, H., &amp; Liu, N. (2025). Evaluating the performance of ChatGPT and Claude in automated writing scoring: Insights from the many-facet Rasch model. Education and Information Technologies, 30(18), 25881–25908. https://doi.org/10.1007/s10639-025-13774-4</w:t>
+      </w:r>
+    </w:p>
+    <w:p>
+      <w:pPr>
+        <w:keepLines/>
+        <w:spacing w:after="60" w:line="264"/>
         <w:ind w:left="720" w:hanging="720"/>
         <w:jc w:val="left"/>
       </w:pPr>
@@ -8922,12 +8917,13 @@
           <w:sz w:val="22"/>
           <w:szCs w:val="22"/>
         </w:rPr>
-        <w:t xml:space="preserve">Kane, M. T. (2013). Validating the interpretations and uses of test scores. Journal of Educational Measurement, 50(1), 1–73. https://doi.org/10.1111/jedm.12000</w:t>
-      </w:r>
-    </w:p>
-    <w:p>
-      <w:pPr>
-        <w:spacing w:after="80" w:line="276"/>
+        <w:t xml:space="preserve">Johns, A. M., &amp; Mayes, P. (1990). An analysis of summary protocols of university ESL students. Applied Linguistics, 11(3), 253–271. https://doi.org/10.1093/applin/11.3.253</w:t>
+      </w:r>
+    </w:p>
+    <w:p>
+      <w:pPr>
+        <w:keepLines/>
+        <w:spacing w:after="60" w:line="264"/>
         <w:ind w:left="720" w:hanging="720"/>
         <w:jc w:val="left"/>
       </w:pPr>
@@ -8937,12 +8933,13 @@
           <w:sz w:val="22"/>
           <w:szCs w:val="22"/>
         </w:rPr>
-        <w:t xml:space="preserve">Keck, C. (2006). The use of paraphrase in summary writing: A comparison of L1 and L2 writers. Journal of Second Language Writing, 15(4), 261–278. https://doi.org/10.1016/j.jslw.2006.09.006</w:t>
-      </w:r>
-    </w:p>
-    <w:p>
-      <w:pPr>
-        <w:spacing w:after="80" w:line="276"/>
+        <w:t xml:space="preserve">Kane, M. T. (2013). Validating the interpretations and uses of test scores. Journal of Educational Measurement, 50(1), 1–73. https://doi.org/10.1111/jedm.12000</w:t>
+      </w:r>
+    </w:p>
+    <w:p>
+      <w:pPr>
+        <w:keepLines/>
+        <w:spacing w:after="60" w:line="264"/>
         <w:ind w:left="720" w:hanging="720"/>
         <w:jc w:val="left"/>
       </w:pPr>
@@ -8952,12 +8949,13 @@
           <w:sz w:val="22"/>
           <w:szCs w:val="22"/>
         </w:rPr>
-        <w:t xml:space="preserve">Keck, C. (2014). Copying, paraphrasing, and academic writing development: A re-examination of L1 and L2 summarization practices. Journal of Second Language Writing, 25, 4–22. https://doi.org/10.1016/j.jslw.2014.05.005</w:t>
-      </w:r>
-    </w:p>
-    <w:p>
-      <w:pPr>
-        <w:spacing w:after="80" w:line="276"/>
+        <w:t xml:space="preserve">Keck, C. (2006). The use of paraphrase in summary writing: A comparison of L1 and L2 writers. Journal of Second Language Writing, 15(4), 261–278. https://doi.org/10.1016/j.jslw.2006.09.006</w:t>
+      </w:r>
+    </w:p>
+    <w:p>
+      <w:pPr>
+        <w:keepLines/>
+        <w:spacing w:after="60" w:line="264"/>
         <w:ind w:left="720" w:hanging="720"/>
         <w:jc w:val="left"/>
       </w:pPr>
@@ -8967,12 +8965,13 @@
           <w:sz w:val="22"/>
           <w:szCs w:val="22"/>
         </w:rPr>
-        <w:t xml:space="preserve">Kintsch, W., &amp; van Dijk, T. A. (1978). Toward a model of text comprehension and production. Psychological Review, 85(5), 363–394. https://doi.org/10.1037/0033-295X.85.5.363</w:t>
-      </w:r>
-    </w:p>
-    <w:p>
-      <w:pPr>
-        <w:spacing w:after="80" w:line="276"/>
+        <w:t xml:space="preserve">Keck, C. (2014). Copying, paraphrasing, and academic writing development: A re-examination of L1 and L2 summarization practices. Journal of Second Language Writing, 25, 4–22. https://doi.org/10.1016/j.jslw.2014.05.005</w:t>
+      </w:r>
+    </w:p>
+    <w:p>
+      <w:pPr>
+        <w:keepLines/>
+        <w:spacing w:after="60" w:line="264"/>
         <w:ind w:left="720" w:hanging="720"/>
         <w:jc w:val="left"/>
       </w:pPr>
@@ -8982,12 +8981,13 @@
           <w:sz w:val="22"/>
           <w:szCs w:val="22"/>
         </w:rPr>
-        <w:t xml:space="preserve">Koo, T. K., &amp; Li, M. Y. (2016). A guideline of selecting and reporting intraclass correlation coefficients for reliability research. Journal of Chiropractic Medicine, 15(2), 155–163. https://doi.org/10.1016/j.jcm.2016.02.012</w:t>
-      </w:r>
-    </w:p>
-    <w:p>
-      <w:pPr>
-        <w:spacing w:after="80" w:line="276"/>
+        <w:t xml:space="preserve">Kintsch, W., &amp; van Dijk, T. A. (1978). Toward a model of text comprehension and production. Psychological Review, 85(5), 363–394. https://doi.org/10.1037/0033-295X.85.5.363</w:t>
+      </w:r>
+    </w:p>
+    <w:p>
+      <w:pPr>
+        <w:keepLines/>
+        <w:spacing w:after="60" w:line="264"/>
         <w:ind w:left="720" w:hanging="720"/>
         <w:jc w:val="left"/>
       </w:pPr>
@@ -8997,12 +8997,13 @@
           <w:sz w:val="22"/>
           <w:szCs w:val="22"/>
         </w:rPr>
-        <w:t xml:space="preserve">Liu, T., Ye, L., &amp; Yan, W. (2026). A framework for evaluation of large language models in essay assessment: Reliability, alignment, and causal reasoning. Computers and Education: Artificial Intelligence, 10, Article 100565. https://doi.org/10.1016/j.caeai.2026.100565</w:t>
-      </w:r>
-    </w:p>
-    <w:p>
-      <w:pPr>
-        <w:spacing w:after="80" w:line="276"/>
+        <w:t xml:space="preserve">Koo, T. K., &amp; Li, M. Y. (2016). A guideline of selecting and reporting intraclass correlation coefficients for reliability research. Journal of Chiropractic Medicine, 15(2), 155–163. https://doi.org/10.1016/j.jcm.2016.02.012</w:t>
+      </w:r>
+    </w:p>
+    <w:p>
+      <w:pPr>
+        <w:keepLines/>
+        <w:spacing w:after="60" w:line="264"/>
         <w:ind w:left="720" w:hanging="720"/>
         <w:jc w:val="left"/>
       </w:pPr>
@@ -9012,12 +9013,13 @@
           <w:sz w:val="22"/>
           <w:szCs w:val="22"/>
         </w:rPr>
-        <w:t xml:space="preserve">Lumley, T., &amp; McNamara, T. F. (1995). Rater characteristics and rater bias: Implications for training. Language Testing, 12(1), 54–71. https://doi.org/10.1177/026553229501200104</w:t>
-      </w:r>
-    </w:p>
-    <w:p>
-      <w:pPr>
-        <w:spacing w:after="80" w:line="276"/>
+        <w:t xml:space="preserve">Liu, T., Ye, L., &amp; Yan, W. (2026). A framework for evaluation of large language models in essay assessment: Reliability, alignment, and causal reasoning. Computers and Education: Artificial Intelligence, 10, Article 100565. https://doi.org/10.1016/j.caeai.2026.100565</w:t>
+      </w:r>
+    </w:p>
+    <w:p>
+      <w:pPr>
+        <w:keepLines/>
+        <w:spacing w:after="60" w:line="264"/>
         <w:ind w:left="720" w:hanging="720"/>
         <w:jc w:val="left"/>
       </w:pPr>
@@ -9027,12 +9029,13 @@
           <w:sz w:val="22"/>
           <w:szCs w:val="22"/>
         </w:rPr>
-        <w:t xml:space="preserve">McNamara, T. F. (1996). Measuring second language performance. Longman.</w:t>
-      </w:r>
-    </w:p>
-    <w:p>
-      <w:pPr>
-        <w:spacing w:after="80" w:line="276"/>
+        <w:t xml:space="preserve">Lumley, T., &amp; McNamara, T. F. (1995). Rater characteristics and rater bias: Implications for training. Language Testing, 12(1), 54–71. https://doi.org/10.1177/026553229501200104</w:t>
+      </w:r>
+    </w:p>
+    <w:p>
+      <w:pPr>
+        <w:keepLines/>
+        <w:spacing w:after="60" w:line="264"/>
         <w:ind w:left="720" w:hanging="720"/>
         <w:jc w:val="left"/>
       </w:pPr>
@@ -9042,12 +9045,13 @@
           <w:sz w:val="22"/>
           <w:szCs w:val="22"/>
         </w:rPr>
-        <w:t xml:space="preserve">Menze, D., Radović, S., &amp; Seidel, N. (2026). AI-assisted MCQ creation increases item-writing flaws through automation bias: Evaluation of a workflow of multiple AI agents with teachers. Frontiers in Computer Science, 8, Article 1831250. https://doi.org/10.3389/fcomp.2026.1831250</w:t>
-      </w:r>
-    </w:p>
-    <w:p>
-      <w:pPr>
-        <w:spacing w:after="80" w:line="276"/>
+        <w:t xml:space="preserve">McNamara, T. F. (1996). Measuring second language performance. Longman.</w:t>
+      </w:r>
+    </w:p>
+    <w:p>
+      <w:pPr>
+        <w:keepLines/>
+        <w:spacing w:after="60" w:line="264"/>
         <w:ind w:left="720" w:hanging="720"/>
         <w:jc w:val="left"/>
       </w:pPr>
@@ -9057,12 +9061,13 @@
           <w:sz w:val="22"/>
           <w:szCs w:val="22"/>
         </w:rPr>
-        <w:t xml:space="preserve">Messick, S. (1989). Validity. In R. L. Linn (Ed.), Educational measurement (3rd ed., pp. 13–103). American Council on Education &amp; Macmillan.</w:t>
-      </w:r>
-    </w:p>
-    <w:p>
-      <w:pPr>
-        <w:spacing w:after="80" w:line="276"/>
+        <w:t xml:space="preserve">Menze, D., Radović, S., &amp; Seidel, N. (2026). AI-assisted MCQ creation increases item-writing flaws through automation bias: Evaluation of a workflow of multiple AI agents with teachers. Frontiers in Computer Science, 8, Article 1831250. https://doi.org/10.3389/fcomp.2026.1831250</w:t>
+      </w:r>
+    </w:p>
+    <w:p>
+      <w:pPr>
+        <w:keepLines/>
+        <w:spacing w:after="60" w:line="264"/>
         <w:ind w:left="720" w:hanging="720"/>
         <w:jc w:val="left"/>
       </w:pPr>
@@ -9072,12 +9077,13 @@
           <w:sz w:val="22"/>
           <w:szCs w:val="22"/>
         </w:rPr>
-        <w:t xml:space="preserve">Mizumoto, A., &amp; Eguchi, M. (2023). Exploring the potential of using an AI language model for automated essay scoring. Research Methods in Applied Linguistics, 2(2), Article 100050. https://doi.org/10.1016/j.rmal.2023.100050</w:t>
-      </w:r>
-    </w:p>
-    <w:p>
-      <w:pPr>
-        <w:spacing w:after="80" w:line="276"/>
+        <w:t xml:space="preserve">Messick, S. (1989). Validity. In R. L. Linn (Ed.), Educational measurement (3rd ed., pp. 13–103). American Council on Education &amp; Macmillan.</w:t>
+      </w:r>
+    </w:p>
+    <w:p>
+      <w:pPr>
+        <w:keepLines/>
+        <w:spacing w:after="60" w:line="264"/>
         <w:ind w:left="720" w:hanging="720"/>
         <w:jc w:val="left"/>
       </w:pPr>
@@ -9087,12 +9093,13 @@
           <w:sz w:val="22"/>
           <w:szCs w:val="22"/>
         </w:rPr>
-        <w:t xml:space="preserve">Nosek, B. A., Ebersole, C. R., DeHaven, A. C., &amp; Mellor, D. T. (2018). The preregistration revolution. Proceedings of the National Academy of Sciences, 115(11), 2600–2606. https://doi.org/10.1073/pnas.1708274114</w:t>
-      </w:r>
-    </w:p>
-    <w:p>
-      <w:pPr>
-        <w:spacing w:after="80" w:line="276"/>
+        <w:t xml:space="preserve">Mizumoto, A., &amp; Eguchi, M. (2023). Exploring the potential of using an AI language model for automated essay scoring. Research Methods in Applied Linguistics, 2(2), Article 100050. https://doi.org/10.1016/j.rmal.2023.100050</w:t>
+      </w:r>
+    </w:p>
+    <w:p>
+      <w:pPr>
+        <w:keepLines/>
+        <w:spacing w:after="60" w:line="264"/>
         <w:ind w:left="720" w:hanging="720"/>
         <w:jc w:val="left"/>
       </w:pPr>
@@ -9102,12 +9109,13 @@
           <w:sz w:val="22"/>
           <w:szCs w:val="22"/>
         </w:rPr>
-        <w:t xml:space="preserve">OpenAI. (n.d.-a). Model release notes. OpenAI Help Center. Retrieved October 9, 2026, from https://help.openai.com/en/articles/9624314-model-release-notes</w:t>
-      </w:r>
-    </w:p>
-    <w:p>
-      <w:pPr>
-        <w:spacing w:after="80" w:line="276"/>
+        <w:t xml:space="preserve">Nosek, B. A., Ebersole, C. R., DeHaven, A. C., &amp; Mellor, D. T. (2018). The preregistration revolution. Proceedings of the National Academy of Sciences, 115(11), 2600–2606. https://doi.org/10.1073/pnas.1708274114</w:t>
+      </w:r>
+    </w:p>
+    <w:p>
+      <w:pPr>
+        <w:keepLines/>
+        <w:spacing w:after="60" w:line="264"/>
         <w:ind w:left="720" w:hanging="720"/>
         <w:jc w:val="left"/>
       </w:pPr>
@@ -9117,12 +9125,13 @@
           <w:sz w:val="22"/>
           <w:szCs w:val="22"/>
         </w:rPr>
-        <w:t xml:space="preserve">OpenAI. (n.d.-b). Temporary chat FAQ. OpenAI Help Center. Retrieved October 9, 2026, from https://help.openai.com/en/articles/8914046-temporary-chat-faq</w:t>
-      </w:r>
-    </w:p>
-    <w:p>
-      <w:pPr>
-        <w:spacing w:after="80" w:line="276"/>
+        <w:t xml:space="preserve">OpenAI. (n.d.-a). Model release notes. OpenAI Help Center. Retrieved October 9, 2026, from https://help.openai.com/en/articles/9624314-model-release-notes</w:t>
+      </w:r>
+    </w:p>
+    <w:p>
+      <w:pPr>
+        <w:keepLines/>
+        <w:spacing w:after="60" w:line="264"/>
         <w:ind w:left="720" w:hanging="720"/>
         <w:jc w:val="left"/>
       </w:pPr>
@@ -9132,12 +9141,13 @@
           <w:sz w:val="22"/>
           <w:szCs w:val="22"/>
         </w:rPr>
-        <w:t xml:space="preserve">Ouyang, S., Zhang, J. M., Harman, M., &amp; Wang, M. (2025). An empirical study of the non-determinism of ChatGPT in code generation. ACM Transactions on Software Engineering and Methodology, 34(2), 1–28. https://doi.org/10.1145/3697010</w:t>
-      </w:r>
-    </w:p>
-    <w:p>
-      <w:pPr>
-        <w:spacing w:after="80" w:line="276"/>
+        <w:t xml:space="preserve">OpenAI. (n.d.-b). Temporary chat FAQ. OpenAI Help Center. Retrieved October 9, 2026, from https://help.openai.com/en/articles/8914046-temporary-chat-faq</w:t>
+      </w:r>
+    </w:p>
+    <w:p>
+      <w:pPr>
+        <w:keepLines/>
+        <w:spacing w:after="60" w:line="264"/>
         <w:ind w:left="720" w:hanging="720"/>
         <w:jc w:val="left"/>
       </w:pPr>
@@ -9147,12 +9157,13 @@
           <w:sz w:val="22"/>
           <w:szCs w:val="22"/>
         </w:rPr>
-        <w:t xml:space="preserve">Pack, A., Barrett, A., &amp; Escalante, J. (2024). Large language models and automated essay scoring of English language learner writing: Insights into validity and reliability. Computers and Education: Artificial Intelligence, 6, Article 100234. https://doi.org/10.1016/j.caeai.2024.100234</w:t>
-      </w:r>
-    </w:p>
-    <w:p>
-      <w:pPr>
-        <w:spacing w:after="80" w:line="276"/>
+        <w:t xml:space="preserve">Ouyang, S., Zhang, J. M., Harman, M., &amp; Wang, M. (2025). An empirical study of the non-determinism of ChatGPT in code generation. ACM Transactions on Software Engineering and Methodology, 34(2), 1–28. https://doi.org/10.1145/3697010</w:t>
+      </w:r>
+    </w:p>
+    <w:p>
+      <w:pPr>
+        <w:keepLines/>
+        <w:spacing w:after="60" w:line="264"/>
         <w:ind w:left="720" w:hanging="720"/>
         <w:jc w:val="left"/>
       </w:pPr>
@@ -9162,12 +9173,13 @@
           <w:sz w:val="22"/>
           <w:szCs w:val="22"/>
         </w:rPr>
-        <w:t xml:space="preserve">Parasuraman, R., &amp; Manzey, D. H. (2010). Complacency and bias in human use of automation: An attentional integration. Human Factors, 52(3), 381–410. https://doi.org/10.1177/0018720810376055</w:t>
-      </w:r>
-    </w:p>
-    <w:p>
-      <w:pPr>
-        <w:spacing w:after="80" w:line="276"/>
+        <w:t xml:space="preserve">Pack, A., Barrett, A., &amp; Escalante, J. (2024). Large language models and automated essay scoring of English language learner writing: Insights into validity and reliability. Computers and Education: Artificial Intelligence, 6, Article 100234. https://doi.org/10.1016/j.caeai.2024.100234</w:t>
+      </w:r>
+    </w:p>
+    <w:p>
+      <w:pPr>
+        <w:keepLines/>
+        <w:spacing w:after="60" w:line="264"/>
         <w:ind w:left="720" w:hanging="720"/>
         <w:jc w:val="left"/>
       </w:pPr>
@@ -9177,12 +9189,13 @@
           <w:sz w:val="22"/>
           <w:szCs w:val="22"/>
         </w:rPr>
-        <w:t xml:space="preserve">Pecorari, D. (2003). Good and original: Plagiarism and patchwriting in academic second-language writing. Journal of Second Language Writing, 12(4), 317–345. https://doi.org/10.1016/j.jslw.2003.08.004</w:t>
-      </w:r>
-    </w:p>
-    <w:p>
-      <w:pPr>
-        <w:spacing w:after="80" w:line="276"/>
+        <w:t xml:space="preserve">Parasuraman, R., &amp; Manzey, D. H. (2010). Complacency and bias in human use of automation: An attentional integration. Human Factors, 52(3), 381–410. https://doi.org/10.1177/0018720810376055</w:t>
+      </w:r>
+    </w:p>
+    <w:p>
+      <w:pPr>
+        <w:keepLines/>
+        <w:spacing w:after="60" w:line="264"/>
         <w:ind w:left="720" w:hanging="720"/>
         <w:jc w:val="left"/>
       </w:pPr>
@@ -9192,12 +9205,13 @@
           <w:sz w:val="22"/>
           <w:szCs w:val="22"/>
         </w:rPr>
-        <w:t xml:space="preserve">Powers, D. E., Burstein, J. C., Chodorow, M., Fowles, M. E., &amp; Kukich, K. (2002). Stumping e-rater: Challenging the validity of automated essay scoring. Computers in Human Behavior, 18(2), 103–134. https://doi.org/10.1016/S0747-5632(01)00052-8</w:t>
-      </w:r>
-    </w:p>
-    <w:p>
-      <w:pPr>
-        <w:spacing w:after="80" w:line="276"/>
+        <w:t xml:space="preserve">Pecorari, D. (2003). Good and original: Plagiarism and patchwriting in academic second-language writing. Journal of Second Language Writing, 12(4), 317–345. https://doi.org/10.1016/j.jslw.2003.08.004</w:t>
+      </w:r>
+    </w:p>
+    <w:p>
+      <w:pPr>
+        <w:keepLines/>
+        <w:spacing w:after="60" w:line="264"/>
         <w:ind w:left="720" w:hanging="720"/>
         <w:jc w:val="left"/>
       </w:pPr>
@@ -9207,12 +9221,13 @@
           <w:sz w:val="22"/>
           <w:szCs w:val="22"/>
         </w:rPr>
-        <w:t xml:space="preserve">Sawaki, Y., Ishii, Y., Yamada, H., &amp; Tokunaga, T. (2025). Examining the consistency of instructor versus large language model ratings on summary content: Toward checklist-based feedback provision with second language writers. Language Testing, 42(4), 447–475. https://doi.org/10.1177/02655322251349217</w:t>
-      </w:r>
-    </w:p>
-    <w:p>
-      <w:pPr>
-        <w:spacing w:after="80" w:line="276"/>
+        <w:t xml:space="preserve">Powers, D. E., Burstein, J. C., Chodorow, M., Fowles, M. E., &amp; Kukich, K. (2002). Stumping e-rater: Challenging the validity of automated essay scoring. Computers in Human Behavior, 18(2), 103–134. https://doi.org/10.1016/S0747-5632(01)00052-8</w:t>
+      </w:r>
+    </w:p>
+    <w:p>
+      <w:pPr>
+        <w:keepLines/>
+        <w:spacing w:after="60" w:line="264"/>
         <w:ind w:left="720" w:hanging="720"/>
         <w:jc w:val="left"/>
       </w:pPr>
@@ -9222,12 +9237,13 @@
           <w:sz w:val="22"/>
           <w:szCs w:val="22"/>
         </w:rPr>
-        <w:t xml:space="preserve">Sclar, M., Choi, Y., Tsvetkov, Y., &amp; Suhr, A. (2024). Quantifying language models’ sensitivity to spurious features in prompt design. In The Twelfth International Conference on Learning Representations (ICLR 2024).</w:t>
-      </w:r>
-    </w:p>
-    <w:p>
-      <w:pPr>
-        <w:spacing w:after="80" w:line="276"/>
+        <w:t xml:space="preserve">Sawaki, Y., Ishii, Y., Yamada, H., &amp; Tokunaga, T. (2025). Examining the consistency of instructor versus large language model ratings on summary content: Toward checklist-based feedback provision with second language writers. Language Testing, 42(4), 447–475. https://doi.org/10.1177/02655322251349217</w:t>
+      </w:r>
+    </w:p>
+    <w:p>
+      <w:pPr>
+        <w:keepLines/>
+        <w:spacing w:after="60" w:line="264"/>
         <w:ind w:left="720" w:hanging="720"/>
         <w:jc w:val="left"/>
       </w:pPr>
@@ -9237,12 +9253,13 @@
           <w:sz w:val="22"/>
           <w:szCs w:val="22"/>
         </w:rPr>
-        <w:t xml:space="preserve">Sears, C. (2015). Second language students in English-medium classrooms: A guide for teachers in international schools. Multilingual Matters. https://doi.org/10.21832/9781783093984</w:t>
-      </w:r>
-    </w:p>
-    <w:p>
-      <w:pPr>
-        <w:spacing w:after="80" w:line="276"/>
+        <w:t xml:space="preserve">Sclar, M., Choi, Y., Tsvetkov, Y., &amp; Suhr, A. (2024). Quantifying language models’ sensitivity to spurious features in prompt design. In The Twelfth International Conference on Learning Representations (ICLR 2024).</w:t>
+      </w:r>
+    </w:p>
+    <w:p>
+      <w:pPr>
+        <w:keepLines/>
+        <w:spacing w:after="60" w:line="264"/>
         <w:ind w:left="720" w:hanging="720"/>
         <w:jc w:val="left"/>
       </w:pPr>
@@ -9252,12 +9269,13 @@
           <w:sz w:val="22"/>
           <w:szCs w:val="22"/>
         </w:rPr>
-        <w:t xml:space="preserve">Shi, L. (2004). Textual borrowing in second-language writing. Written Communication, 21(2), 171–200. https://doi.org/10.1177/0741088303262846</w:t>
-      </w:r>
-    </w:p>
-    <w:p>
-      <w:pPr>
-        <w:spacing w:after="80" w:line="276"/>
+        <w:t xml:space="preserve">Sears, C. (2015). Second language students in English-medium classrooms: A guide for teachers in international schools. Multilingual Matters. https://doi.org/10.21832/9781783093984</w:t>
+      </w:r>
+    </w:p>
+    <w:p>
+      <w:pPr>
+        <w:keepLines/>
+        <w:spacing w:after="60" w:line="264"/>
         <w:ind w:left="720" w:hanging="720"/>
         <w:jc w:val="left"/>
       </w:pPr>
@@ -9267,12 +9285,13 @@
           <w:sz w:val="22"/>
           <w:szCs w:val="22"/>
         </w:rPr>
-        <w:t xml:space="preserve">Tate, T. P., Steiss, J., Bailey, D., Graham, S., Moon, Y., Ritchie, D., Tseng, W., &amp; Warschauer, M. (2024). Can AI provide useful holistic essay scoring? Computers and Education: Artificial Intelligence, 7, Article 100255. https://doi.org/10.1016/j.caeai.2024.100255</w:t>
-      </w:r>
-    </w:p>
-    <w:p>
-      <w:pPr>
-        <w:spacing w:after="80" w:line="276"/>
+        <w:t xml:space="preserve">Shi, L. (2004). Textual borrowing in second-language writing. Written Communication, 21(2), 171–200. https://doi.org/10.1177/0741088303262846</w:t>
+      </w:r>
+    </w:p>
+    <w:p>
+      <w:pPr>
+        <w:keepLines/>
+        <w:spacing w:after="60" w:line="264"/>
         <w:ind w:left="720" w:hanging="720"/>
         <w:jc w:val="left"/>
       </w:pPr>
@@ -9282,12 +9301,13 @@
           <w:sz w:val="22"/>
           <w:szCs w:val="22"/>
         </w:rPr>
-        <w:t xml:space="preserve">Williamson, D. M., Xi, X., &amp; Breyer, F. J. (2012). A framework for evaluation and use of automated scoring. Educational Measurement: Issues and Practice, 31(1), 2–13. https://doi.org/10.1111/j.1745-3992.2011.00223.x</w:t>
-      </w:r>
-    </w:p>
-    <w:p>
-      <w:pPr>
-        <w:spacing w:after="80" w:line="276"/>
+        <w:t xml:space="preserve">Tate, T. P., Steiss, J., Bailey, D., Graham, S., Moon, Y., Ritchie, D., Tseng, W., &amp; Warschauer, M. (2024). Can AI provide useful holistic essay scoring? Computers and Education: Artificial Intelligence, 7, Article 100255. https://doi.org/10.1016/j.caeai.2024.100255</w:t>
+      </w:r>
+    </w:p>
+    <w:p>
+      <w:pPr>
+        <w:keepLines/>
+        <w:spacing w:after="60" w:line="264"/>
         <w:ind w:left="720" w:hanging="720"/>
         <w:jc w:val="left"/>
       </w:pPr>
@@ -9297,12 +9317,13 @@
           <w:sz w:val="22"/>
           <w:szCs w:val="22"/>
         </w:rPr>
-        <w:t xml:space="preserve">Wind, S. A., &amp; Peterson, M. E. (2018). A systematic review of methods for evaluating rating quality in language assessment. Language Testing, 35(2), 161–192. https://doi.org/10.1177/0265532216686999</w:t>
-      </w:r>
-    </w:p>
-    <w:p>
-      <w:pPr>
-        <w:spacing w:after="80" w:line="276"/>
+        <w:t xml:space="preserve">Williamson, D. M., Xi, X., &amp; Breyer, F. J. (2012). A framework for evaluation and use of automated scoring. Educational Measurement: Issues and Practice, 31(1), 2–13. https://doi.org/10.1111/j.1745-3992.2011.00223.x</w:t>
+      </w:r>
+    </w:p>
+    <w:p>
+      <w:pPr>
+        <w:keepLines/>
+        <w:spacing w:after="60" w:line="264"/>
         <w:ind w:left="720" w:hanging="720"/>
         <w:jc w:val="left"/>
       </w:pPr>
@@ -9312,12 +9333,13 @@
           <w:sz w:val="22"/>
           <w:szCs w:val="22"/>
         </w:rPr>
-        <w:t xml:space="preserve">Wu, H.-N., Chu, M.-N., &amp; Hsu, J.-L. (2026). Comparing GPT and human raters in essay assessment: Variability, bias, and the potential of LLM-based scoring. Computers and Education Open, 10, Article 100341. https://doi.org/10.1016/j.caeo.2026.100341</w:t>
-      </w:r>
-    </w:p>
-    <w:p>
-      <w:pPr>
-        <w:spacing w:after="80" w:line="276"/>
+        <w:t xml:space="preserve">Wind, S. A., &amp; Peterson, M. E. (2018). A systematic review of methods for evaluating rating quality in language assessment. Language Testing, 35(2), 161–192. https://doi.org/10.1177/0265532216686999</w:t>
+      </w:r>
+    </w:p>
+    <w:p>
+      <w:pPr>
+        <w:keepLines/>
+        <w:spacing w:after="60" w:line="264"/>
         <w:ind w:left="720" w:hanging="720"/>
         <w:jc w:val="left"/>
       </w:pPr>
@@ -9327,12 +9349,13 @@
           <w:sz w:val="22"/>
           <w:szCs w:val="22"/>
         </w:rPr>
-        <w:t xml:space="preserve">Xi, X. (2010). Automated scoring and feedback systems: Where are we and where are we heading? Language Testing, 27(3), 291–300. https://doi.org/10.1177/0265532210364643</w:t>
-      </w:r>
-    </w:p>
-    <w:p>
-      <w:pPr>
-        <w:spacing w:after="80" w:line="276"/>
+        <w:t xml:space="preserve">Wu, H.-N., Chu, M.-N., &amp; Hsu, J.-L. (2026). Comparing GPT and human raters in essay assessment: Variability, bias, and the potential of LLM-based scoring. Computers and Education Open, 10, Article 100341. https://doi.org/10.1016/j.caeo.2026.100341</w:t>
+      </w:r>
+    </w:p>
+    <w:p>
+      <w:pPr>
+        <w:keepLines/>
+        <w:spacing w:after="60" w:line="264"/>
         <w:ind w:left="720" w:hanging="720"/>
         <w:jc w:val="left"/>
       </w:pPr>
@@ -9342,12 +9365,13 @@
           <w:sz w:val="22"/>
           <w:szCs w:val="22"/>
         </w:rPr>
-        <w:t xml:space="preserve">Yancey, K. P., Laflair, G., Verardi, A., &amp; Burstein, J. (2023). Rating short L2 essays on the CEFR scale with GPT-4. In Proceedings of the 18th Workshop on Innovative Use of NLP for Building Educational Applications (BEA 2023) (pp. 576–584). Association for Computational Linguistics. https://doi.org/10.18653/v1/2023.bea-1.49</w:t>
-      </w:r>
-    </w:p>
-    <w:p>
-      <w:pPr>
-        <w:spacing w:after="80" w:line="276"/>
+        <w:t xml:space="preserve">Xi, X. (2010). Automated scoring and feedback systems: Where are we and where are we heading? Language Testing, 27(3), 291–300. https://doi.org/10.1177/0265532210364643</w:t>
+      </w:r>
+    </w:p>
+    <w:p>
+      <w:pPr>
+        <w:keepLines/>
+        <w:spacing w:after="60" w:line="264"/>
         <w:ind w:left="720" w:hanging="720"/>
         <w:jc w:val="left"/>
       </w:pPr>
@@ -9357,13 +9381,32 @@
           <w:sz w:val="22"/>
           <w:szCs w:val="22"/>
         </w:rPr>
+        <w:t xml:space="preserve">Yancey, K. P., Laflair, G., Verardi, A., &amp; Burstein, J. (2023). Rating short L2 essays on the CEFR scale with GPT-4. In Proceedings of the 18th Workshop on Innovative Use of NLP for Building Educational Applications (BEA 2023) (pp. 576–584). Association for Computational Linguistics. https://doi.org/10.18653/v1/2023.bea-1.49</w:t>
+      </w:r>
+    </w:p>
+    <w:p>
+      <w:pPr>
+        <w:keepLines/>
+        <w:spacing w:after="60" w:line="264"/>
+        <w:ind w:left="720" w:hanging="720"/>
+        <w:jc w:val="left"/>
+      </w:pPr>
+      <w:r>
+        <w:rPr>
+          <w:rFonts w:ascii="Times New Roman" w:cs="Times New Roman" w:eastAsia="Times New Roman" w:hAnsi="Times New Roman"/>
+          <w:sz w:val="22"/>
+          <w:szCs w:val="22"/>
+        </w:rPr>
         <w:t xml:space="preserve">Zheng, L., Chiang, W.-L., Sheng, Y., Zhuang, S., Wu, Z., Zhuang, Y., Lin, Z., Li, Z., Li, D., Xing, E. P., Zhang, H., Gonzalez, J. E., &amp; Stoica, I. (2023). Judging LLM-as-a-judge with MT-Bench and Chatbot Arena. In Advances in Neural Information Processing Systems 36 (pp. 46595–46623).</w:t>
       </w:r>
     </w:p>
     <w:sectPr>
+      <w:footerReference w:type="default" r:id="rId7"/>
+      <w:footerReference w:type="first" r:id="rId8"/>
       <w:pgSz w:w="11906" w:h="16838" w:orient="portrait"/>
       <w:pgMar w:top="1440" w:right="1800" w:bottom="1440" w:left="1800" w:header="708" w:footer="708" w:gutter="0"/>
       <w:pgNumType/>
+      <w:titlePg/>
       <w:docGrid w:linePitch="360"/>
     </w:sectPr>
   </w:body>
@@ -9409,6 +9452,33 @@
     </w:p>
   </w:endnote>
 </w:endnotes>
+</file>
+
+<file path=word/footer1.xml><?xml version="1.0" encoding="utf-8"?>
+<w:ftr xmlns:wpc="http://schemas.microsoft.com/office/word/2010/wordprocessingCanvas" xmlns:mc="http://schemas.openxmlformats.org/markup-compatibility/2006" xmlns:o="urn:schemas-microsoft-com:office:office" xmlns:r="http://schemas.openxmlformats.org/officeDocument/2006/relationships" xmlns:m="http://schemas.openxmlformats.org/officeDocument/2006/math" xmlns:v="urn:schemas-microsoft-com:vml" xmlns:wp14="http://schemas.microsoft.com/office/word/2010/wordprocessingDrawing" xmlns:wp="http://schemas.openxmlformats.org/drawingml/2006/wordprocessingDrawing" xmlns:w10="urn:schemas-microsoft-com:office:word" xmlns:w="http://schemas.openxmlformats.org/wordprocessingml/2006/main" xmlns:w14="http://schemas.microsoft.com/office/word/2010/wordml" xmlns:w15="http://schemas.microsoft.com/office/word/2012/wordml" xmlns:wpg="http://schemas.microsoft.com/office/word/2010/wordprocessingGroup" xmlns:wpi="http://schemas.microsoft.com/office/word/2010/wordprocessingInk" xmlns:wne="http://schemas.microsoft.com/office/word/2006/wordml" xmlns:wps="http://schemas.microsoft.com/office/word/2010/wordprocessingShape">
+  <w:p>
+    <w:pPr>
+      <w:jc w:val="center"/>
+    </w:pPr>
+    <w:r>
+      <w:rPr>
+        <w:rFonts w:ascii="Times New Roman" w:cs="Times New Roman" w:eastAsia="Times New Roman" w:hAnsi="Times New Roman"/>
+        <w:sz w:val="20"/>
+        <w:szCs w:val="20"/>
+      </w:rPr>
+      <w:fldChar w:fldCharType="begin"/>
+      <w:instrText xml:space="preserve">PAGE</w:instrText>
+      <w:fldChar w:fldCharType="separate"/>
+      <w:fldChar w:fldCharType="end"/>
+    </w:r>
+  </w:p>
+</w:ftr>
+</file>
+
+<file path=word/footer2.xml><?xml version="1.0" encoding="utf-8"?>
+<w:ftr xmlns:wpc="http://schemas.microsoft.com/office/word/2010/wordprocessingCanvas" xmlns:mc="http://schemas.openxmlformats.org/markup-compatibility/2006" xmlns:o="urn:schemas-microsoft-com:office:office" xmlns:r="http://schemas.openxmlformats.org/officeDocument/2006/relationships" xmlns:m="http://schemas.openxmlformats.org/officeDocument/2006/math" xmlns:v="urn:schemas-microsoft-com:vml" xmlns:wp14="http://schemas.microsoft.com/office/word/2010/wordprocessingDrawing" xmlns:wp="http://schemas.openxmlformats.org/drawingml/2006/wordprocessingDrawing" xmlns:w10="urn:schemas-microsoft-com:office:word" xmlns:w="http://schemas.openxmlformats.org/wordprocessingml/2006/main" xmlns:w14="http://schemas.microsoft.com/office/word/2010/wordml" xmlns:w15="http://schemas.microsoft.com/office/word/2012/wordml" xmlns:wpg="http://schemas.microsoft.com/office/word/2010/wordprocessingGroup" xmlns:wpi="http://schemas.microsoft.com/office/word/2010/wordprocessingInk" xmlns:wne="http://schemas.microsoft.com/office/word/2006/wordml" xmlns:wps="http://schemas.microsoft.com/office/word/2010/wordprocessingShape">
+  <w:p/>
+</w:ftr>
 </file>
 
 <file path=word/footnotes.xml><?xml version="1.0" encoding="utf-8"?>

</xml_diff>

<commit_message>
fix: reserve construct confusion for cross-criterion misuse; remove orphan line
Contradicted claims are coded as evidence errors; construct confusion only
when one criterion is used to justify the other's mark. Drop duplicated
corpus sentence from 4.4 (already in 4.2); note AI scoring is scheduled
in a lighter teaching period.

Co-Authored-By: Claude Opus 5.5 <noreply@anthropic.com>
Claude-Session: https://claude.ai/code/session_01ErbEvZi6kZy9sgfMskNu17
</commit_message>
<xml_diff>
--- a/PhD_Proposal_Final_v7.docx
+++ b/PhD_Proposal_Final_v7.docx
@@ -4121,7 +4121,7 @@
           <w:sz w:val="24"/>
           <w:szCs w:val="24"/>
         </w:rPr>
-        <w:t xml:space="preserve">For each of the 8 selected scripts, a structured evidence record will be compiled before coding begins. For each AI rationale claim (e.g., “the student included point X” or “the summary lacks own-words transformation”), the record documents: (a) the AI’s specific claim; (b) the relevant student wording and corresponding source-passage evidence; (c) the applicable reading or writing level descriptor; and (d) a judgement using four defined categories: supported (the claim is borne out by the student text and source); contradicted (the claim is demonstrably false—for example, crediting a content point the summary does not contain); insufficient explanation (the claim is too general to show the basis of the mark—for example, “clear and fluent” offered alongside a reading mark); and ambiguous (the evidence allows more than one defensible reading). A rationale that omits content evidence is not, on that ground alone, treated as evidence of mis-scoring: a short explanation may accompany a defensible mark. Construct confusion is coded only when the AI explicitly uses a quality to justify the mark for the wrong criterion, or when a claim contradicted by the text underpins the mark. The second human rater will independently examine the 8 selected scripts and their AI rationales, completing the same evidence record, before seeing the candidate’s judgements. The raters’ original independent marks are preserved and not revisited. This procedure grounds the content analysis in verifiable textual evidence rather than impressionistic comparison.</w:t>
+        <w:t xml:space="preserve">For each of the 8 selected scripts, a structured evidence record will be compiled before coding begins. For each AI rationale claim (e.g., “the student included point X” or “the summary lacks own-words transformation”), the record documents: (a) the AI’s specific claim; (b) the relevant student wording and corresponding source-passage evidence; (c) the applicable reading or writing level descriptor; and (d) a judgement using four defined categories: supported (the claim is borne out by the student text and source); contradicted (the claim is demonstrably false—for example, crediting a content point the summary does not contain); insufficient explanation (the claim is too general to show the basis of the mark—for example, “clear and fluent” offered alongside a reading mark); and ambiguous (the evidence allows more than one defensible reading). A rationale that omits content evidence is not, on that ground alone, treated as evidence of mis-scoring: a short explanation may accompany a defensible mark. Contradicted claims are coded under the relevant evidence-error category; for example, crediting a content point the student omitted is a source-fidelity error. Construct confusion is reserved for demonstrable misuse of one criterion to justify the other criterion’s mark—for example, citing fluency as the reason for reading credit. The second human rater will independently examine the 8 selected scripts and their AI rationales, completing the same evidence record, before seeing the candidate’s judgements. The raters’ original independent marks are preserved and not revisited. This procedure grounds the content analysis in verifiable textual evidence rather than impressionistic comparison.</w:t>
       </w:r>
     </w:p>
     <w:p>
@@ -4920,7 +4920,7 @@
                 <w:sz w:val="22"/>
                 <w:szCs w:val="22"/>
               </w:rPr>
-              <w:t xml:space="preserve">AI scoring (both tools interleaved on the same days; three passes per tool within a ten-working-day window, extendable by up to five days); anchor checks; apply model-change decision rule if applicable</w:t>
+              <w:t xml:space="preserve">AI scoring (both tools interleaved on the same days; three passes per tool within a ten-working-day window, extendable by up to five days); anchor checks; apply model-change decision rule if applicable; scheduled in the summer break or another lighter teaching period</w:t>
             </w:r>
           </w:p>
         </w:tc>
@@ -6122,7 +6122,7 @@
           <w:sz w:val="24"/>
           <w:szCs w:val="24"/>
         </w:rPr>
-        <w:t xml:space="preserve">The study is expected to contribute in four ways.</w:t>
+        <w:t xml:space="preserve">The study is expected to contribute in three ways.</w:t>
       </w:r>
     </w:p>
     <w:p>
@@ -6165,20 +6165,6 @@
           <w:szCs w:val="24"/>
         </w:rPr>
         <w:t xml:space="preserve">Practically, it will provide descriptive evidence—consistency statistics, agreement benchmarks, correction-gap profiles and qualitative explanations—to inform further evaluation of consumer AI tools as second markers for this task. The evidence is intended as a foundation for further validation, including studies with teachers, rather than immediate operational adoption.</w:t>
-      </w:r>
-    </w:p>
-    <w:p>
-      <w:pPr>
-        <w:spacing w:after="120" w:line="360"/>
-        <w:jc w:val="both"/>
-      </w:pPr>
-      <w:r>
-        <w:rPr>
-          <w:rFonts w:ascii="Times New Roman" w:cs="Times New Roman" w:eastAsia="Times New Roman" w:hAnsi="Times New Roman"/>
-          <w:sz w:val="24"/>
-          <w:szCs w:val="24"/>
-        </w:rPr>
-        <w:t xml:space="preserve">Finally, the frozen, de-identified corpus will be documented for replication and, subject to ethics and data policy, made available for rescoring by future models.</w:t>
       </w:r>
     </w:p>
     <w:p>

</xml_diff>

<commit_message>
revise: schedule AI scoring in winter break 2028-29
Summers are reserved for supervision visits to Penang, so AI scoring moves
to the two-week winter break (Dec 2028 - Jan 2029) with Newroz 2029 held in
reserve; timeline and 3.5 updated. Keep the publications table on one page.

Co-Authored-By: Claude Opus 5.5 <noreply@anthropic.com>
Claude-Session: https://claude.ai/code/session_01ErbEvZi6kZy9sgfMskNu17
</commit_message>
<xml_diff>
--- a/PhD_Proposal_Final_v7.docx
+++ b/PhD_Proposal_Final_v7.docx
@@ -495,6 +495,7 @@
           </w:tcPr>
           <w:p>
             <w:pPr>
+              <w:keepNext w:val="false"/>
               <w:spacing w:after="60"/>
             </w:pPr>
             <w:r>
@@ -517,6 +518,7 @@
           </w:tcPr>
           <w:p>
             <w:pPr>
+              <w:keepNext w:val="false"/>
               <w:spacing w:after="60"/>
             </w:pPr>
             <w:r>
@@ -539,6 +541,7 @@
           </w:tcPr>
           <w:p>
             <w:pPr>
+              <w:keepNext w:val="false"/>
               <w:spacing w:after="60"/>
             </w:pPr>
             <w:r>
@@ -565,6 +568,8 @@
           </w:tcPr>
           <w:p>
             <w:pPr>
+              <w:keepNext w:val="false"/>
+              <w:keepLines w:val="false"/>
               <w:spacing w:after="60"/>
             </w:pPr>
             <w:r>
@@ -584,6 +589,8 @@
           </w:tcPr>
           <w:p>
             <w:pPr>
+              <w:keepNext w:val="false"/>
+              <w:keepLines w:val="false"/>
               <w:spacing w:after="60"/>
             </w:pPr>
             <w:r>
@@ -603,6 +610,8 @@
           </w:tcPr>
           <w:p>
             <w:pPr>
+              <w:keepNext w:val="false"/>
+              <w:keepLines w:val="false"/>
               <w:spacing w:after="60"/>
             </w:pPr>
             <w:r>
@@ -627,6 +636,8 @@
           </w:tcPr>
           <w:p>
             <w:pPr>
+              <w:keepNext w:val="false"/>
+              <w:keepLines w:val="false"/>
               <w:spacing w:after="60"/>
             </w:pPr>
             <w:r>
@@ -646,6 +657,8 @@
           </w:tcPr>
           <w:p>
             <w:pPr>
+              <w:keepNext w:val="false"/>
+              <w:keepLines w:val="false"/>
               <w:spacing w:after="60"/>
             </w:pPr>
             <w:r>
@@ -665,6 +678,8 @@
           </w:tcPr>
           <w:p>
             <w:pPr>
+              <w:keepNext w:val="false"/>
+              <w:keepLines w:val="false"/>
               <w:spacing w:after="60"/>
             </w:pPr>
             <w:r>
@@ -689,6 +704,8 @@
           </w:tcPr>
           <w:p>
             <w:pPr>
+              <w:keepNext w:val="false"/>
+              <w:keepLines w:val="false"/>
               <w:spacing w:after="60"/>
             </w:pPr>
             <w:r>
@@ -708,6 +725,8 @@
           </w:tcPr>
           <w:p>
             <w:pPr>
+              <w:keepNext w:val="false"/>
+              <w:keepLines w:val="false"/>
               <w:spacing w:after="60"/>
             </w:pPr>
             <w:r>
@@ -727,6 +746,8 @@
           </w:tcPr>
           <w:p>
             <w:pPr>
+              <w:keepNext w:val="false"/>
+              <w:keepLines w:val="false"/>
               <w:spacing w:after="60"/>
             </w:pPr>
             <w:r>
@@ -1482,6 +1503,7 @@
           </w:tcPr>
           <w:p>
             <w:pPr>
+              <w:keepNext w:val="false"/>
               <w:spacing w:after="60"/>
             </w:pPr>
             <w:r>
@@ -1504,6 +1526,7 @@
           </w:tcPr>
           <w:p>
             <w:pPr>
+              <w:keepNext w:val="false"/>
               <w:spacing w:after="60"/>
             </w:pPr>
             <w:r>
@@ -1526,6 +1549,7 @@
           </w:tcPr>
           <w:p>
             <w:pPr>
+              <w:keepNext w:val="false"/>
               <w:spacing w:after="60"/>
             </w:pPr>
             <w:r>
@@ -1548,6 +1572,7 @@
           </w:tcPr>
           <w:p>
             <w:pPr>
+              <w:keepNext w:val="false"/>
               <w:spacing w:after="60"/>
             </w:pPr>
             <w:r>
@@ -1574,6 +1599,8 @@
           </w:tcPr>
           <w:p>
             <w:pPr>
+              <w:keepNext w:val="false"/>
+              <w:keepLines w:val="false"/>
               <w:spacing w:after="60"/>
             </w:pPr>
             <w:r>
@@ -1593,6 +1620,8 @@
           </w:tcPr>
           <w:p>
             <w:pPr>
+              <w:keepNext w:val="false"/>
+              <w:keepLines w:val="false"/>
               <w:spacing w:after="60"/>
             </w:pPr>
             <w:r>
@@ -1612,6 +1641,8 @@
           </w:tcPr>
           <w:p>
             <w:pPr>
+              <w:keepNext w:val="false"/>
+              <w:keepLines w:val="false"/>
               <w:spacing w:after="60"/>
             </w:pPr>
             <w:r>
@@ -1631,6 +1662,8 @@
           </w:tcPr>
           <w:p>
             <w:pPr>
+              <w:keepNext w:val="false"/>
+              <w:keepLines w:val="false"/>
               <w:spacing w:after="60"/>
             </w:pPr>
             <w:r>
@@ -1655,6 +1688,8 @@
           </w:tcPr>
           <w:p>
             <w:pPr>
+              <w:keepNext w:val="false"/>
+              <w:keepLines w:val="false"/>
               <w:spacing w:after="60"/>
             </w:pPr>
             <w:r>
@@ -1674,6 +1709,8 @@
           </w:tcPr>
           <w:p>
             <w:pPr>
+              <w:keepNext w:val="false"/>
+              <w:keepLines w:val="false"/>
               <w:spacing w:after="60"/>
             </w:pPr>
             <w:r>
@@ -1693,6 +1730,8 @@
           </w:tcPr>
           <w:p>
             <w:pPr>
+              <w:keepNext w:val="false"/>
+              <w:keepLines w:val="false"/>
               <w:spacing w:after="60"/>
             </w:pPr>
             <w:r>
@@ -1712,6 +1751,8 @@
           </w:tcPr>
           <w:p>
             <w:pPr>
+              <w:keepNext w:val="false"/>
+              <w:keepLines w:val="false"/>
               <w:spacing w:after="60"/>
             </w:pPr>
             <w:r>
@@ -1736,6 +1777,8 @@
           </w:tcPr>
           <w:p>
             <w:pPr>
+              <w:keepNext w:val="false"/>
+              <w:keepLines w:val="false"/>
               <w:spacing w:after="60"/>
             </w:pPr>
             <w:r>
@@ -1755,6 +1798,8 @@
           </w:tcPr>
           <w:p>
             <w:pPr>
+              <w:keepNext w:val="false"/>
+              <w:keepLines w:val="false"/>
               <w:spacing w:after="60"/>
             </w:pPr>
             <w:r>
@@ -1774,6 +1819,8 @@
           </w:tcPr>
           <w:p>
             <w:pPr>
+              <w:keepNext w:val="false"/>
+              <w:keepLines w:val="false"/>
               <w:spacing w:after="60"/>
             </w:pPr>
             <w:r>
@@ -1793,6 +1840,8 @@
           </w:tcPr>
           <w:p>
             <w:pPr>
+              <w:keepNext w:val="false"/>
+              <w:keepLines w:val="false"/>
               <w:spacing w:after="60"/>
             </w:pPr>
             <w:r>
@@ -1817,6 +1866,8 @@
           </w:tcPr>
           <w:p>
             <w:pPr>
+              <w:keepNext w:val="false"/>
+              <w:keepLines w:val="false"/>
               <w:spacing w:after="60"/>
             </w:pPr>
             <w:r>
@@ -1836,6 +1887,8 @@
           </w:tcPr>
           <w:p>
             <w:pPr>
+              <w:keepNext w:val="false"/>
+              <w:keepLines w:val="false"/>
               <w:spacing w:after="60"/>
             </w:pPr>
             <w:r>
@@ -1855,6 +1908,8 @@
           </w:tcPr>
           <w:p>
             <w:pPr>
+              <w:keepNext w:val="false"/>
+              <w:keepLines w:val="false"/>
               <w:spacing w:after="60"/>
             </w:pPr>
             <w:r>
@@ -1874,6 +1929,8 @@
           </w:tcPr>
           <w:p>
             <w:pPr>
+              <w:keepNext w:val="false"/>
+              <w:keepLines w:val="false"/>
               <w:spacing w:after="60"/>
             </w:pPr>
             <w:r>
@@ -1898,6 +1955,8 @@
           </w:tcPr>
           <w:p>
             <w:pPr>
+              <w:keepNext w:val="false"/>
+              <w:keepLines w:val="false"/>
               <w:spacing w:after="60"/>
             </w:pPr>
             <w:r>
@@ -1917,6 +1976,8 @@
           </w:tcPr>
           <w:p>
             <w:pPr>
+              <w:keepNext w:val="false"/>
+              <w:keepLines w:val="false"/>
               <w:spacing w:after="60"/>
             </w:pPr>
             <w:r>
@@ -1936,6 +1997,8 @@
           </w:tcPr>
           <w:p>
             <w:pPr>
+              <w:keepNext w:val="false"/>
+              <w:keepLines w:val="false"/>
               <w:spacing w:after="60"/>
             </w:pPr>
             <w:r>
@@ -1955,6 +2018,8 @@
           </w:tcPr>
           <w:p>
             <w:pPr>
+              <w:keepNext w:val="false"/>
+              <w:keepLines w:val="false"/>
               <w:spacing w:after="60"/>
             </w:pPr>
             <w:r>
@@ -1979,6 +2044,8 @@
           </w:tcPr>
           <w:p>
             <w:pPr>
+              <w:keepNext w:val="false"/>
+              <w:keepLines w:val="false"/>
               <w:spacing w:after="60"/>
             </w:pPr>
             <w:r>
@@ -1998,6 +2065,8 @@
           </w:tcPr>
           <w:p>
             <w:pPr>
+              <w:keepNext w:val="false"/>
+              <w:keepLines w:val="false"/>
               <w:spacing w:after="60"/>
             </w:pPr>
             <w:r>
@@ -2017,6 +2086,8 @@
           </w:tcPr>
           <w:p>
             <w:pPr>
+              <w:keepNext w:val="false"/>
+              <w:keepLines w:val="false"/>
               <w:spacing w:after="60"/>
             </w:pPr>
             <w:r>
@@ -2036,6 +2107,8 @@
           </w:tcPr>
           <w:p>
             <w:pPr>
+              <w:keepNext w:val="false"/>
+              <w:keepLines w:val="false"/>
               <w:spacing w:after="60"/>
             </w:pPr>
             <w:r>
@@ -2208,6 +2281,7 @@
           </w:tcPr>
           <w:p>
             <w:pPr>
+              <w:keepNext w:val="false"/>
               <w:spacing w:after="60"/>
             </w:pPr>
             <w:r>
@@ -2230,6 +2304,7 @@
           </w:tcPr>
           <w:p>
             <w:pPr>
+              <w:keepNext w:val="false"/>
               <w:spacing w:after="60"/>
             </w:pPr>
             <w:r>
@@ -2252,6 +2327,7 @@
           </w:tcPr>
           <w:p>
             <w:pPr>
+              <w:keepNext w:val="false"/>
               <w:spacing w:after="60"/>
             </w:pPr>
             <w:r>
@@ -2274,6 +2350,7 @@
           </w:tcPr>
           <w:p>
             <w:pPr>
+              <w:keepNext w:val="false"/>
               <w:spacing w:after="60"/>
             </w:pPr>
             <w:r>
@@ -2300,6 +2377,8 @@
           </w:tcPr>
           <w:p>
             <w:pPr>
+              <w:keepNext w:val="false"/>
+              <w:keepLines w:val="false"/>
               <w:spacing w:after="60"/>
             </w:pPr>
             <w:r>
@@ -2319,6 +2398,8 @@
           </w:tcPr>
           <w:p>
             <w:pPr>
+              <w:keepNext w:val="false"/>
+              <w:keepLines w:val="false"/>
               <w:spacing w:after="60"/>
             </w:pPr>
             <w:r>
@@ -2338,6 +2419,8 @@
           </w:tcPr>
           <w:p>
             <w:pPr>
+              <w:keepNext w:val="false"/>
+              <w:keepLines w:val="false"/>
               <w:spacing w:after="60"/>
             </w:pPr>
             <w:r>
@@ -2357,6 +2440,8 @@
           </w:tcPr>
           <w:p>
             <w:pPr>
+              <w:keepNext w:val="false"/>
+              <w:keepLines w:val="false"/>
               <w:spacing w:after="60"/>
             </w:pPr>
             <w:r>
@@ -2381,6 +2466,8 @@
           </w:tcPr>
           <w:p>
             <w:pPr>
+              <w:keepNext w:val="false"/>
+              <w:keepLines w:val="false"/>
               <w:spacing w:after="60"/>
             </w:pPr>
             <w:r>
@@ -2400,6 +2487,8 @@
           </w:tcPr>
           <w:p>
             <w:pPr>
+              <w:keepNext w:val="false"/>
+              <w:keepLines w:val="false"/>
               <w:spacing w:after="60"/>
             </w:pPr>
             <w:r>
@@ -2419,6 +2508,8 @@
           </w:tcPr>
           <w:p>
             <w:pPr>
+              <w:keepNext w:val="false"/>
+              <w:keepLines w:val="false"/>
               <w:spacing w:after="60"/>
             </w:pPr>
             <w:r>
@@ -2438,6 +2529,8 @@
           </w:tcPr>
           <w:p>
             <w:pPr>
+              <w:keepNext w:val="false"/>
+              <w:keepLines w:val="false"/>
               <w:spacing w:after="60"/>
             </w:pPr>
             <w:r>
@@ -2462,6 +2555,8 @@
           </w:tcPr>
           <w:p>
             <w:pPr>
+              <w:keepNext w:val="false"/>
+              <w:keepLines w:val="false"/>
               <w:spacing w:after="60"/>
             </w:pPr>
             <w:r>
@@ -2481,6 +2576,8 @@
           </w:tcPr>
           <w:p>
             <w:pPr>
+              <w:keepNext w:val="false"/>
+              <w:keepLines w:val="false"/>
               <w:spacing w:after="60"/>
             </w:pPr>
             <w:r>
@@ -2500,6 +2597,8 @@
           </w:tcPr>
           <w:p>
             <w:pPr>
+              <w:keepNext w:val="false"/>
+              <w:keepLines w:val="false"/>
               <w:spacing w:after="60"/>
             </w:pPr>
             <w:r>
@@ -2519,6 +2618,8 @@
           </w:tcPr>
           <w:p>
             <w:pPr>
+              <w:keepNext w:val="false"/>
+              <w:keepLines w:val="false"/>
               <w:spacing w:after="60"/>
             </w:pPr>
             <w:r>
@@ -2543,6 +2644,8 @@
           </w:tcPr>
           <w:p>
             <w:pPr>
+              <w:keepNext w:val="false"/>
+              <w:keepLines w:val="false"/>
               <w:spacing w:after="60"/>
             </w:pPr>
             <w:r>
@@ -2562,6 +2665,8 @@
           </w:tcPr>
           <w:p>
             <w:pPr>
+              <w:keepNext w:val="false"/>
+              <w:keepLines w:val="false"/>
               <w:spacing w:after="60"/>
             </w:pPr>
             <w:r>
@@ -2581,6 +2686,8 @@
           </w:tcPr>
           <w:p>
             <w:pPr>
+              <w:keepNext w:val="false"/>
+              <w:keepLines w:val="false"/>
               <w:spacing w:after="60"/>
             </w:pPr>
             <w:r>
@@ -2600,6 +2707,8 @@
           </w:tcPr>
           <w:p>
             <w:pPr>
+              <w:keepNext w:val="false"/>
+              <w:keepLines w:val="false"/>
               <w:spacing w:after="60"/>
             </w:pPr>
             <w:r>
@@ -2624,6 +2733,8 @@
           </w:tcPr>
           <w:p>
             <w:pPr>
+              <w:keepNext w:val="false"/>
+              <w:keepLines w:val="false"/>
               <w:spacing w:after="60"/>
             </w:pPr>
             <w:r>
@@ -2643,6 +2754,8 @@
           </w:tcPr>
           <w:p>
             <w:pPr>
+              <w:keepNext w:val="false"/>
+              <w:keepLines w:val="false"/>
               <w:spacing w:after="60"/>
             </w:pPr>
             <w:r>
@@ -2662,6 +2775,8 @@
           </w:tcPr>
           <w:p>
             <w:pPr>
+              <w:keepNext w:val="false"/>
+              <w:keepLines w:val="false"/>
               <w:spacing w:after="60"/>
             </w:pPr>
             <w:r>
@@ -2681,6 +2796,8 @@
           </w:tcPr>
           <w:p>
             <w:pPr>
+              <w:keepNext w:val="false"/>
+              <w:keepLines w:val="false"/>
               <w:spacing w:after="60"/>
             </w:pPr>
             <w:r>
@@ -3335,7 +3452,7 @@
           <w:sz w:val="24"/>
           <w:szCs w:val="24"/>
         </w:rPr>
-        <w:t xml:space="preserve">Both tools will be used during the same collection days: within each scoring day, scripts will be scored by both ChatGPT and Claude, so that the two tools are exposed to the same temporal window and any model changes during that window are recorded for both. The three passes will run in separate sessions within a ten-working-day window (approximately four to five hours of submissions per day), with no more than two passes scored on the same day for the same tool. A short window limits exposure to service changes while keeping the daily workload practical. The pilot (Section 3.6) will confirm the time per submission; if the main scoring cannot be completed within ten working days, the window will be extended by up to five further working days and the extension logged. Within each pass, the order of scripts and passages will be randomised.</w:t>
+        <w:t xml:space="preserve">Both tools will be used during the same collection days: within each scoring day, scripts will be scored by both ChatGPT and Claude, so that the two tools are exposed to the same temporal window and any model changes during that window are recorded for both. The three passes will run in separate sessions within a ten-working-day window (approximately four to five hours of submissions per day), with no more than two passes scored on the same day for the same tool. A short window limits exposure to service changes while keeping the daily workload practical. Scoring is scheduled for the school winter break (December 2028 to January 2029), when about two weeks are free of teaching; human marks are locked well before this. The pilot (Section 3.6) will confirm the time per submission. If the main scoring cannot be completed within the winter break, the remaining submissions will be completed in the Newroz break that follows; the interruption will be logged and reported as a deviation from the planned window, and the model-change decision rule will apply to any change in the displayed model label. Within each pass, the order of scripts and passages will be randomised.</w:t>
       </w:r>
     </w:p>
     <w:p>
@@ -3438,6 +3555,7 @@
           </w:tcPr>
           <w:p>
             <w:pPr>
+              <w:keepNext w:val="false"/>
               <w:spacing w:after="60"/>
             </w:pPr>
             <w:r>
@@ -3460,6 +3578,7 @@
           </w:tcPr>
           <w:p>
             <w:pPr>
+              <w:keepNext w:val="false"/>
               <w:spacing w:after="60"/>
             </w:pPr>
             <w:r>
@@ -3486,6 +3605,8 @@
           </w:tcPr>
           <w:p>
             <w:pPr>
+              <w:keepNext w:val="false"/>
+              <w:keepLines w:val="false"/>
               <w:spacing w:after="60"/>
             </w:pPr>
             <w:r>
@@ -3505,6 +3626,8 @@
           </w:tcPr>
           <w:p>
             <w:pPr>
+              <w:keepNext w:val="false"/>
+              <w:keepLines w:val="false"/>
               <w:spacing w:after="60"/>
             </w:pPr>
             <w:r>
@@ -3529,6 +3652,8 @@
           </w:tcPr>
           <w:p>
             <w:pPr>
+              <w:keepNext w:val="false"/>
+              <w:keepLines w:val="false"/>
               <w:spacing w:after="60"/>
             </w:pPr>
             <w:r>
@@ -3548,6 +3673,8 @@
           </w:tcPr>
           <w:p>
             <w:pPr>
+              <w:keepNext w:val="false"/>
+              <w:keepLines w:val="false"/>
               <w:spacing w:after="60"/>
             </w:pPr>
             <w:r>
@@ -3572,6 +3699,8 @@
           </w:tcPr>
           <w:p>
             <w:pPr>
+              <w:keepNext w:val="false"/>
+              <w:keepLines w:val="false"/>
               <w:spacing w:after="60"/>
             </w:pPr>
             <w:r>
@@ -3591,6 +3720,8 @@
           </w:tcPr>
           <w:p>
             <w:pPr>
+              <w:keepNext w:val="false"/>
+              <w:keepLines w:val="false"/>
               <w:spacing w:after="60"/>
             </w:pPr>
             <w:r>
@@ -4276,6 +4407,7 @@
           </w:tcPr>
           <w:p>
             <w:pPr>
+              <w:keepNext w:val="false"/>
               <w:spacing w:after="60"/>
             </w:pPr>
             <w:r>
@@ -4298,6 +4430,7 @@
           </w:tcPr>
           <w:p>
             <w:pPr>
+              <w:keepNext w:val="false"/>
               <w:spacing w:after="60"/>
             </w:pPr>
             <w:r>
@@ -4324,6 +4457,8 @@
           </w:tcPr>
           <w:p>
             <w:pPr>
+              <w:keepNext w:val="false"/>
+              <w:keepLines w:val="false"/>
               <w:spacing w:after="60"/>
             </w:pPr>
             <w:r>
@@ -4343,6 +4478,8 @@
           </w:tcPr>
           <w:p>
             <w:pPr>
+              <w:keepNext w:val="false"/>
+              <w:keepLines w:val="false"/>
               <w:spacing w:after="60"/>
             </w:pPr>
             <w:r>
@@ -4367,6 +4504,8 @@
           </w:tcPr>
           <w:p>
             <w:pPr>
+              <w:keepNext w:val="false"/>
+              <w:keepLines w:val="false"/>
               <w:spacing w:after="60"/>
             </w:pPr>
             <w:r>
@@ -4386,6 +4525,8 @@
           </w:tcPr>
           <w:p>
             <w:pPr>
+              <w:keepNext w:val="false"/>
+              <w:keepLines w:val="false"/>
               <w:spacing w:after="60"/>
             </w:pPr>
             <w:r>
@@ -4410,6 +4551,8 @@
           </w:tcPr>
           <w:p>
             <w:pPr>
+              <w:keepNext w:val="false"/>
+              <w:keepLines w:val="false"/>
               <w:spacing w:after="60"/>
             </w:pPr>
             <w:r>
@@ -4429,6 +4572,8 @@
           </w:tcPr>
           <w:p>
             <w:pPr>
+              <w:keepNext w:val="false"/>
+              <w:keepLines w:val="false"/>
               <w:spacing w:after="60"/>
             </w:pPr>
             <w:r>
@@ -4453,6 +4598,8 @@
           </w:tcPr>
           <w:p>
             <w:pPr>
+              <w:keepNext w:val="false"/>
+              <w:keepLines w:val="false"/>
               <w:spacing w:after="60"/>
             </w:pPr>
             <w:r>
@@ -4472,6 +4619,8 @@
           </w:tcPr>
           <w:p>
             <w:pPr>
+              <w:keepNext w:val="false"/>
+              <w:keepLines w:val="false"/>
               <w:spacing w:after="60"/>
             </w:pPr>
             <w:r>
@@ -4673,6 +4822,7 @@
           </w:tcPr>
           <w:p>
             <w:pPr>
+              <w:keepNext w:val="false"/>
               <w:spacing w:after="60"/>
             </w:pPr>
             <w:r>
@@ -4695,6 +4845,7 @@
           </w:tcPr>
           <w:p>
             <w:pPr>
+              <w:keepNext w:val="false"/>
               <w:spacing w:after="60"/>
             </w:pPr>
             <w:r>
@@ -4721,6 +4872,8 @@
           </w:tcPr>
           <w:p>
             <w:pPr>
+              <w:keepNext w:val="false"/>
+              <w:keepLines w:val="false"/>
               <w:spacing w:after="60"/>
             </w:pPr>
             <w:r>
@@ -4740,6 +4893,8 @@
           </w:tcPr>
           <w:p>
             <w:pPr>
+              <w:keepNext w:val="false"/>
+              <w:keepLines w:val="false"/>
               <w:spacing w:after="60"/>
             </w:pPr>
             <w:r>
@@ -4764,6 +4919,8 @@
           </w:tcPr>
           <w:p>
             <w:pPr>
+              <w:keepNext w:val="false"/>
+              <w:keepLines w:val="false"/>
               <w:spacing w:after="60"/>
             </w:pPr>
             <w:r>
@@ -4783,6 +4940,8 @@
           </w:tcPr>
           <w:p>
             <w:pPr>
+              <w:keepNext w:val="false"/>
+              <w:keepLines w:val="false"/>
               <w:spacing w:after="60"/>
             </w:pPr>
             <w:r>
@@ -4807,6 +4966,8 @@
           </w:tcPr>
           <w:p>
             <w:pPr>
+              <w:keepNext w:val="false"/>
+              <w:keepLines w:val="false"/>
               <w:spacing w:after="60"/>
             </w:pPr>
             <w:r>
@@ -4826,6 +4987,8 @@
           </w:tcPr>
           <w:p>
             <w:pPr>
+              <w:keepNext w:val="false"/>
+              <w:keepLines w:val="false"/>
               <w:spacing w:after="60"/>
             </w:pPr>
             <w:r>
@@ -4850,15 +5013,17 @@
           </w:tcPr>
           <w:p>
             <w:pPr>
-              <w:spacing w:after="60"/>
-            </w:pPr>
-            <w:r>
-              <w:rPr>
-                <w:rFonts w:ascii="Times New Roman" w:cs="Times New Roman" w:eastAsia="Times New Roman" w:hAnsi="Times New Roman"/>
-                <w:sz w:val="22"/>
-                <w:szCs w:val="22"/>
-              </w:rPr>
-              <w:t xml:space="preserve">Feb–Apr 2028</w:t>
+              <w:keepNext w:val="false"/>
+              <w:keepLines w:val="false"/>
+              <w:spacing w:after="60"/>
+            </w:pPr>
+            <w:r>
+              <w:rPr>
+                <w:rFonts w:ascii="Times New Roman" w:cs="Times New Roman" w:eastAsia="Times New Roman" w:hAnsi="Times New Roman"/>
+                <w:sz w:val="22"/>
+                <w:szCs w:val="22"/>
+              </w:rPr>
+              <w:t xml:space="preserve">Feb–May 2028</w:t>
             </w:r>
           </w:p>
         </w:tc>
@@ -4869,15 +5034,17 @@
           </w:tcPr>
           <w:p>
             <w:pPr>
-              <w:spacing w:after="60"/>
-            </w:pPr>
-            <w:r>
-              <w:rPr>
-                <w:rFonts w:ascii="Times New Roman" w:cs="Times New Roman" w:eastAsia="Times New Roman" w:hAnsi="Times New Roman"/>
-                <w:sz w:val="22"/>
-                <w:szCs w:val="22"/>
-              </w:rPr>
-              <w:t xml:space="preserve">Students write summaries of both passages in separate sessions (Feb–Mar); anonymiser codes, types and re-checks all scripts before corpus freezing; locked human marking of all scripts</w:t>
+              <w:keepNext w:val="false"/>
+              <w:keepLines w:val="false"/>
+              <w:spacing w:after="60"/>
+            </w:pPr>
+            <w:r>
+              <w:rPr>
+                <w:rFonts w:ascii="Times New Roman" w:cs="Times New Roman" w:eastAsia="Times New Roman" w:hAnsi="Times New Roman"/>
+                <w:sz w:val="22"/>
+                <w:szCs w:val="22"/>
+              </w:rPr>
+              <w:t xml:space="preserve">Students write summaries of both passages in separate sessions (Feb–Mar); anonymiser codes, types and re-checks all scripts before corpus freezing; locked human marking of all scripts (Apr–May)</w:t>
             </w:r>
           </w:p>
         </w:tc>
@@ -4893,15 +5060,17 @@
           </w:tcPr>
           <w:p>
             <w:pPr>
-              <w:spacing w:after="60"/>
-            </w:pPr>
-            <w:r>
-              <w:rPr>
-                <w:rFonts w:ascii="Times New Roman" w:cs="Times New Roman" w:eastAsia="Times New Roman" w:hAnsi="Times New Roman"/>
-                <w:sz w:val="22"/>
-                <w:szCs w:val="22"/>
-              </w:rPr>
-              <w:t xml:space="preserve">May–Aug 2028</w:t>
+              <w:keepNext w:val="false"/>
+              <w:keepLines w:val="false"/>
+              <w:spacing w:after="60"/>
+            </w:pPr>
+            <w:r>
+              <w:rPr>
+                <w:rFonts w:ascii="Times New Roman" w:cs="Times New Roman" w:eastAsia="Times New Roman" w:hAnsi="Times New Roman"/>
+                <w:sz w:val="22"/>
+                <w:szCs w:val="22"/>
+              </w:rPr>
+              <w:t xml:space="preserve">Jun–Nov 2028</w:t>
             </w:r>
           </w:p>
         </w:tc>
@@ -4912,15 +5081,17 @@
           </w:tcPr>
           <w:p>
             <w:pPr>
-              <w:spacing w:after="60"/>
-            </w:pPr>
-            <w:r>
-              <w:rPr>
-                <w:rFonts w:ascii="Times New Roman" w:cs="Times New Roman" w:eastAsia="Times New Roman" w:hAnsi="Times New Roman"/>
-                <w:sz w:val="22"/>
-                <w:szCs w:val="22"/>
-              </w:rPr>
-              <w:t xml:space="preserve">AI scoring (both tools interleaved on the same days; three passes per tool within a ten-working-day window, extendable by up to five days); anchor checks; apply model-change decision rule if applicable; scheduled in the summer break or another lighter teaching period</w:t>
+              <w:keepNext w:val="false"/>
+              <w:keepLines w:val="false"/>
+              <w:spacing w:after="60"/>
+            </w:pPr>
+            <w:r>
+              <w:rPr>
+                <w:rFonts w:ascii="Times New Roman" w:cs="Times New Roman" w:eastAsia="Times New Roman" w:hAnsi="Times New Roman"/>
+                <w:sz w:val="22"/>
+                <w:szCs w:val="22"/>
+              </w:rPr>
+              <w:t xml:space="preserve">Summer supervision visit (Penang); refine literature review; prepare and test analysis scripts on pilot data</w:t>
             </w:r>
           </w:p>
         </w:tc>
@@ -4936,15 +5107,17 @@
           </w:tcPr>
           <w:p>
             <w:pPr>
-              <w:spacing w:after="60"/>
-            </w:pPr>
-            <w:r>
-              <w:rPr>
-                <w:rFonts w:ascii="Times New Roman" w:cs="Times New Roman" w:eastAsia="Times New Roman" w:hAnsi="Times New Roman"/>
-                <w:sz w:val="22"/>
-                <w:szCs w:val="22"/>
-              </w:rPr>
-              <w:t xml:space="preserve">Sep 2028 – Aug 2029</w:t>
+              <w:keepNext w:val="false"/>
+              <w:keepLines w:val="false"/>
+              <w:spacing w:after="60"/>
+            </w:pPr>
+            <w:r>
+              <w:rPr>
+                <w:rFonts w:ascii="Times New Roman" w:cs="Times New Roman" w:eastAsia="Times New Roman" w:hAnsi="Times New Roman"/>
+                <w:sz w:val="22"/>
+                <w:szCs w:val="22"/>
+              </w:rPr>
+              <w:t xml:space="preserve">Dec 2028 – Jan 2029 (winter break)</w:t>
             </w:r>
           </w:p>
         </w:tc>
@@ -4955,15 +5128,17 @@
           </w:tcPr>
           <w:p>
             <w:pPr>
-              <w:spacing w:after="60"/>
-            </w:pPr>
-            <w:r>
-              <w:rPr>
-                <w:rFonts w:ascii="Times New Roman" w:cs="Times New Roman" w:eastAsia="Times New Roman" w:hAnsi="Times New Roman"/>
-                <w:sz w:val="22"/>
-                <w:szCs w:val="22"/>
-              </w:rPr>
-              <w:t xml:space="preserve">Analysis; dual-coded content analysis of high-divergence rationales; Papers 1–2 drafted</w:t>
+              <w:keepNext w:val="false"/>
+              <w:keepLines w:val="false"/>
+              <w:spacing w:after="60"/>
+            </w:pPr>
+            <w:r>
+              <w:rPr>
+                <w:rFonts w:ascii="Times New Roman" w:cs="Times New Roman" w:eastAsia="Times New Roman" w:hAnsi="Times New Roman"/>
+                <w:sz w:val="22"/>
+                <w:szCs w:val="22"/>
+              </w:rPr>
+              <w:t xml:space="preserve">AI scoring (both tools interleaved on the same days; three passes per tool within ten working days); anchor checks; apply model-change decision rule if applicable. Newroz 2029 break held in reserve if scoring cannot be completed</w:t>
             </w:r>
           </w:p>
         </w:tc>
@@ -4979,6 +5154,55 @@
           </w:tcPr>
           <w:p>
             <w:pPr>
+              <w:keepNext w:val="false"/>
+              <w:keepLines w:val="false"/>
+              <w:spacing w:after="60"/>
+            </w:pPr>
+            <w:r>
+              <w:rPr>
+                <w:rFonts w:ascii="Times New Roman" w:cs="Times New Roman" w:eastAsia="Times New Roman" w:hAnsi="Times New Roman"/>
+                <w:sz w:val="22"/>
+                <w:szCs w:val="22"/>
+              </w:rPr>
+              <w:t xml:space="preserve">Jan–Aug 2029</w:t>
+            </w:r>
+          </w:p>
+        </w:tc>
+        <w:tc>
+          <w:tcPr>
+            <w:tcW w:type="dxa" w:w="6800"/>
+            <w:vAlign w:val="center"/>
+          </w:tcPr>
+          <w:p>
+            <w:pPr>
+              <w:keepNext w:val="false"/>
+              <w:keepLines w:val="false"/>
+              <w:spacing w:after="60"/>
+            </w:pPr>
+            <w:r>
+              <w:rPr>
+                <w:rFonts w:ascii="Times New Roman" w:cs="Times New Roman" w:eastAsia="Times New Roman" w:hAnsi="Times New Roman"/>
+                <w:sz w:val="22"/>
+                <w:szCs w:val="22"/>
+              </w:rPr>
+              <w:t xml:space="preserve">Analysis; dual-coded content analysis of selected rationales; Papers 1–2 drafted</w:t>
+            </w:r>
+          </w:p>
+        </w:tc>
+      </w:tr>
+      <w:tr>
+        <w:trPr>
+          <w:cantSplit/>
+        </w:trPr>
+        <w:tc>
+          <w:tcPr>
+            <w:tcW w:type="dxa" w:w="2400"/>
+            <w:vAlign w:val="center"/>
+          </w:tcPr>
+          <w:p>
+            <w:pPr>
+              <w:keepNext w:val="false"/>
+              <w:keepLines w:val="false"/>
               <w:spacing w:after="60"/>
             </w:pPr>
             <w:r>
@@ -4998,6 +5222,8 @@
           </w:tcPr>
           <w:p>
             <w:pPr>
+              <w:keepNext w:val="false"/>
+              <w:keepLines w:val="false"/>
               <w:spacing w:after="60"/>
             </w:pPr>
             <w:r>
@@ -5015,6 +5241,7 @@
     <w:p>
       <w:pPr>
         <w:pStyle w:val="Heading2"/>
+        <w:keepNext/>
         <w:spacing w:after="120" w:before="240" w:line="360"/>
       </w:pPr>
       <w:r>
@@ -5030,6 +5257,7 @@
     </w:p>
     <w:p>
       <w:pPr>
+        <w:keepNext/>
         <w:spacing w:after="120" w:line="360"/>
         <w:jc w:val="both"/>
       </w:pPr>
@@ -5072,6 +5300,7 @@
           </w:tcPr>
           <w:p>
             <w:pPr>
+              <w:keepNext/>
               <w:spacing w:after="60"/>
             </w:pPr>
             <w:r>
@@ -5094,6 +5323,7 @@
           </w:tcPr>
           <w:p>
             <w:pPr>
+              <w:keepNext/>
               <w:spacing w:after="60"/>
             </w:pPr>
             <w:r>
@@ -5116,6 +5346,7 @@
           </w:tcPr>
           <w:p>
             <w:pPr>
+              <w:keepNext/>
               <w:spacing w:after="60"/>
             </w:pPr>
             <w:r>
@@ -5138,6 +5369,7 @@
           </w:tcPr>
           <w:p>
             <w:pPr>
+              <w:keepNext/>
               <w:spacing w:after="60"/>
             </w:pPr>
             <w:r>
@@ -5164,6 +5396,8 @@
           </w:tcPr>
           <w:p>
             <w:pPr>
+              <w:keepNext/>
+              <w:keepLines/>
               <w:spacing w:after="60"/>
             </w:pPr>
             <w:r>
@@ -5183,6 +5417,8 @@
           </w:tcPr>
           <w:p>
             <w:pPr>
+              <w:keepNext/>
+              <w:keepLines/>
               <w:spacing w:after="60"/>
             </w:pPr>
             <w:r>
@@ -5202,6 +5438,8 @@
           </w:tcPr>
           <w:p>
             <w:pPr>
+              <w:keepNext/>
+              <w:keepLines/>
               <w:spacing w:after="60"/>
             </w:pPr>
             <w:r>
@@ -5221,6 +5459,8 @@
           </w:tcPr>
           <w:p>
             <w:pPr>
+              <w:keepNext/>
+              <w:keepLines/>
               <w:spacing w:after="60"/>
             </w:pPr>
             <w:r>
@@ -5245,6 +5485,8 @@
           </w:tcPr>
           <w:p>
             <w:pPr>
+              <w:keepNext/>
+              <w:keepLines/>
               <w:spacing w:after="60"/>
             </w:pPr>
             <w:r>
@@ -5264,6 +5506,8 @@
           </w:tcPr>
           <w:p>
             <w:pPr>
+              <w:keepNext/>
+              <w:keepLines/>
               <w:spacing w:after="60"/>
             </w:pPr>
             <w:r>
@@ -5283,6 +5527,8 @@
           </w:tcPr>
           <w:p>
             <w:pPr>
+              <w:keepNext/>
+              <w:keepLines/>
               <w:spacing w:after="60"/>
             </w:pPr>
             <w:r>
@@ -5302,6 +5548,8 @@
           </w:tcPr>
           <w:p>
             <w:pPr>
+              <w:keepNext/>
+              <w:keepLines/>
               <w:spacing w:after="60"/>
             </w:pPr>
             <w:r>
@@ -5326,6 +5574,8 @@
           </w:tcPr>
           <w:p>
             <w:pPr>
+              <w:keepNext w:val="false"/>
+              <w:keepLines/>
               <w:spacing w:after="60"/>
             </w:pPr>
             <w:r>
@@ -5345,6 +5595,8 @@
           </w:tcPr>
           <w:p>
             <w:pPr>
+              <w:keepNext w:val="false"/>
+              <w:keepLines/>
               <w:spacing w:after="60"/>
             </w:pPr>
             <w:r>
@@ -5364,6 +5616,8 @@
           </w:tcPr>
           <w:p>
             <w:pPr>
+              <w:keepNext w:val="false"/>
+              <w:keepLines/>
               <w:spacing w:after="60"/>
             </w:pPr>
             <w:r>
@@ -5383,6 +5637,8 @@
           </w:tcPr>
           <w:p>
             <w:pPr>
+              <w:keepNext w:val="false"/>
+              <w:keepLines/>
               <w:spacing w:after="60"/>
             </w:pPr>
             <w:r>
@@ -5455,6 +5711,7 @@
           </w:tcPr>
           <w:p>
             <w:pPr>
+              <w:keepNext w:val="false"/>
               <w:spacing w:after="60"/>
             </w:pPr>
             <w:r>
@@ -5477,6 +5734,7 @@
           </w:tcPr>
           <w:p>
             <w:pPr>
+              <w:keepNext w:val="false"/>
               <w:spacing w:after="60"/>
             </w:pPr>
             <w:r>
@@ -5503,6 +5761,8 @@
           </w:tcPr>
           <w:p>
             <w:pPr>
+              <w:keepNext w:val="false"/>
+              <w:keepLines w:val="false"/>
               <w:spacing w:after="60"/>
             </w:pPr>
             <w:r>
@@ -5522,6 +5782,8 @@
           </w:tcPr>
           <w:p>
             <w:pPr>
+              <w:keepNext w:val="false"/>
+              <w:keepLines w:val="false"/>
               <w:spacing w:after="60"/>
             </w:pPr>
             <w:r>
@@ -5546,6 +5808,8 @@
           </w:tcPr>
           <w:p>
             <w:pPr>
+              <w:keepNext w:val="false"/>
+              <w:keepLines w:val="false"/>
               <w:spacing w:after="60"/>
             </w:pPr>
             <w:r>
@@ -5565,6 +5829,8 @@
           </w:tcPr>
           <w:p>
             <w:pPr>
+              <w:keepNext w:val="false"/>
+              <w:keepLines w:val="false"/>
               <w:spacing w:after="60"/>
             </w:pPr>
             <w:r>
@@ -5589,6 +5855,8 @@
           </w:tcPr>
           <w:p>
             <w:pPr>
+              <w:keepNext w:val="false"/>
+              <w:keepLines w:val="false"/>
               <w:spacing w:after="60"/>
             </w:pPr>
             <w:r>
@@ -5608,6 +5876,8 @@
           </w:tcPr>
           <w:p>
             <w:pPr>
+              <w:keepNext w:val="false"/>
+              <w:keepLines w:val="false"/>
               <w:spacing w:after="60"/>
             </w:pPr>
             <w:r>
@@ -5632,6 +5902,8 @@
           </w:tcPr>
           <w:p>
             <w:pPr>
+              <w:keepNext w:val="false"/>
+              <w:keepLines w:val="false"/>
               <w:spacing w:after="60"/>
             </w:pPr>
             <w:r>
@@ -5651,6 +5923,8 @@
           </w:tcPr>
           <w:p>
             <w:pPr>
+              <w:keepNext w:val="false"/>
+              <w:keepLines w:val="false"/>
               <w:spacing w:after="60"/>
             </w:pPr>
             <w:r>
@@ -5675,6 +5949,8 @@
           </w:tcPr>
           <w:p>
             <w:pPr>
+              <w:keepNext w:val="false"/>
+              <w:keepLines w:val="false"/>
               <w:spacing w:after="60"/>
             </w:pPr>
             <w:r>
@@ -5694,6 +5970,8 @@
           </w:tcPr>
           <w:p>
             <w:pPr>
+              <w:keepNext w:val="false"/>
+              <w:keepLines w:val="false"/>
               <w:spacing w:after="60"/>
             </w:pPr>
             <w:r>
@@ -5718,6 +5996,8 @@
           </w:tcPr>
           <w:p>
             <w:pPr>
+              <w:keepNext w:val="false"/>
+              <w:keepLines w:val="false"/>
               <w:spacing w:after="60"/>
             </w:pPr>
             <w:r>
@@ -5737,6 +6017,8 @@
           </w:tcPr>
           <w:p>
             <w:pPr>
+              <w:keepNext w:val="false"/>
+              <w:keepLines w:val="false"/>
               <w:spacing w:after="60"/>
             </w:pPr>
             <w:r>
@@ -5761,6 +6043,8 @@
           </w:tcPr>
           <w:p>
             <w:pPr>
+              <w:keepNext w:val="false"/>
+              <w:keepLines w:val="false"/>
               <w:spacing w:after="60"/>
             </w:pPr>
             <w:r>
@@ -5780,6 +6064,8 @@
           </w:tcPr>
           <w:p>
             <w:pPr>
+              <w:keepNext w:val="false"/>
+              <w:keepLines w:val="false"/>
               <w:spacing w:after="60"/>
             </w:pPr>
             <w:r>
@@ -5804,6 +6090,8 @@
           </w:tcPr>
           <w:p>
             <w:pPr>
+              <w:keepNext w:val="false"/>
+              <w:keepLines w:val="false"/>
               <w:spacing w:after="60"/>
             </w:pPr>
             <w:r>
@@ -5823,6 +6111,8 @@
           </w:tcPr>
           <w:p>
             <w:pPr>
+              <w:keepNext w:val="false"/>
+              <w:keepLines w:val="false"/>
               <w:spacing w:after="60"/>
             </w:pPr>
             <w:r>
@@ -5847,6 +6137,8 @@
           </w:tcPr>
           <w:p>
             <w:pPr>
+              <w:keepNext w:val="false"/>
+              <w:keepLines w:val="false"/>
               <w:spacing w:after="60"/>
             </w:pPr>
             <w:r>
@@ -5866,6 +6158,8 @@
           </w:tcPr>
           <w:p>
             <w:pPr>
+              <w:keepNext w:val="false"/>
+              <w:keepLines w:val="false"/>
               <w:spacing w:after="60"/>
             </w:pPr>
             <w:r>
@@ -5890,6 +6184,8 @@
           </w:tcPr>
           <w:p>
             <w:pPr>
+              <w:keepNext w:val="false"/>
+              <w:keepLines w:val="false"/>
               <w:spacing w:after="60"/>
             </w:pPr>
             <w:r>
@@ -5909,6 +6205,8 @@
           </w:tcPr>
           <w:p>
             <w:pPr>
+              <w:keepNext w:val="false"/>
+              <w:keepLines w:val="false"/>
               <w:spacing w:after="60"/>
             </w:pPr>
             <w:r>
@@ -5933,6 +6231,8 @@
           </w:tcPr>
           <w:p>
             <w:pPr>
+              <w:keepNext w:val="false"/>
+              <w:keepLines w:val="false"/>
               <w:spacing w:after="60"/>
             </w:pPr>
             <w:r>
@@ -5952,6 +6252,8 @@
           </w:tcPr>
           <w:p>
             <w:pPr>
+              <w:keepNext w:val="false"/>
+              <w:keepLines w:val="false"/>
               <w:spacing w:after="60"/>
             </w:pPr>
             <w:r>
@@ -5976,6 +6278,8 @@
           </w:tcPr>
           <w:p>
             <w:pPr>
+              <w:keepNext w:val="false"/>
+              <w:keepLines w:val="false"/>
               <w:spacing w:after="60"/>
             </w:pPr>
             <w:r>
@@ -5995,6 +6299,8 @@
           </w:tcPr>
           <w:p>
             <w:pPr>
+              <w:keepNext w:val="false"/>
+              <w:keepLines w:val="false"/>
               <w:spacing w:after="60"/>
             </w:pPr>
             <w:r>
@@ -6019,6 +6325,8 @@
           </w:tcPr>
           <w:p>
             <w:pPr>
+              <w:keepNext w:val="false"/>
+              <w:keepLines w:val="false"/>
               <w:spacing w:after="60"/>
             </w:pPr>
             <w:r>
@@ -6038,6 +6346,8 @@
           </w:tcPr>
           <w:p>
             <w:pPr>
+              <w:keepNext w:val="false"/>
+              <w:keepLines w:val="false"/>
               <w:spacing w:after="60"/>
             </w:pPr>
             <w:r>
@@ -6062,6 +6372,8 @@
           </w:tcPr>
           <w:p>
             <w:pPr>
+              <w:keepNext w:val="false"/>
+              <w:keepLines w:val="false"/>
               <w:spacing w:after="60"/>
             </w:pPr>
             <w:r>
@@ -6081,6 +6393,8 @@
           </w:tcPr>
           <w:p>
             <w:pPr>
+              <w:keepNext w:val="false"/>
+              <w:keepLines w:val="false"/>
               <w:spacing w:after="60"/>
             </w:pPr>
             <w:r>
@@ -6443,6 +6757,7 @@
           </w:tcPr>
           <w:p>
             <w:pPr>
+              <w:keepNext w:val="false"/>
               <w:spacing w:after="60"/>
             </w:pPr>
             <w:r>
@@ -6465,6 +6780,7 @@
           </w:tcPr>
           <w:p>
             <w:pPr>
+              <w:keepNext w:val="false"/>
               <w:spacing w:after="60"/>
             </w:pPr>
             <w:r>
@@ -6491,6 +6807,8 @@
           </w:tcPr>
           <w:p>
             <w:pPr>
+              <w:keepNext w:val="false"/>
+              <w:keepLines w:val="false"/>
               <w:spacing w:after="60"/>
             </w:pPr>
             <w:r>
@@ -6510,6 +6828,8 @@
           </w:tcPr>
           <w:p>
             <w:pPr>
+              <w:keepNext w:val="false"/>
+              <w:keepLines w:val="false"/>
               <w:spacing w:after="60"/>
             </w:pPr>
             <w:r>
@@ -6534,6 +6854,8 @@
           </w:tcPr>
           <w:p>
             <w:pPr>
+              <w:keepNext w:val="false"/>
+              <w:keepLines w:val="false"/>
               <w:spacing w:after="60"/>
             </w:pPr>
             <w:r>
@@ -6553,6 +6875,8 @@
           </w:tcPr>
           <w:p>
             <w:pPr>
+              <w:keepNext w:val="false"/>
+              <w:keepLines w:val="false"/>
               <w:spacing w:after="60"/>
             </w:pPr>
             <w:r>
@@ -6577,6 +6901,8 @@
           </w:tcPr>
           <w:p>
             <w:pPr>
+              <w:keepNext w:val="false"/>
+              <w:keepLines w:val="false"/>
               <w:spacing w:after="60"/>
             </w:pPr>
             <w:r>
@@ -6596,6 +6922,8 @@
           </w:tcPr>
           <w:p>
             <w:pPr>
+              <w:keepNext w:val="false"/>
+              <w:keepLines w:val="false"/>
               <w:spacing w:after="60"/>
             </w:pPr>
             <w:r>
@@ -6620,6 +6948,8 @@
           </w:tcPr>
           <w:p>
             <w:pPr>
+              <w:keepNext w:val="false"/>
+              <w:keepLines w:val="false"/>
               <w:spacing w:after="60"/>
             </w:pPr>
             <w:r>
@@ -6639,6 +6969,8 @@
           </w:tcPr>
           <w:p>
             <w:pPr>
+              <w:keepNext w:val="false"/>
+              <w:keepLines w:val="false"/>
               <w:spacing w:after="60"/>
             </w:pPr>
             <w:r>
@@ -6663,6 +6995,8 @@
           </w:tcPr>
           <w:p>
             <w:pPr>
+              <w:keepNext w:val="false"/>
+              <w:keepLines w:val="false"/>
               <w:spacing w:after="60"/>
             </w:pPr>
             <w:r>
@@ -6682,6 +7016,8 @@
           </w:tcPr>
           <w:p>
             <w:pPr>
+              <w:keepNext w:val="false"/>
+              <w:keepLines w:val="false"/>
               <w:spacing w:after="60"/>
             </w:pPr>
             <w:r>
@@ -6706,6 +7042,8 @@
           </w:tcPr>
           <w:p>
             <w:pPr>
+              <w:keepNext w:val="false"/>
+              <w:keepLines w:val="false"/>
               <w:spacing w:after="60"/>
             </w:pPr>
             <w:r>
@@ -6725,6 +7063,8 @@
           </w:tcPr>
           <w:p>
             <w:pPr>
+              <w:keepNext w:val="false"/>
+              <w:keepLines w:val="false"/>
               <w:spacing w:after="60"/>
             </w:pPr>
             <w:r>
@@ -6749,6 +7089,8 @@
           </w:tcPr>
           <w:p>
             <w:pPr>
+              <w:keepNext w:val="false"/>
+              <w:keepLines w:val="false"/>
               <w:spacing w:after="60"/>
             </w:pPr>
             <w:r>
@@ -6768,6 +7110,8 @@
           </w:tcPr>
           <w:p>
             <w:pPr>
+              <w:keepNext w:val="false"/>
+              <w:keepLines w:val="false"/>
               <w:spacing w:after="60"/>
             </w:pPr>
             <w:r>
@@ -6792,6 +7136,8 @@
           </w:tcPr>
           <w:p>
             <w:pPr>
+              <w:keepNext w:val="false"/>
+              <w:keepLines w:val="false"/>
               <w:spacing w:after="60"/>
             </w:pPr>
             <w:r>
@@ -6811,6 +7157,8 @@
           </w:tcPr>
           <w:p>
             <w:pPr>
+              <w:keepNext w:val="false"/>
+              <w:keepLines w:val="false"/>
               <w:spacing w:after="60"/>
             </w:pPr>
             <w:r>
@@ -6835,6 +7183,8 @@
           </w:tcPr>
           <w:p>
             <w:pPr>
+              <w:keepNext w:val="false"/>
+              <w:keepLines w:val="false"/>
               <w:spacing w:after="60"/>
             </w:pPr>
             <w:r>
@@ -6854,6 +7204,8 @@
           </w:tcPr>
           <w:p>
             <w:pPr>
+              <w:keepNext w:val="false"/>
+              <w:keepLines w:val="false"/>
               <w:spacing w:after="60"/>
             </w:pPr>
             <w:r>
@@ -6878,6 +7230,8 @@
           </w:tcPr>
           <w:p>
             <w:pPr>
+              <w:keepNext w:val="false"/>
+              <w:keepLines w:val="false"/>
               <w:spacing w:after="60"/>
             </w:pPr>
             <w:r>
@@ -6897,6 +7251,8 @@
           </w:tcPr>
           <w:p>
             <w:pPr>
+              <w:keepNext w:val="false"/>
+              <w:keepLines w:val="false"/>
               <w:spacing w:after="60"/>
             </w:pPr>
             <w:r>
@@ -6921,6 +7277,8 @@
           </w:tcPr>
           <w:p>
             <w:pPr>
+              <w:keepNext w:val="false"/>
+              <w:keepLines w:val="false"/>
               <w:spacing w:after="60"/>
             </w:pPr>
             <w:r>
@@ -6940,6 +7298,8 @@
           </w:tcPr>
           <w:p>
             <w:pPr>
+              <w:keepNext w:val="false"/>
+              <w:keepLines w:val="false"/>
               <w:spacing w:after="60"/>
             </w:pPr>
             <w:r>
@@ -6964,6 +7324,8 @@
           </w:tcPr>
           <w:p>
             <w:pPr>
+              <w:keepNext w:val="false"/>
+              <w:keepLines w:val="false"/>
               <w:spacing w:after="60"/>
             </w:pPr>
             <w:r>
@@ -6983,6 +7345,8 @@
           </w:tcPr>
           <w:p>
             <w:pPr>
+              <w:keepNext w:val="false"/>
+              <w:keepLines w:val="false"/>
               <w:spacing w:after="60"/>
             </w:pPr>
             <w:r>
@@ -7007,6 +7371,8 @@
           </w:tcPr>
           <w:p>
             <w:pPr>
+              <w:keepNext w:val="false"/>
+              <w:keepLines w:val="false"/>
               <w:spacing w:after="60"/>
             </w:pPr>
             <w:r>
@@ -7026,6 +7392,8 @@
           </w:tcPr>
           <w:p>
             <w:pPr>
+              <w:keepNext w:val="false"/>
+              <w:keepLines w:val="false"/>
               <w:spacing w:after="60"/>
             </w:pPr>
             <w:r>
@@ -7050,6 +7418,8 @@
           </w:tcPr>
           <w:p>
             <w:pPr>
+              <w:keepNext w:val="false"/>
+              <w:keepLines w:val="false"/>
               <w:spacing w:after="60"/>
             </w:pPr>
             <w:r>
@@ -7069,6 +7439,8 @@
           </w:tcPr>
           <w:p>
             <w:pPr>
+              <w:keepNext w:val="false"/>
+              <w:keepLines w:val="false"/>
               <w:spacing w:after="60"/>
             </w:pPr>
             <w:r>
@@ -7093,6 +7465,8 @@
           </w:tcPr>
           <w:p>
             <w:pPr>
+              <w:keepNext w:val="false"/>
+              <w:keepLines w:val="false"/>
               <w:spacing w:after="60"/>
             </w:pPr>
             <w:r>
@@ -7112,6 +7486,8 @@
           </w:tcPr>
           <w:p>
             <w:pPr>
+              <w:keepNext w:val="false"/>
+              <w:keepLines w:val="false"/>
               <w:spacing w:after="60"/>
             </w:pPr>
             <w:r>
@@ -7136,6 +7512,8 @@
           </w:tcPr>
           <w:p>
             <w:pPr>
+              <w:keepNext w:val="false"/>
+              <w:keepLines w:val="false"/>
               <w:spacing w:after="60"/>
             </w:pPr>
             <w:r>
@@ -7155,6 +7533,8 @@
           </w:tcPr>
           <w:p>
             <w:pPr>
+              <w:keepNext w:val="false"/>
+              <w:keepLines w:val="false"/>
               <w:spacing w:after="60"/>
             </w:pPr>
             <w:r>
@@ -7179,6 +7559,8 @@
           </w:tcPr>
           <w:p>
             <w:pPr>
+              <w:keepNext w:val="false"/>
+              <w:keepLines w:val="false"/>
               <w:spacing w:after="60"/>
             </w:pPr>
             <w:r>
@@ -7198,6 +7580,8 @@
           </w:tcPr>
           <w:p>
             <w:pPr>
+              <w:keepNext w:val="false"/>
+              <w:keepLines w:val="false"/>
               <w:spacing w:after="60"/>
             </w:pPr>
             <w:r>
@@ -7222,6 +7606,8 @@
           </w:tcPr>
           <w:p>
             <w:pPr>
+              <w:keepNext w:val="false"/>
+              <w:keepLines w:val="false"/>
               <w:spacing w:after="60"/>
             </w:pPr>
             <w:r>
@@ -7241,6 +7627,8 @@
           </w:tcPr>
           <w:p>
             <w:pPr>
+              <w:keepNext w:val="false"/>
+              <w:keepLines w:val="false"/>
               <w:spacing w:after="60"/>
             </w:pPr>
             <w:r>
@@ -7326,6 +7714,7 @@
           </w:tcPr>
           <w:p>
             <w:pPr>
+              <w:keepNext w:val="false"/>
               <w:spacing w:after="60"/>
             </w:pPr>
             <w:r>
@@ -7348,6 +7737,7 @@
           </w:tcPr>
           <w:p>
             <w:pPr>
+              <w:keepNext w:val="false"/>
               <w:spacing w:after="60"/>
             </w:pPr>
             <w:r>
@@ -7370,6 +7760,7 @@
           </w:tcPr>
           <w:p>
             <w:pPr>
+              <w:keepNext w:val="false"/>
               <w:spacing w:after="60"/>
             </w:pPr>
             <w:r>
@@ -7392,6 +7783,7 @@
           </w:tcPr>
           <w:p>
             <w:pPr>
+              <w:keepNext w:val="false"/>
               <w:spacing w:after="60"/>
             </w:pPr>
             <w:r>
@@ -7418,6 +7810,8 @@
           </w:tcPr>
           <w:p>
             <w:pPr>
+              <w:keepNext w:val="false"/>
+              <w:keepLines w:val="false"/>
               <w:spacing w:after="60"/>
             </w:pPr>
             <w:r>
@@ -7447,6 +7841,8 @@
           </w:tcPr>
           <w:p>
             <w:pPr>
+              <w:keepNext w:val="false"/>
+              <w:keepLines w:val="false"/>
               <w:spacing w:after="60"/>
             </w:pPr>
             <w:r>
@@ -7466,6 +7862,8 @@
           </w:tcPr>
           <w:p>
             <w:pPr>
+              <w:keepNext w:val="false"/>
+              <w:keepLines w:val="false"/>
               <w:spacing w:after="60"/>
             </w:pPr>
             <w:r>
@@ -7485,6 +7883,8 @@
           </w:tcPr>
           <w:p>
             <w:pPr>
+              <w:keepNext w:val="false"/>
+              <w:keepLines w:val="false"/>
               <w:spacing w:after="60"/>
             </w:pPr>
             <w:r>
@@ -7509,6 +7909,8 @@
           </w:tcPr>
           <w:p>
             <w:pPr>
+              <w:keepNext w:val="false"/>
+              <w:keepLines w:val="false"/>
               <w:spacing w:after="60"/>
             </w:pPr>
             <w:r>
@@ -7538,6 +7940,8 @@
           </w:tcPr>
           <w:p>
             <w:pPr>
+              <w:keepNext w:val="false"/>
+              <w:keepLines w:val="false"/>
               <w:spacing w:after="60"/>
             </w:pPr>
             <w:r>
@@ -7557,6 +7961,8 @@
           </w:tcPr>
           <w:p>
             <w:pPr>
+              <w:keepNext w:val="false"/>
+              <w:keepLines w:val="false"/>
               <w:spacing w:after="60"/>
             </w:pPr>
             <w:r>
@@ -7576,6 +7982,8 @@
           </w:tcPr>
           <w:p>
             <w:pPr>
+              <w:keepNext w:val="false"/>
+              <w:keepLines w:val="false"/>
               <w:spacing w:after="60"/>
             </w:pPr>
             <w:r>
@@ -7600,6 +8008,8 @@
           </w:tcPr>
           <w:p>
             <w:pPr>
+              <w:keepNext w:val="false"/>
+              <w:keepLines w:val="false"/>
               <w:spacing w:after="60"/>
             </w:pPr>
             <w:r>
@@ -7629,6 +8039,8 @@
           </w:tcPr>
           <w:p>
             <w:pPr>
+              <w:keepNext w:val="false"/>
+              <w:keepLines w:val="false"/>
               <w:spacing w:after="60"/>
             </w:pPr>
             <w:r>
@@ -7648,6 +8060,8 @@
           </w:tcPr>
           <w:p>
             <w:pPr>
+              <w:keepNext w:val="false"/>
+              <w:keepLines w:val="false"/>
               <w:spacing w:after="60"/>
             </w:pPr>
             <w:r>
@@ -7667,6 +8081,8 @@
           </w:tcPr>
           <w:p>
             <w:pPr>
+              <w:keepNext w:val="false"/>
+              <w:keepLines w:val="false"/>
               <w:spacing w:after="60"/>
             </w:pPr>
             <w:r>
@@ -7691,6 +8107,8 @@
           </w:tcPr>
           <w:p>
             <w:pPr>
+              <w:keepNext w:val="false"/>
+              <w:keepLines w:val="false"/>
               <w:spacing w:after="60"/>
             </w:pPr>
             <w:r>
@@ -7720,6 +8138,8 @@
           </w:tcPr>
           <w:p>
             <w:pPr>
+              <w:keepNext w:val="false"/>
+              <w:keepLines w:val="false"/>
               <w:spacing w:after="60"/>
             </w:pPr>
             <w:r>
@@ -7739,6 +8159,8 @@
           </w:tcPr>
           <w:p>
             <w:pPr>
+              <w:keepNext w:val="false"/>
+              <w:keepLines w:val="false"/>
               <w:spacing w:after="60"/>
             </w:pPr>
             <w:r>
@@ -7758,6 +8180,8 @@
           </w:tcPr>
           <w:p>
             <w:pPr>
+              <w:keepNext w:val="false"/>
+              <w:keepLines w:val="false"/>
               <w:spacing w:after="60"/>
             </w:pPr>
             <w:r>
@@ -7782,6 +8206,8 @@
           </w:tcPr>
           <w:p>
             <w:pPr>
+              <w:keepNext w:val="false"/>
+              <w:keepLines w:val="false"/>
               <w:spacing w:after="60"/>
             </w:pPr>
             <w:r>
@@ -7811,6 +8237,8 @@
           </w:tcPr>
           <w:p>
             <w:pPr>
+              <w:keepNext w:val="false"/>
+              <w:keepLines w:val="false"/>
               <w:spacing w:after="60"/>
             </w:pPr>
             <w:r>
@@ -7830,6 +8258,8 @@
           </w:tcPr>
           <w:p>
             <w:pPr>
+              <w:keepNext w:val="false"/>
+              <w:keepLines w:val="false"/>
               <w:spacing w:after="60"/>
             </w:pPr>
             <w:r>
@@ -7849,6 +8279,8 @@
           </w:tcPr>
           <w:p>
             <w:pPr>
+              <w:keepNext w:val="false"/>
+              <w:keepLines w:val="false"/>
               <w:spacing w:after="60"/>
             </w:pPr>
             <w:r>
@@ -7873,6 +8305,8 @@
           </w:tcPr>
           <w:p>
             <w:pPr>
+              <w:keepNext w:val="false"/>
+              <w:keepLines w:val="false"/>
               <w:spacing w:after="60"/>
             </w:pPr>
             <w:r>
@@ -7902,6 +8336,8 @@
           </w:tcPr>
           <w:p>
             <w:pPr>
+              <w:keepNext w:val="false"/>
+              <w:keepLines w:val="false"/>
               <w:spacing w:after="60"/>
             </w:pPr>
             <w:r>
@@ -7921,6 +8357,8 @@
           </w:tcPr>
           <w:p>
             <w:pPr>
+              <w:keepNext w:val="false"/>
+              <w:keepLines w:val="false"/>
               <w:spacing w:after="60"/>
             </w:pPr>
             <w:r>
@@ -7940,6 +8378,8 @@
           </w:tcPr>
           <w:p>
             <w:pPr>
+              <w:keepNext w:val="false"/>
+              <w:keepLines w:val="false"/>
               <w:spacing w:after="60"/>
             </w:pPr>
             <w:r>
@@ -7964,6 +8404,8 @@
           </w:tcPr>
           <w:p>
             <w:pPr>
+              <w:keepNext w:val="false"/>
+              <w:keepLines w:val="false"/>
               <w:spacing w:after="60"/>
             </w:pPr>
             <w:r>
@@ -7993,6 +8435,8 @@
           </w:tcPr>
           <w:p>
             <w:pPr>
+              <w:keepNext w:val="false"/>
+              <w:keepLines w:val="false"/>
               <w:spacing w:after="60"/>
             </w:pPr>
             <w:r>
@@ -8012,6 +8456,8 @@
           </w:tcPr>
           <w:p>
             <w:pPr>
+              <w:keepNext w:val="false"/>
+              <w:keepLines w:val="false"/>
               <w:spacing w:after="60"/>
             </w:pPr>
             <w:r>
@@ -8031,6 +8477,8 @@
           </w:tcPr>
           <w:p>
             <w:pPr>
+              <w:keepNext w:val="false"/>
+              <w:keepLines w:val="false"/>
               <w:spacing w:after="60"/>
             </w:pPr>
             <w:r>
@@ -8055,6 +8503,8 @@
           </w:tcPr>
           <w:p>
             <w:pPr>
+              <w:keepNext w:val="false"/>
+              <w:keepLines w:val="false"/>
               <w:spacing w:after="60"/>
             </w:pPr>
             <w:r>
@@ -8084,6 +8534,8 @@
           </w:tcPr>
           <w:p>
             <w:pPr>
+              <w:keepNext w:val="false"/>
+              <w:keepLines w:val="false"/>
               <w:spacing w:after="60"/>
             </w:pPr>
             <w:r>
@@ -8103,6 +8555,8 @@
           </w:tcPr>
           <w:p>
             <w:pPr>
+              <w:keepNext w:val="false"/>
+              <w:keepLines w:val="false"/>
               <w:spacing w:after="60"/>
             </w:pPr>
             <w:r>
@@ -8122,6 +8576,8 @@
           </w:tcPr>
           <w:p>
             <w:pPr>
+              <w:keepNext w:val="false"/>
+              <w:keepLines w:val="false"/>
               <w:spacing w:after="60"/>
             </w:pPr>
             <w:r>
@@ -8146,6 +8602,8 @@
           </w:tcPr>
           <w:p>
             <w:pPr>
+              <w:keepNext w:val="false"/>
+              <w:keepLines w:val="false"/>
               <w:spacing w:after="60"/>
             </w:pPr>
             <w:r>
@@ -8175,6 +8633,8 @@
           </w:tcPr>
           <w:p>
             <w:pPr>
+              <w:keepNext w:val="false"/>
+              <w:keepLines w:val="false"/>
               <w:spacing w:after="60"/>
             </w:pPr>
             <w:r>
@@ -8194,6 +8654,8 @@
           </w:tcPr>
           <w:p>
             <w:pPr>
+              <w:keepNext w:val="false"/>
+              <w:keepLines w:val="false"/>
               <w:spacing w:after="60"/>
             </w:pPr>
             <w:r>
@@ -8213,6 +8675,8 @@
           </w:tcPr>
           <w:p>
             <w:pPr>
+              <w:keepNext w:val="false"/>
+              <w:keepLines w:val="false"/>
               <w:spacing w:after="60"/>
             </w:pPr>
             <w:r>
@@ -8237,6 +8701,8 @@
           </w:tcPr>
           <w:p>
             <w:pPr>
+              <w:keepNext w:val="false"/>
+              <w:keepLines w:val="false"/>
               <w:spacing w:after="60"/>
             </w:pPr>
             <w:r>
@@ -8266,6 +8732,8 @@
           </w:tcPr>
           <w:p>
             <w:pPr>
+              <w:keepNext w:val="false"/>
+              <w:keepLines w:val="false"/>
               <w:spacing w:after="60"/>
             </w:pPr>
             <w:r>
@@ -8285,6 +8753,8 @@
           </w:tcPr>
           <w:p>
             <w:pPr>
+              <w:keepNext w:val="false"/>
+              <w:keepLines w:val="false"/>
               <w:spacing w:after="60"/>
             </w:pPr>
             <w:r>
@@ -8304,6 +8774,8 @@
           </w:tcPr>
           <w:p>
             <w:pPr>
+              <w:keepNext w:val="false"/>
+              <w:keepLines w:val="false"/>
               <w:spacing w:after="60"/>
             </w:pPr>
             <w:r>
@@ -8328,6 +8800,8 @@
           </w:tcPr>
           <w:p>
             <w:pPr>
+              <w:keepNext w:val="false"/>
+              <w:keepLines w:val="false"/>
               <w:spacing w:after="60"/>
             </w:pPr>
             <w:r>
@@ -8357,6 +8831,8 @@
           </w:tcPr>
           <w:p>
             <w:pPr>
+              <w:keepNext w:val="false"/>
+              <w:keepLines w:val="false"/>
               <w:spacing w:after="60"/>
             </w:pPr>
             <w:r>
@@ -8376,6 +8852,8 @@
           </w:tcPr>
           <w:p>
             <w:pPr>
+              <w:keepNext w:val="false"/>
+              <w:keepLines w:val="false"/>
               <w:spacing w:after="60"/>
             </w:pPr>
             <w:r>
@@ -8395,6 +8873,8 @@
           </w:tcPr>
           <w:p>
             <w:pPr>
+              <w:keepNext w:val="false"/>
+              <w:keepLines w:val="false"/>
               <w:spacing w:after="60"/>
             </w:pPr>
             <w:r>

</xml_diff>

<commit_message>
revise: Newroz as full alternative scoring window, not a continuation
All three main passes must fall within one bounded window; interrupted
winter submissions become preliminary and the full exercise is rerun in
Newroz 2029 if needed.

Co-Authored-By: Claude Opus 5.5 <noreply@anthropic.com>
Claude-Session: https://claude.ai/code/session_01ErbEvZi6kZy9sgfMskNu17
</commit_message>
<xml_diff>
--- a/PhD_Proposal_Final_v7.docx
+++ b/PhD_Proposal_Final_v7.docx
@@ -3452,7 +3452,7 @@
           <w:sz w:val="24"/>
           <w:szCs w:val="24"/>
         </w:rPr>
-        <w:t xml:space="preserve">Both tools will be used during the same collection days: within each scoring day, scripts will be scored by both ChatGPT and Claude, so that the two tools are exposed to the same temporal window and any model changes during that window are recorded for both. The three passes will run in separate sessions within a ten-working-day window (approximately four to five hours of submissions per day), with no more than two passes scored on the same day for the same tool. A short window limits exposure to service changes while keeping the daily workload practical. Scoring is scheduled for the school winter break (December 2028 to January 2029), when about two weeks are free of teaching; human marks are locked well before this. The pilot (Section 3.6) will confirm the time per submission. If the main scoring cannot be completed within the winter break, the remaining submissions will be completed in the Newroz break that follows; the interruption will be logged and reported as a deviation from the planned window, and the model-change decision rule will apply to any change in the displayed model label. Within each pass, the order of scripts and passages will be randomised.</w:t>
+        <w:t xml:space="preserve">Both tools will be used during the same collection days: within each scoring day, scripts will be scored by both ChatGPT and Claude, so that the two tools are exposed to the same temporal window and any model changes during that window are recorded for both. The three passes will run in separate sessions within a ten-working-day window (approximately four to five hours of submissions per day), with no more than two passes scored on the same day for the same tool. A short window limits exposure to service changes while keeping the daily workload practical. Scoring is scheduled for the school winter break (December 2028 to January 2029), when about two weeks are free of teaching; human marks are locked well before this. The pilot (Section 3.6) will be used to judge whether completing all three passes within the winter break is realistic. All three main passes must be completed within a single bounded window, so that short-term repeatability is not mixed with changes in the AI service over several months. If winter scoring is substantially interrupted, the winter submissions will be treated as preliminary and excluded from the main analysis, and all three main passes will be conducted afresh within the following Newroz break (March 2029) as an alternative window; the switch will be reported. Within each pass, the order of scripts and passages will be randomised.</w:t>
       </w:r>
     </w:p>
     <w:p>
@@ -5138,7 +5138,7 @@
                 <w:sz w:val="22"/>
                 <w:szCs w:val="22"/>
               </w:rPr>
-              <w:t xml:space="preserve">AI scoring (both tools interleaved on the same days; three passes per tool within ten working days); anchor checks; apply model-change decision rule if applicable. Newroz 2029 break held in reserve if scoring cannot be completed</w:t>
+              <w:t xml:space="preserve">AI scoring (both tools interleaved on the same days; three passes per tool within ten working days); anchor checks; apply model-change decision rule if applicable. Newroz 2029 break (March) reserved as an alternative window for the entire scoring exercise if winter scoring is substantially interrupted</w:t>
             </w:r>
           </w:p>
         </w:tc>

</xml_diff>

<commit_message>
revise: remove Newroz contingency; AI scoring in winter break only
Co-Authored-By: Claude Opus 5.5 <noreply@anthropic.com>
Claude-Session: https://claude.ai/code/session_01ErbEvZi6kZy9sgfMskNu17
</commit_message>
<xml_diff>
--- a/PhD_Proposal_Final_v7.docx
+++ b/PhD_Proposal_Final_v7.docx
@@ -3452,7 +3452,7 @@
           <w:sz w:val="24"/>
           <w:szCs w:val="24"/>
         </w:rPr>
-        <w:t xml:space="preserve">Both tools will be used during the same collection days: within each scoring day, scripts will be scored by both ChatGPT and Claude, so that the two tools are exposed to the same temporal window and any model changes during that window are recorded for both. The three passes will run in separate sessions within a ten-working-day window (approximately four to five hours of submissions per day), with no more than two passes scored on the same day for the same tool. A short window limits exposure to service changes while keeping the daily workload practical. Scoring is scheduled for the school winter break (December 2028 to January 2029), when about two weeks are free of teaching; human marks are locked well before this. The pilot (Section 3.6) will be used to judge whether completing all three passes within the winter break is realistic. All three main passes must be completed within a single bounded window, so that short-term repeatability is not mixed with changes in the AI service over several months. If winter scoring is substantially interrupted, the winter submissions will be treated as preliminary and excluded from the main analysis, and all three main passes will be conducted afresh within the following Newroz break (March 2029) as an alternative window; the switch will be reported. Within each pass, the order of scripts and passages will be randomised.</w:t>
+        <w:t xml:space="preserve">Both tools will be used during the same collection days: within each scoring day, scripts will be scored by both ChatGPT and Claude, so that the two tools are exposed to the same temporal window and any model changes during that window are recorded for both. The three passes will run in separate sessions within a ten-working-day window (approximately four to five hours of submissions per day), with no more than two passes scored on the same day for the same tool. A short window limits exposure to service changes while keeping the daily workload practical. Scoring is scheduled for the school winter break (December 2028 to January 2029), when about two weeks are free of teaching; human marks are locked well before this. The pilot (Section 3.6) will be used to judge whether completing all three passes within the winter break is realistic. All three main passes must be completed within a single bounded window, so that short-term repeatability is not mixed with changes in the AI service over several months. Within each pass, the order of scripts and passages will be randomised.</w:t>
       </w:r>
     </w:p>
     <w:p>
@@ -5138,7 +5138,7 @@
                 <w:sz w:val="22"/>
                 <w:szCs w:val="22"/>
               </w:rPr>
-              <w:t xml:space="preserve">AI scoring (both tools interleaved on the same days; three passes per tool within ten working days); anchor checks; apply model-change decision rule if applicable. Newroz 2029 break (March) reserved as an alternative window for the entire scoring exercise if winter scoring is substantially interrupted</w:t>
+              <w:t xml:space="preserve">AI scoring (both tools interleaved on the same days; three passes per tool within ten working days); anchor checks; apply model-change decision rule if applicable</w:t>
             </w:r>
           </w:p>
         </w:tc>

</xml_diff>